<commit_message>
further work done on Documentation
</commit_message>
<xml_diff>
--- a/Improving JB Platform Documentation.docx
+++ b/Improving JB Platform Documentation.docx
@@ -802,7 +802,7 @@
         <w:t>2.2 Technical Stack and Development Environment</w:t>
       </w:r>
       <w:r>
-        <w:t xml:space="preserve"> (UPDATE THIS NEXT TIME)</w:t>
+        <w:t xml:space="preserve"> </w:t>
       </w:r>
     </w:p>
     <w:p>
@@ -810,7 +810,13 @@
         <w:pStyle w:val="NormalWeb"/>
       </w:pPr>
       <w:r>
-        <w:t>The platform utilizes a modern full-stack web development architecture designed for scalability, maintainability, and rapid iteration.</w:t>
+        <w:t xml:space="preserve">The platform utilizes a modern full-stack web development architecture designed </w:t>
+      </w:r>
+      <w:r>
+        <w:t>to target</w:t>
+      </w:r>
+      <w:r>
+        <w:t xml:space="preserve"> scalability, maintainability, and rapid iteration.</w:t>
       </w:r>
     </w:p>
     <w:p>
@@ -846,7 +852,13 @@
         <w:pStyle w:val="NormalWeb"/>
       </w:pPr>
       <w:r>
-        <w:t>The frontend is responsible for user interface design, page navigation, responsive layouts, and system presentation.</w:t>
+        <w:t xml:space="preserve">The frontend is </w:t>
+      </w:r>
+      <w:r>
+        <w:t xml:space="preserve">mainly </w:t>
+      </w:r>
+      <w:r>
+        <w:t>responsible for user interface design, page navigation, responsive layouts, and system presentation.</w:t>
       </w:r>
     </w:p>
     <w:p>
@@ -955,7 +967,13 @@
         <w:pStyle w:val="NormalWeb"/>
       </w:pPr>
       <w:r>
-        <w:t>The frontend and backend are deployed independently to improve reliability and simplify future updates.</w:t>
+        <w:t xml:space="preserve">The frontend and backend are deployed </w:t>
+      </w:r>
+      <w:r>
+        <w:t>each separately</w:t>
+      </w:r>
+      <w:r>
+        <w:t xml:space="preserve"> to improve reliability and simplify future updates.</w:t>
       </w:r>
     </w:p>
     <w:p>
@@ -1003,9 +1021,1680 @@
       <w:pPr>
         <w:pStyle w:val="NormalWeb"/>
       </w:pPr>
-      <w:r>
+    </w:p>
+    <w:p>
+      <w:pPr>
+        <w:pStyle w:val="NormalWeb"/>
+      </w:pPr>
+    </w:p>
+    <w:p>
+      <w:pPr>
+        <w:pStyle w:val="NormalWeb"/>
+      </w:pPr>
+      <w:r>
+        <w:lastRenderedPageBreak/>
         <w:t>2.3 Version Control and Development Practices</w:t>
       </w:r>
+    </w:p>
+    <w:p>
+      <w:pPr>
+        <w:tabs>
+          <w:tab w:val="left" w:pos="6530"/>
+        </w:tabs>
+      </w:pPr>
+      <w:r>
+        <w:t xml:space="preserve">All development is </w:t>
+      </w:r>
+      <w:r>
+        <w:t>handled</w:t>
+      </w:r>
+      <w:r>
+        <w:t xml:space="preserve"> through GitHub </w:t>
+      </w:r>
+      <w:r>
+        <w:t>with</w:t>
+      </w:r>
+      <w:r>
+        <w:t xml:space="preserve"> a version-controlled workflow. New features, bug fixes, and platform improvements are developed incrementally and reviewed before deployment.</w:t>
+      </w:r>
+    </w:p>
+    <w:p>
+      <w:pPr>
+        <w:tabs>
+          <w:tab w:val="left" w:pos="6530"/>
+        </w:tabs>
+      </w:pPr>
+      <w:r>
+        <w:t>Development follows a build-test-deploy cycle:</w:t>
+      </w:r>
+    </w:p>
+    <w:p>
+      <w:pPr>
+        <w:numPr>
+          <w:ilvl w:val="0"/>
+          <w:numId w:val="7"/>
+        </w:numPr>
+        <w:tabs>
+          <w:tab w:val="left" w:pos="6530"/>
+        </w:tabs>
+      </w:pPr>
+      <w:r>
+        <w:t>Feature planning and implementation</w:t>
+      </w:r>
+    </w:p>
+    <w:p>
+      <w:pPr>
+        <w:numPr>
+          <w:ilvl w:val="0"/>
+          <w:numId w:val="7"/>
+        </w:numPr>
+        <w:tabs>
+          <w:tab w:val="left" w:pos="6530"/>
+        </w:tabs>
+      </w:pPr>
+      <w:r>
+        <w:t>Local testing and debugging</w:t>
+      </w:r>
+    </w:p>
+    <w:p>
+      <w:pPr>
+        <w:numPr>
+          <w:ilvl w:val="0"/>
+          <w:numId w:val="7"/>
+        </w:numPr>
+        <w:tabs>
+          <w:tab w:val="left" w:pos="6530"/>
+        </w:tabs>
+      </w:pPr>
+      <w:r>
+        <w:t>Integration testing</w:t>
+      </w:r>
+    </w:p>
+    <w:p>
+      <w:pPr>
+        <w:numPr>
+          <w:ilvl w:val="0"/>
+          <w:numId w:val="7"/>
+        </w:numPr>
+        <w:tabs>
+          <w:tab w:val="left" w:pos="6530"/>
+        </w:tabs>
+      </w:pPr>
+      <w:r>
+        <w:t>Deployment to production</w:t>
+      </w:r>
+    </w:p>
+    <w:p>
+      <w:pPr>
+        <w:numPr>
+          <w:ilvl w:val="0"/>
+          <w:numId w:val="7"/>
+        </w:numPr>
+        <w:tabs>
+          <w:tab w:val="left" w:pos="6530"/>
+        </w:tabs>
+      </w:pPr>
+      <w:r>
+        <w:t>User observation and iteration</w:t>
+      </w:r>
+    </w:p>
+    <w:p>
+      <w:pPr>
+        <w:tabs>
+          <w:tab w:val="left" w:pos="6530"/>
+        </w:tabs>
+      </w:pPr>
+      <w:r>
+        <w:t xml:space="preserve">This workflow reduces </w:t>
+      </w:r>
+      <w:r>
+        <w:t xml:space="preserve">the </w:t>
+      </w:r>
+      <w:r>
+        <w:t xml:space="preserve">deployment risk while allowing improvements to be released </w:t>
+      </w:r>
+      <w:r>
+        <w:t>as soon as possible</w:t>
+      </w:r>
+      <w:r>
+        <w:t>.</w:t>
+      </w:r>
+    </w:p>
+    <w:p>
+      <w:pPr>
+        <w:tabs>
+          <w:tab w:val="left" w:pos="6530"/>
+        </w:tabs>
+      </w:pPr>
+      <w:r>
+        <w:t xml:space="preserve">Documentation is maintained throughout development to ensure architectural decisions, feature implementations, and future roadmap items remain organized and </w:t>
+      </w:r>
+      <w:r>
+        <w:t>recorded</w:t>
+      </w:r>
+      <w:r>
+        <w:t>.</w:t>
+      </w:r>
+    </w:p>
+    <w:p>
+      <w:pPr>
+        <w:tabs>
+          <w:tab w:val="left" w:pos="6530"/>
+        </w:tabs>
+      </w:pPr>
+      <w:r>
+        <w:t>The project emphasizes maintainability, scalability, and long-term growth rather than short-term feature expansion alone.</w:t>
+      </w:r>
+    </w:p>
+    <w:p>
+      <w:pPr>
+        <w:tabs>
+          <w:tab w:val="left" w:pos="6530"/>
+        </w:tabs>
+      </w:pPr>
+    </w:p>
+    <w:p>
+      <w:pPr>
+        <w:tabs>
+          <w:tab w:val="left" w:pos="6530"/>
+        </w:tabs>
+        <w:rPr>
+          <w:b/>
+          <w:bCs/>
+          <w:sz w:val="40"/>
+          <w:szCs w:val="40"/>
+        </w:rPr>
+      </w:pPr>
+      <w:r>
+        <w:rPr>
+          <w:b/>
+          <w:bCs/>
+          <w:sz w:val="40"/>
+          <w:szCs w:val="40"/>
+        </w:rPr>
+        <w:t xml:space="preserve">III. </w:t>
+      </w:r>
+      <w:r>
+        <w:rPr>
+          <w:b/>
+          <w:bCs/>
+          <w:sz w:val="40"/>
+          <w:szCs w:val="40"/>
+        </w:rPr>
+        <w:t>System Architecture</w:t>
+      </w:r>
+    </w:p>
+    <w:p>
+      <w:pPr>
+        <w:tabs>
+          <w:tab w:val="left" w:pos="6530"/>
+        </w:tabs>
+        <w:rPr>
+          <w:b/>
+          <w:bCs/>
+          <w:sz w:val="40"/>
+          <w:szCs w:val="40"/>
+        </w:rPr>
+      </w:pPr>
+    </w:p>
+    <w:p>
+      <w:pPr>
+        <w:tabs>
+          <w:tab w:val="left" w:pos="6530"/>
+        </w:tabs>
+      </w:pPr>
+      <w:r>
+        <w:t>3.1 Architecture Overview</w:t>
+      </w:r>
+    </w:p>
+    <w:p>
+      <w:pPr>
+        <w:tabs>
+          <w:tab w:val="left" w:pos="6530"/>
+        </w:tabs>
+      </w:pPr>
+      <w:r>
+        <w:t>The Improving JB platform follows a modern full-stack architecture consisting of a React frontend, Express backend, OpenAI integration layer, analytics services, newsletter infrastructure, and future community functionality.</w:t>
+      </w:r>
+    </w:p>
+    <w:p>
+      <w:pPr>
+        <w:tabs>
+          <w:tab w:val="left" w:pos="6530"/>
+        </w:tabs>
+      </w:pPr>
+      <w:r>
+        <w:t>The architecture was designed around three primary goals:</w:t>
+      </w:r>
+    </w:p>
+    <w:p>
+      <w:pPr>
+        <w:numPr>
+          <w:ilvl w:val="0"/>
+          <w:numId w:val="8"/>
+        </w:numPr>
+        <w:tabs>
+          <w:tab w:val="left" w:pos="6530"/>
+        </w:tabs>
+      </w:pPr>
+      <w:r>
+        <w:t xml:space="preserve">Scalability for future platform growth </w:t>
+      </w:r>
+    </w:p>
+    <w:p>
+      <w:pPr>
+        <w:numPr>
+          <w:ilvl w:val="0"/>
+          <w:numId w:val="8"/>
+        </w:numPr>
+        <w:tabs>
+          <w:tab w:val="left" w:pos="6530"/>
+        </w:tabs>
+      </w:pPr>
+      <w:r>
+        <w:t>Maintainability through</w:t>
+      </w:r>
+      <w:r>
+        <w:t xml:space="preserve"> a</w:t>
+      </w:r>
+      <w:r>
+        <w:t xml:space="preserve"> modular design </w:t>
+      </w:r>
+    </w:p>
+    <w:p>
+      <w:pPr>
+        <w:numPr>
+          <w:ilvl w:val="0"/>
+          <w:numId w:val="8"/>
+        </w:numPr>
+        <w:tabs>
+          <w:tab w:val="left" w:pos="6530"/>
+        </w:tabs>
+      </w:pPr>
+      <w:r>
+        <w:lastRenderedPageBreak/>
+        <w:t xml:space="preserve">Separation of concerns between </w:t>
+      </w:r>
+      <w:r>
+        <w:t xml:space="preserve">visual </w:t>
+      </w:r>
+      <w:r>
+        <w:t xml:space="preserve">presentation, business logic, and data storage </w:t>
+      </w:r>
+    </w:p>
+    <w:p>
+      <w:pPr>
+        <w:tabs>
+          <w:tab w:val="left" w:pos="6530"/>
+        </w:tabs>
+      </w:pPr>
+      <w:r>
+        <w:t xml:space="preserve">The system allows visitors to explore content, access programs, interact with the AI assistant, subscribe </w:t>
+      </w:r>
+      <w:r>
+        <w:t>for</w:t>
+      </w:r>
+      <w:r>
+        <w:t xml:space="preserve"> updates, and engage with future platform features through a centralized ecosystem.</w:t>
+      </w:r>
+    </w:p>
+    <w:p>
+      <w:pPr>
+        <w:tabs>
+          <w:tab w:val="left" w:pos="6530"/>
+        </w:tabs>
+        <w:rPr>
+          <w:b/>
+          <w:bCs/>
+        </w:rPr>
+      </w:pPr>
+      <w:r>
+        <w:rPr>
+          <w:b/>
+          <w:bCs/>
+        </w:rPr>
+        <w:t>Figure 1: Improving JB Platform Architecture</w:t>
+      </w:r>
+    </w:p>
+    <w:p>
+      <w:pPr>
+        <w:tabs>
+          <w:tab w:val="left" w:pos="6530"/>
+        </w:tabs>
+        <w:rPr>
+          <w:b/>
+          <w:bCs/>
+        </w:rPr>
+      </w:pPr>
+    </w:p>
+    <w:p>
+      <w:pPr>
+        <w:tabs>
+          <w:tab w:val="left" w:pos="6530"/>
+        </w:tabs>
+      </w:pPr>
+      <w:r>
+        <w:t>3.2 Frontend Architecture</w:t>
+      </w:r>
+    </w:p>
+    <w:p>
+      <w:pPr>
+        <w:tabs>
+          <w:tab w:val="left" w:pos="6530"/>
+        </w:tabs>
+      </w:pPr>
+      <w:r>
+        <w:t>The frontend is responsible for presenting all user-facing functionality and serves as the primary interaction layer of the platform.</w:t>
+      </w:r>
+    </w:p>
+    <w:p>
+      <w:pPr>
+        <w:tabs>
+          <w:tab w:val="left" w:pos="6530"/>
+        </w:tabs>
+      </w:pPr>
+      <w:r>
+        <w:t>Built Using:</w:t>
+      </w:r>
+    </w:p>
+    <w:p>
+      <w:pPr>
+        <w:numPr>
+          <w:ilvl w:val="0"/>
+          <w:numId w:val="9"/>
+        </w:numPr>
+        <w:tabs>
+          <w:tab w:val="left" w:pos="6530"/>
+        </w:tabs>
+      </w:pPr>
+      <w:r>
+        <w:t xml:space="preserve">React </w:t>
+      </w:r>
+    </w:p>
+    <w:p>
+      <w:pPr>
+        <w:numPr>
+          <w:ilvl w:val="0"/>
+          <w:numId w:val="9"/>
+        </w:numPr>
+        <w:tabs>
+          <w:tab w:val="left" w:pos="6530"/>
+        </w:tabs>
+      </w:pPr>
+      <w:r>
+        <w:t xml:space="preserve">Vite </w:t>
+      </w:r>
+    </w:p>
+    <w:p>
+      <w:pPr>
+        <w:numPr>
+          <w:ilvl w:val="0"/>
+          <w:numId w:val="9"/>
+        </w:numPr>
+        <w:tabs>
+          <w:tab w:val="left" w:pos="6530"/>
+        </w:tabs>
+      </w:pPr>
+      <w:r>
+        <w:t xml:space="preserve">JavaScript </w:t>
+      </w:r>
+    </w:p>
+    <w:p>
+      <w:pPr>
+        <w:numPr>
+          <w:ilvl w:val="0"/>
+          <w:numId w:val="9"/>
+        </w:numPr>
+        <w:tabs>
+          <w:tab w:val="left" w:pos="6530"/>
+        </w:tabs>
+      </w:pPr>
+      <w:r>
+        <w:t xml:space="preserve">CSS </w:t>
+      </w:r>
+    </w:p>
+    <w:p>
+      <w:pPr>
+        <w:tabs>
+          <w:tab w:val="left" w:pos="6530"/>
+        </w:tabs>
+      </w:pPr>
+      <w:r>
+        <w:t>Core Responsibilities:</w:t>
+      </w:r>
+    </w:p>
+    <w:p>
+      <w:pPr>
+        <w:numPr>
+          <w:ilvl w:val="0"/>
+          <w:numId w:val="10"/>
+        </w:numPr>
+        <w:tabs>
+          <w:tab w:val="left" w:pos="6530"/>
+        </w:tabs>
+      </w:pPr>
+      <w:r>
+        <w:t xml:space="preserve">Website navigation </w:t>
+      </w:r>
+    </w:p>
+    <w:p>
+      <w:pPr>
+        <w:numPr>
+          <w:ilvl w:val="0"/>
+          <w:numId w:val="10"/>
+        </w:numPr>
+        <w:tabs>
+          <w:tab w:val="left" w:pos="6530"/>
+        </w:tabs>
+      </w:pPr>
+      <w:r>
+        <w:t xml:space="preserve">Program discovery </w:t>
+      </w:r>
+    </w:p>
+    <w:p>
+      <w:pPr>
+        <w:numPr>
+          <w:ilvl w:val="0"/>
+          <w:numId w:val="10"/>
+        </w:numPr>
+        <w:tabs>
+          <w:tab w:val="left" w:pos="6530"/>
+        </w:tabs>
+      </w:pPr>
+      <w:r>
+        <w:t xml:space="preserve">Chatbot interface </w:t>
+      </w:r>
+    </w:p>
+    <w:p>
+      <w:pPr>
+        <w:numPr>
+          <w:ilvl w:val="0"/>
+          <w:numId w:val="10"/>
+        </w:numPr>
+        <w:tabs>
+          <w:tab w:val="left" w:pos="6530"/>
+        </w:tabs>
+      </w:pPr>
+      <w:r>
+        <w:t xml:space="preserve">Newsletter signup </w:t>
+      </w:r>
+    </w:p>
+    <w:p>
+      <w:pPr>
+        <w:numPr>
+          <w:ilvl w:val="0"/>
+          <w:numId w:val="10"/>
+        </w:numPr>
+        <w:tabs>
+          <w:tab w:val="left" w:pos="6530"/>
+        </w:tabs>
+      </w:pPr>
+      <w:r>
+        <w:t xml:space="preserve">Responsive layouts </w:t>
+      </w:r>
+    </w:p>
+    <w:p>
+      <w:pPr>
+        <w:numPr>
+          <w:ilvl w:val="0"/>
+          <w:numId w:val="10"/>
+        </w:numPr>
+        <w:tabs>
+          <w:tab w:val="left" w:pos="6530"/>
+        </w:tabs>
+      </w:pPr>
+      <w:r>
+        <w:t xml:space="preserve">User interaction tracking </w:t>
+      </w:r>
+    </w:p>
+    <w:p>
+      <w:pPr>
+        <w:numPr>
+          <w:ilvl w:val="0"/>
+          <w:numId w:val="10"/>
+        </w:numPr>
+        <w:tabs>
+          <w:tab w:val="left" w:pos="6530"/>
+        </w:tabs>
+      </w:pPr>
+      <w:r>
+        <w:t>Mobile Accessibil</w:t>
+      </w:r>
+      <w:r>
+        <w:t>ity</w:t>
+      </w:r>
+    </w:p>
+    <w:p>
+      <w:pPr>
+        <w:tabs>
+          <w:tab w:val="left" w:pos="6530"/>
+        </w:tabs>
+      </w:pPr>
+      <w:r>
+        <w:t>The frontend follows a component-based architecture where reusable components are separated from page-level functionality. This approach improves maintainability while reducing code duplication throughout the platform.</w:t>
+      </w:r>
+    </w:p>
+    <w:p>
+      <w:pPr>
+        <w:tabs>
+          <w:tab w:val="left" w:pos="6530"/>
+        </w:tabs>
+        <w:rPr>
+          <w:b/>
+          <w:bCs/>
+        </w:rPr>
+      </w:pPr>
+      <w:r>
+        <w:rPr>
+          <w:b/>
+          <w:bCs/>
+        </w:rPr>
+        <w:t>Major Pages</w:t>
+      </w:r>
+    </w:p>
+    <w:p>
+      <w:pPr>
+        <w:numPr>
+          <w:ilvl w:val="0"/>
+          <w:numId w:val="11"/>
+        </w:numPr>
+        <w:tabs>
+          <w:tab w:val="left" w:pos="6530"/>
+        </w:tabs>
+      </w:pPr>
+      <w:r>
+        <w:lastRenderedPageBreak/>
+        <w:t xml:space="preserve">Home </w:t>
+      </w:r>
+    </w:p>
+    <w:p>
+      <w:pPr>
+        <w:numPr>
+          <w:ilvl w:val="0"/>
+          <w:numId w:val="11"/>
+        </w:numPr>
+        <w:tabs>
+          <w:tab w:val="left" w:pos="6530"/>
+        </w:tabs>
+      </w:pPr>
+      <w:r>
+        <w:t xml:space="preserve">Systems </w:t>
+      </w:r>
+    </w:p>
+    <w:p>
+      <w:pPr>
+        <w:numPr>
+          <w:ilvl w:val="0"/>
+          <w:numId w:val="11"/>
+        </w:numPr>
+        <w:tabs>
+          <w:tab w:val="left" w:pos="6530"/>
+        </w:tabs>
+      </w:pPr>
+      <w:r>
+        <w:t xml:space="preserve">About </w:t>
+      </w:r>
+    </w:p>
+    <w:p>
+      <w:pPr>
+        <w:numPr>
+          <w:ilvl w:val="0"/>
+          <w:numId w:val="11"/>
+        </w:numPr>
+        <w:tabs>
+          <w:tab w:val="left" w:pos="6530"/>
+        </w:tabs>
+      </w:pPr>
+      <w:r>
+        <w:t xml:space="preserve">Community (Future Expansion) </w:t>
+      </w:r>
+    </w:p>
+    <w:p>
+      <w:pPr>
+        <w:numPr>
+          <w:ilvl w:val="0"/>
+          <w:numId w:val="11"/>
+        </w:numPr>
+        <w:tabs>
+          <w:tab w:val="left" w:pos="6530"/>
+        </w:tabs>
+      </w:pPr>
+      <w:r>
+        <w:t>Individual Program Pages</w:t>
+      </w:r>
+    </w:p>
+    <w:p>
+      <w:pPr>
+        <w:tabs>
+          <w:tab w:val="left" w:pos="6530"/>
+        </w:tabs>
+      </w:pPr>
+    </w:p>
+    <w:p>
+      <w:pPr>
+        <w:tabs>
+          <w:tab w:val="left" w:pos="6530"/>
+        </w:tabs>
+      </w:pPr>
+      <w:r>
+        <w:t>3.3 Backend Architecture</w:t>
+      </w:r>
+    </w:p>
+    <w:p>
+      <w:pPr>
+        <w:tabs>
+          <w:tab w:val="left" w:pos="6530"/>
+        </w:tabs>
+      </w:pPr>
+      <w:r>
+        <w:t>The backend functions as the central processing layer for the platform.</w:t>
+      </w:r>
+    </w:p>
+    <w:p>
+      <w:pPr>
+        <w:tabs>
+          <w:tab w:val="left" w:pos="6530"/>
+        </w:tabs>
+      </w:pPr>
+      <w:r>
+        <w:t>Built Using:</w:t>
+      </w:r>
+    </w:p>
+    <w:p>
+      <w:pPr>
+        <w:numPr>
+          <w:ilvl w:val="0"/>
+          <w:numId w:val="12"/>
+        </w:numPr>
+        <w:tabs>
+          <w:tab w:val="left" w:pos="6530"/>
+        </w:tabs>
+      </w:pPr>
+      <w:r>
+        <w:t xml:space="preserve">Node.js </w:t>
+      </w:r>
+    </w:p>
+    <w:p>
+      <w:pPr>
+        <w:numPr>
+          <w:ilvl w:val="0"/>
+          <w:numId w:val="12"/>
+        </w:numPr>
+        <w:tabs>
+          <w:tab w:val="left" w:pos="6530"/>
+        </w:tabs>
+      </w:pPr>
+      <w:r>
+        <w:t xml:space="preserve">Express.js </w:t>
+      </w:r>
+    </w:p>
+    <w:p>
+      <w:pPr>
+        <w:tabs>
+          <w:tab w:val="left" w:pos="6530"/>
+        </w:tabs>
+      </w:pPr>
+      <w:r>
+        <w:t>Core Responsibilities:</w:t>
+      </w:r>
+    </w:p>
+    <w:p>
+      <w:pPr>
+        <w:numPr>
+          <w:ilvl w:val="0"/>
+          <w:numId w:val="13"/>
+        </w:numPr>
+        <w:tabs>
+          <w:tab w:val="left" w:pos="6530"/>
+        </w:tabs>
+      </w:pPr>
+      <w:r>
+        <w:t xml:space="preserve">Chatbot request handling </w:t>
+      </w:r>
+    </w:p>
+    <w:p>
+      <w:pPr>
+        <w:numPr>
+          <w:ilvl w:val="0"/>
+          <w:numId w:val="13"/>
+        </w:numPr>
+        <w:tabs>
+          <w:tab w:val="left" w:pos="6530"/>
+        </w:tabs>
+      </w:pPr>
+      <w:r>
+        <w:t xml:space="preserve">Analytics event collection </w:t>
+      </w:r>
+    </w:p>
+    <w:p>
+      <w:pPr>
+        <w:numPr>
+          <w:ilvl w:val="0"/>
+          <w:numId w:val="13"/>
+        </w:numPr>
+        <w:tabs>
+          <w:tab w:val="left" w:pos="6530"/>
+        </w:tabs>
+      </w:pPr>
+      <w:r>
+        <w:t xml:space="preserve">Newsletter processing </w:t>
+      </w:r>
+    </w:p>
+    <w:p>
+      <w:pPr>
+        <w:numPr>
+          <w:ilvl w:val="0"/>
+          <w:numId w:val="13"/>
+        </w:numPr>
+        <w:tabs>
+          <w:tab w:val="left" w:pos="6530"/>
+        </w:tabs>
+      </w:pPr>
+      <w:r>
+        <w:t xml:space="preserve">API management </w:t>
+      </w:r>
+    </w:p>
+    <w:p>
+      <w:pPr>
+        <w:numPr>
+          <w:ilvl w:val="0"/>
+          <w:numId w:val="13"/>
+        </w:numPr>
+        <w:tabs>
+          <w:tab w:val="left" w:pos="6530"/>
+        </w:tabs>
+      </w:pPr>
+      <w:r>
+        <w:t xml:space="preserve">Future community functionality </w:t>
+      </w:r>
+    </w:p>
+    <w:p>
+      <w:pPr>
+        <w:tabs>
+          <w:tab w:val="left" w:pos="6530"/>
+        </w:tabs>
+      </w:pPr>
+      <w:r>
+        <w:t xml:space="preserve">The backend uses a modular routing architecture that separates concerns </w:t>
+      </w:r>
+      <w:r>
+        <w:t>amongst</w:t>
+      </w:r>
+      <w:r>
+        <w:t xml:space="preserve"> endpoints, controllers, middleware, and external integrations. Chat requests are processed through </w:t>
+      </w:r>
+      <w:r>
+        <w:t xml:space="preserve">their own </w:t>
+      </w:r>
+      <w:r>
+        <w:t xml:space="preserve">dedicated routes and controllers before being sent to the AI layer. </w:t>
+      </w:r>
+    </w:p>
+    <w:p>
+      <w:pPr>
+        <w:tabs>
+          <w:tab w:val="left" w:pos="6530"/>
+        </w:tabs>
+      </w:pPr>
+      <w:r>
+        <w:t>A dedicated health endpoint is also implemented for monitoring backend availability.</w:t>
+      </w:r>
+    </w:p>
+    <w:p>
+      <w:pPr>
+        <w:tabs>
+          <w:tab w:val="left" w:pos="6530"/>
+        </w:tabs>
+      </w:pPr>
+    </w:p>
+    <w:p>
+      <w:pPr>
+        <w:tabs>
+          <w:tab w:val="left" w:pos="6530"/>
+        </w:tabs>
+      </w:pPr>
+      <w:r>
+        <w:t>3.4 Artificial Intelligence System</w:t>
+      </w:r>
+    </w:p>
+    <w:p>
+      <w:pPr>
+        <w:tabs>
+          <w:tab w:val="left" w:pos="6530"/>
+        </w:tabs>
+      </w:pPr>
+      <w:r>
+        <w:t>One of the platform's primary features is the AI assistant "Bands."</w:t>
+      </w:r>
+    </w:p>
+    <w:p>
+      <w:pPr>
+        <w:tabs>
+          <w:tab w:val="left" w:pos="6530"/>
+        </w:tabs>
+      </w:pPr>
+      <w:r>
+        <w:t>Unlike traditional AI assistants, Bands was intentionally designed to function as a website guide rather than a personal coach.</w:t>
+      </w:r>
+    </w:p>
+    <w:p>
+      <w:pPr>
+        <w:tabs>
+          <w:tab w:val="left" w:pos="6530"/>
+        </w:tabs>
+        <w:rPr>
+          <w:b/>
+          <w:bCs/>
+        </w:rPr>
+      </w:pPr>
+      <w:r>
+        <w:rPr>
+          <w:b/>
+          <w:bCs/>
+        </w:rPr>
+        <w:lastRenderedPageBreak/>
+        <w:t>Design Goals</w:t>
+      </w:r>
+    </w:p>
+    <w:p>
+      <w:pPr>
+        <w:numPr>
+          <w:ilvl w:val="0"/>
+          <w:numId w:val="14"/>
+        </w:numPr>
+        <w:tabs>
+          <w:tab w:val="left" w:pos="6530"/>
+        </w:tabs>
+      </w:pPr>
+      <w:r>
+        <w:t xml:space="preserve">Explain website features </w:t>
+      </w:r>
+    </w:p>
+    <w:p>
+      <w:pPr>
+        <w:numPr>
+          <w:ilvl w:val="0"/>
+          <w:numId w:val="14"/>
+        </w:numPr>
+        <w:tabs>
+          <w:tab w:val="left" w:pos="6530"/>
+        </w:tabs>
+      </w:pPr>
+      <w:r>
+        <w:t xml:space="preserve">Help users navigate the platform </w:t>
+      </w:r>
+    </w:p>
+    <w:p>
+      <w:pPr>
+        <w:numPr>
+          <w:ilvl w:val="0"/>
+          <w:numId w:val="14"/>
+        </w:numPr>
+        <w:tabs>
+          <w:tab w:val="left" w:pos="6530"/>
+        </w:tabs>
+      </w:pPr>
+      <w:r>
+        <w:t xml:space="preserve">Describe available systems </w:t>
+      </w:r>
+    </w:p>
+    <w:p>
+      <w:pPr>
+        <w:numPr>
+          <w:ilvl w:val="0"/>
+          <w:numId w:val="14"/>
+        </w:numPr>
+        <w:tabs>
+          <w:tab w:val="left" w:pos="6530"/>
+        </w:tabs>
+      </w:pPr>
+      <w:r>
+        <w:t xml:space="preserve">Explain YouTube content </w:t>
+      </w:r>
+    </w:p>
+    <w:p>
+      <w:pPr>
+        <w:numPr>
+          <w:ilvl w:val="0"/>
+          <w:numId w:val="14"/>
+        </w:numPr>
+        <w:tabs>
+          <w:tab w:val="left" w:pos="6530"/>
+        </w:tabs>
+      </w:pPr>
+      <w:r>
+        <w:t>Introducing</w:t>
+      </w:r>
+      <w:r>
+        <w:t xml:space="preserve"> the Improving JB ecosystem </w:t>
+      </w:r>
+    </w:p>
+    <w:p>
+      <w:pPr>
+        <w:numPr>
+          <w:ilvl w:val="0"/>
+          <w:numId w:val="14"/>
+        </w:numPr>
+        <w:tabs>
+          <w:tab w:val="left" w:pos="6530"/>
+        </w:tabs>
+      </w:pPr>
+      <w:r>
+        <w:t>Give information about JB himself</w:t>
+      </w:r>
+    </w:p>
+    <w:p>
+      <w:pPr>
+        <w:tabs>
+          <w:tab w:val="left" w:pos="6530"/>
+        </w:tabs>
+      </w:pPr>
+      <w:r>
+        <w:t>The AI system uses contextual prompting to determine which knowledge source should be used when generating responses. Different prompt sets exist for:</w:t>
+      </w:r>
+    </w:p>
+    <w:p>
+      <w:pPr>
+        <w:numPr>
+          <w:ilvl w:val="0"/>
+          <w:numId w:val="15"/>
+        </w:numPr>
+        <w:tabs>
+          <w:tab w:val="left" w:pos="6530"/>
+        </w:tabs>
+      </w:pPr>
+      <w:r>
+        <w:t xml:space="preserve">Website Information </w:t>
+      </w:r>
+    </w:p>
+    <w:p>
+      <w:pPr>
+        <w:numPr>
+          <w:ilvl w:val="0"/>
+          <w:numId w:val="15"/>
+        </w:numPr>
+        <w:tabs>
+          <w:tab w:val="left" w:pos="6530"/>
+        </w:tabs>
+      </w:pPr>
+      <w:r>
+        <w:t xml:space="preserve">Systems &amp; Programs </w:t>
+      </w:r>
+    </w:p>
+    <w:p>
+      <w:pPr>
+        <w:numPr>
+          <w:ilvl w:val="0"/>
+          <w:numId w:val="15"/>
+        </w:numPr>
+        <w:tabs>
+          <w:tab w:val="left" w:pos="6530"/>
+        </w:tabs>
+      </w:pPr>
+      <w:r>
+        <w:t xml:space="preserve">YouTube Content </w:t>
+      </w:r>
+    </w:p>
+    <w:p>
+      <w:pPr>
+        <w:numPr>
+          <w:ilvl w:val="0"/>
+          <w:numId w:val="15"/>
+        </w:numPr>
+        <w:tabs>
+          <w:tab w:val="left" w:pos="6530"/>
+        </w:tabs>
+      </w:pPr>
+      <w:r>
+        <w:t xml:space="preserve">About JB </w:t>
+      </w:r>
+    </w:p>
+    <w:p>
+      <w:pPr>
+        <w:numPr>
+          <w:ilvl w:val="0"/>
+          <w:numId w:val="15"/>
+        </w:numPr>
+        <w:tabs>
+          <w:tab w:val="left" w:pos="6530"/>
+        </w:tabs>
+      </w:pPr>
+      <w:r>
+        <w:t xml:space="preserve">Community Features </w:t>
+      </w:r>
+    </w:p>
+    <w:p>
+      <w:pPr>
+        <w:tabs>
+          <w:tab w:val="left" w:pos="6530"/>
+        </w:tabs>
+      </w:pPr>
+      <w:r>
+        <w:t xml:space="preserve">This structure improves response accuracy while preventing the assistant from providing information outside its intended scope. </w:t>
+      </w:r>
+    </w:p>
+    <w:p>
+      <w:pPr>
+        <w:tabs>
+          <w:tab w:val="left" w:pos="6530"/>
+        </w:tabs>
+        <w:rPr>
+          <w:b/>
+          <w:bCs/>
+        </w:rPr>
+      </w:pPr>
+      <w:r>
+        <w:rPr>
+          <w:b/>
+          <w:bCs/>
+        </w:rPr>
+        <w:t>Chat Flow</w:t>
+      </w:r>
+    </w:p>
+    <w:p>
+      <w:pPr>
+        <w:tabs>
+          <w:tab w:val="left" w:pos="6530"/>
+        </w:tabs>
+      </w:pPr>
+      <w:r>
+        <w:t>User Message</w:t>
+      </w:r>
+    </w:p>
+    <w:p>
+      <w:pPr>
+        <w:tabs>
+          <w:tab w:val="left" w:pos="6530"/>
+        </w:tabs>
+      </w:pPr>
+      <w:r>
+        <w:t>↓</w:t>
+      </w:r>
+    </w:p>
+    <w:p>
+      <w:pPr>
+        <w:tabs>
+          <w:tab w:val="left" w:pos="6530"/>
+        </w:tabs>
+      </w:pPr>
+      <w:r>
+        <w:t>Context Selection</w:t>
+      </w:r>
+    </w:p>
+    <w:p>
+      <w:pPr>
+        <w:tabs>
+          <w:tab w:val="left" w:pos="6530"/>
+        </w:tabs>
+      </w:pPr>
+      <w:r>
+        <w:t>↓</w:t>
+      </w:r>
+    </w:p>
+    <w:p>
+      <w:pPr>
+        <w:tabs>
+          <w:tab w:val="left" w:pos="6530"/>
+        </w:tabs>
+      </w:pPr>
+      <w:r>
+        <w:t>Knowledge Base Injection</w:t>
+      </w:r>
+    </w:p>
+    <w:p>
+      <w:pPr>
+        <w:tabs>
+          <w:tab w:val="left" w:pos="6530"/>
+        </w:tabs>
+      </w:pPr>
+      <w:r>
+        <w:t>↓</w:t>
+      </w:r>
+    </w:p>
+    <w:p>
+      <w:pPr>
+        <w:tabs>
+          <w:tab w:val="left" w:pos="6530"/>
+        </w:tabs>
+      </w:pPr>
+      <w:r>
+        <w:t>OpenAI API</w:t>
+      </w:r>
+    </w:p>
+    <w:p>
+      <w:pPr>
+        <w:tabs>
+          <w:tab w:val="left" w:pos="6530"/>
+        </w:tabs>
+      </w:pPr>
+      <w:r>
+        <w:t>↓</w:t>
+      </w:r>
+    </w:p>
+    <w:p>
+      <w:pPr>
+        <w:tabs>
+          <w:tab w:val="left" w:pos="6530"/>
+        </w:tabs>
+      </w:pPr>
+      <w:r>
+        <w:t>Response Generation</w:t>
+      </w:r>
+    </w:p>
+    <w:p>
+      <w:pPr>
+        <w:tabs>
+          <w:tab w:val="left" w:pos="6530"/>
+        </w:tabs>
+      </w:pPr>
+      <w:r>
+        <w:lastRenderedPageBreak/>
+        <w:t>↓</w:t>
+      </w:r>
+    </w:p>
+    <w:p>
+      <w:pPr>
+        <w:tabs>
+          <w:tab w:val="left" w:pos="6530"/>
+        </w:tabs>
+      </w:pPr>
+      <w:r>
+        <w:t>Frontend Display</w:t>
+      </w:r>
+    </w:p>
+    <w:p>
+      <w:pPr>
+        <w:tabs>
+          <w:tab w:val="left" w:pos="6530"/>
+        </w:tabs>
+      </w:pPr>
+    </w:p>
+    <w:p>
+      <w:pPr>
+        <w:tabs>
+          <w:tab w:val="left" w:pos="6530"/>
+        </w:tabs>
+      </w:pPr>
+      <w:r>
+        <w:t>3.5 Analytics Architecture</w:t>
+      </w:r>
+    </w:p>
+    <w:p>
+      <w:pPr>
+        <w:tabs>
+          <w:tab w:val="left" w:pos="6530"/>
+        </w:tabs>
+      </w:pPr>
+      <w:r>
+        <w:t>The analytics system was implemented to better understand user behavior and measure the effectiveness of the platform.</w:t>
+      </w:r>
+    </w:p>
+    <w:p>
+      <w:pPr>
+        <w:tabs>
+          <w:tab w:val="left" w:pos="6530"/>
+        </w:tabs>
+      </w:pPr>
+      <w:r>
+        <w:t>Primary Events Tracked:</w:t>
+      </w:r>
+    </w:p>
+    <w:p>
+      <w:pPr>
+        <w:numPr>
+          <w:ilvl w:val="0"/>
+          <w:numId w:val="16"/>
+        </w:numPr>
+        <w:tabs>
+          <w:tab w:val="left" w:pos="6530"/>
+        </w:tabs>
+      </w:pPr>
+      <w:r>
+        <w:t xml:space="preserve">Page Views </w:t>
+      </w:r>
+    </w:p>
+    <w:p>
+      <w:pPr>
+        <w:numPr>
+          <w:ilvl w:val="0"/>
+          <w:numId w:val="16"/>
+        </w:numPr>
+        <w:tabs>
+          <w:tab w:val="left" w:pos="6530"/>
+        </w:tabs>
+      </w:pPr>
+      <w:r>
+        <w:t xml:space="preserve">System Views </w:t>
+      </w:r>
+    </w:p>
+    <w:p>
+      <w:pPr>
+        <w:numPr>
+          <w:ilvl w:val="0"/>
+          <w:numId w:val="16"/>
+        </w:numPr>
+        <w:tabs>
+          <w:tab w:val="left" w:pos="6530"/>
+        </w:tabs>
+      </w:pPr>
+      <w:r>
+        <w:t xml:space="preserve">User Navigation Patterns </w:t>
+      </w:r>
+    </w:p>
+    <w:p>
+      <w:pPr>
+        <w:numPr>
+          <w:ilvl w:val="0"/>
+          <w:numId w:val="16"/>
+        </w:numPr>
+        <w:tabs>
+          <w:tab w:val="left" w:pos="6530"/>
+        </w:tabs>
+      </w:pPr>
+      <w:r>
+        <w:t xml:space="preserve">Future Conversion Events </w:t>
+      </w:r>
+    </w:p>
+    <w:p>
+      <w:pPr>
+        <w:tabs>
+          <w:tab w:val="left" w:pos="6530"/>
+        </w:tabs>
+      </w:pPr>
+      <w:r>
+        <w:t>The analytics infrastructure provides insight into how visitors move throughout the platform and which content generates the highest engagement.</w:t>
+      </w:r>
+      <w:r>
+        <w:t xml:space="preserve"> Used to influence future videos and versions of the website.</w:t>
+      </w:r>
+    </w:p>
+    <w:p>
+      <w:pPr>
+        <w:tabs>
+          <w:tab w:val="left" w:pos="6530"/>
+        </w:tabs>
+      </w:pPr>
+    </w:p>
+    <w:p>
+      <w:pPr>
+        <w:tabs>
+          <w:tab w:val="left" w:pos="6530"/>
+        </w:tabs>
+      </w:pPr>
+      <w:r>
+        <w:t>3.6 Newsletter Infrastructure</w:t>
+      </w:r>
+    </w:p>
+    <w:p>
+      <w:pPr>
+        <w:tabs>
+          <w:tab w:val="left" w:pos="6530"/>
+        </w:tabs>
+      </w:pPr>
+      <w:r>
+        <w:t>The newsletter system serves as the primary audience ownership mechanism within the platform.</w:t>
+      </w:r>
+    </w:p>
+    <w:p>
+      <w:pPr>
+        <w:tabs>
+          <w:tab w:val="left" w:pos="6530"/>
+        </w:tabs>
+      </w:pPr>
+      <w:r>
+        <w:t>Its responsibilities include:</w:t>
+      </w:r>
+    </w:p>
+    <w:p>
+      <w:pPr>
+        <w:numPr>
+          <w:ilvl w:val="0"/>
+          <w:numId w:val="17"/>
+        </w:numPr>
+        <w:tabs>
+          <w:tab w:val="left" w:pos="6530"/>
+        </w:tabs>
+      </w:pPr>
+      <w:r>
+        <w:t xml:space="preserve">Email collection </w:t>
+      </w:r>
+    </w:p>
+    <w:p>
+      <w:pPr>
+        <w:numPr>
+          <w:ilvl w:val="0"/>
+          <w:numId w:val="17"/>
+        </w:numPr>
+        <w:tabs>
+          <w:tab w:val="left" w:pos="6530"/>
+        </w:tabs>
+      </w:pPr>
+      <w:r>
+        <w:t xml:space="preserve">Subscriber management </w:t>
+      </w:r>
+    </w:p>
+    <w:p>
+      <w:pPr>
+        <w:numPr>
+          <w:ilvl w:val="0"/>
+          <w:numId w:val="17"/>
+        </w:numPr>
+        <w:tabs>
+          <w:tab w:val="left" w:pos="6530"/>
+        </w:tabs>
+      </w:pPr>
+      <w:r>
+        <w:t xml:space="preserve">Future campaign distribution </w:t>
+      </w:r>
+    </w:p>
+    <w:p>
+      <w:pPr>
+        <w:numPr>
+          <w:ilvl w:val="0"/>
+          <w:numId w:val="17"/>
+        </w:numPr>
+        <w:tabs>
+          <w:tab w:val="left" w:pos="6530"/>
+        </w:tabs>
+      </w:pPr>
+      <w:r>
+        <w:t xml:space="preserve">Program delivery </w:t>
+      </w:r>
+    </w:p>
+    <w:p>
+      <w:pPr>
+        <w:tabs>
+          <w:tab w:val="left" w:pos="6530"/>
+        </w:tabs>
+      </w:pPr>
+      <w:r>
+        <w:t>The system creates a direct communication channel between the platform and users without relying entirely on social media algorithms.</w:t>
+      </w:r>
+    </w:p>
+    <w:p>
+      <w:pPr>
+        <w:tabs>
+          <w:tab w:val="left" w:pos="6530"/>
+        </w:tabs>
+      </w:pPr>
+    </w:p>
+    <w:p>
+      <w:pPr>
+        <w:tabs>
+          <w:tab w:val="left" w:pos="6530"/>
+        </w:tabs>
+      </w:pPr>
+      <w:r>
+        <w:t>3.7 Security &amp; Reliability</w:t>
+      </w:r>
+    </w:p>
+    <w:p>
+      <w:pPr>
+        <w:tabs>
+          <w:tab w:val="left" w:pos="6530"/>
+        </w:tabs>
+      </w:pPr>
+      <w:r>
+        <w:lastRenderedPageBreak/>
+        <w:t>Several measures were implemented to improve stability and reliability.</w:t>
+      </w:r>
+    </w:p>
+    <w:p>
+      <w:pPr>
+        <w:tabs>
+          <w:tab w:val="left" w:pos="6530"/>
+        </w:tabs>
+        <w:rPr>
+          <w:b/>
+          <w:bCs/>
+        </w:rPr>
+      </w:pPr>
+      <w:r>
+        <w:rPr>
+          <w:b/>
+          <w:bCs/>
+        </w:rPr>
+        <w:t>Request Validation</w:t>
+      </w:r>
+    </w:p>
+    <w:p>
+      <w:pPr>
+        <w:tabs>
+          <w:tab w:val="left" w:pos="6530"/>
+        </w:tabs>
+      </w:pPr>
+      <w:r>
+        <w:t xml:space="preserve">User inputs are validated before being processed by backend services. </w:t>
+      </w:r>
+    </w:p>
+    <w:p>
+      <w:pPr>
+        <w:tabs>
+          <w:tab w:val="left" w:pos="6530"/>
+        </w:tabs>
+        <w:rPr>
+          <w:b/>
+          <w:bCs/>
+        </w:rPr>
+      </w:pPr>
+      <w:r>
+        <w:rPr>
+          <w:b/>
+          <w:bCs/>
+        </w:rPr>
+        <w:t>Rate Limiting</w:t>
+      </w:r>
+    </w:p>
+    <w:p>
+      <w:pPr>
+        <w:tabs>
+          <w:tab w:val="left" w:pos="6530"/>
+        </w:tabs>
+      </w:pPr>
+      <w:r>
+        <w:t xml:space="preserve">The chatbot API includes request rate limiting to reduce abuse and improve system stability. </w:t>
+      </w:r>
+    </w:p>
+    <w:p>
+      <w:pPr>
+        <w:tabs>
+          <w:tab w:val="left" w:pos="6530"/>
+        </w:tabs>
+        <w:rPr>
+          <w:b/>
+          <w:bCs/>
+        </w:rPr>
+      </w:pPr>
+      <w:r>
+        <w:rPr>
+          <w:b/>
+          <w:bCs/>
+        </w:rPr>
+        <w:t>Environment Configuration</w:t>
+      </w:r>
+    </w:p>
+    <w:p>
+      <w:pPr>
+        <w:tabs>
+          <w:tab w:val="left" w:pos="6530"/>
+        </w:tabs>
+      </w:pPr>
+      <w:r>
+        <w:t>Sensitive credentials and API keys are managed through environment variables rather than hardcoded values.</w:t>
+      </w:r>
+    </w:p>
+    <w:p>
+      <w:pPr>
+        <w:tabs>
+          <w:tab w:val="left" w:pos="6530"/>
+        </w:tabs>
+      </w:pPr>
+    </w:p>
+    <w:p>
+      <w:pPr>
+        <w:tabs>
+          <w:tab w:val="left" w:pos="6530"/>
+        </w:tabs>
+      </w:pPr>
+      <w:r>
+        <w:t>3.8 Future Architecture Expansion</w:t>
+      </w:r>
+    </w:p>
+    <w:p>
+      <w:pPr>
+        <w:tabs>
+          <w:tab w:val="left" w:pos="6530"/>
+        </w:tabs>
+      </w:pPr>
+      <w:r>
+        <w:t>The architecture was intentionally designed to support future growth.</w:t>
+      </w:r>
+    </w:p>
+    <w:p>
+      <w:pPr>
+        <w:tabs>
+          <w:tab w:val="left" w:pos="6530"/>
+        </w:tabs>
+      </w:pPr>
+      <w:r>
+        <w:t>Planned additions include:</w:t>
+      </w:r>
+    </w:p>
+    <w:p>
+      <w:pPr>
+        <w:numPr>
+          <w:ilvl w:val="0"/>
+          <w:numId w:val="18"/>
+        </w:numPr>
+        <w:tabs>
+          <w:tab w:val="left" w:pos="6530"/>
+        </w:tabs>
+      </w:pPr>
+      <w:r>
+        <w:t xml:space="preserve">Community functionality </w:t>
+      </w:r>
+    </w:p>
+    <w:p>
+      <w:pPr>
+        <w:numPr>
+          <w:ilvl w:val="0"/>
+          <w:numId w:val="18"/>
+        </w:numPr>
+        <w:tabs>
+          <w:tab w:val="left" w:pos="6530"/>
+        </w:tabs>
+      </w:pPr>
+      <w:r>
+        <w:t xml:space="preserve">User accounts </w:t>
+      </w:r>
+    </w:p>
+    <w:p>
+      <w:pPr>
+        <w:numPr>
+          <w:ilvl w:val="0"/>
+          <w:numId w:val="18"/>
+        </w:numPr>
+        <w:tabs>
+          <w:tab w:val="left" w:pos="6530"/>
+        </w:tabs>
+      </w:pPr>
+      <w:r>
+        <w:t xml:space="preserve">Expanded analytics dashboards </w:t>
+      </w:r>
+    </w:p>
+    <w:p>
+      <w:pPr>
+        <w:numPr>
+          <w:ilvl w:val="0"/>
+          <w:numId w:val="18"/>
+        </w:numPr>
+        <w:tabs>
+          <w:tab w:val="left" w:pos="6530"/>
+        </w:tabs>
+      </w:pPr>
+      <w:r>
+        <w:t xml:space="preserve">Additional downloadable systems </w:t>
+      </w:r>
+    </w:p>
+    <w:p>
+      <w:pPr>
+        <w:numPr>
+          <w:ilvl w:val="0"/>
+          <w:numId w:val="18"/>
+        </w:numPr>
+        <w:tabs>
+          <w:tab w:val="left" w:pos="6530"/>
+        </w:tabs>
+      </w:pPr>
+      <w:r>
+        <w:t xml:space="preserve">Enhanced AI capabilities </w:t>
+      </w:r>
+    </w:p>
+    <w:p>
+      <w:pPr>
+        <w:tabs>
+          <w:tab w:val="left" w:pos="6530"/>
+        </w:tabs>
+      </w:pPr>
+      <w:r>
+        <w:t>This modular architecture allows future services to be integrated without requiring significant changes to the existing platform.</w:t>
+      </w:r>
+    </w:p>
+    <w:p>
+      <w:pPr>
+        <w:tabs>
+          <w:tab w:val="left" w:pos="6530"/>
+        </w:tabs>
+      </w:pPr>
+    </w:p>
+    <w:p>
+      <w:pPr>
+        <w:tabs>
+          <w:tab w:val="left" w:pos="6530"/>
+        </w:tabs>
+      </w:pPr>
+    </w:p>
+    <w:p>
+      <w:pPr>
+        <w:tabs>
+          <w:tab w:val="left" w:pos="6530"/>
+        </w:tabs>
+      </w:pPr>
+    </w:p>
+    <w:p>
+      <w:pPr>
+        <w:tabs>
+          <w:tab w:val="left" w:pos="6530"/>
+        </w:tabs>
+      </w:pPr>
+    </w:p>
+    <w:p>
+      <w:pPr>
+        <w:tabs>
+          <w:tab w:val="left" w:pos="6530"/>
+        </w:tabs>
+      </w:pPr>
+    </w:p>
+    <w:p>
+      <w:pPr>
+        <w:tabs>
+          <w:tab w:val="left" w:pos="6530"/>
+        </w:tabs>
+      </w:pPr>
+    </w:p>
+    <w:p>
+      <w:pPr>
+        <w:tabs>
+          <w:tab w:val="left" w:pos="6530"/>
+        </w:tabs>
+      </w:pPr>
+    </w:p>
+    <w:p>
+      <w:pPr>
+        <w:tabs>
+          <w:tab w:val="left" w:pos="6530"/>
+        </w:tabs>
+      </w:pPr>
     </w:p>
     <w:p>
       <w:pPr>
@@ -1170,6 +2859,715 @@
 <file path=word/numbering.xml><?xml version="1.0" encoding="utf-8"?>
 <w:numbering xmlns:wpc="http://schemas.microsoft.com/office/word/2010/wordprocessingCanvas" xmlns:cx="http://schemas.microsoft.com/office/drawing/2014/chartex" xmlns:cx1="http://schemas.microsoft.com/office/drawing/2015/9/8/chartex" xmlns:cx2="http://schemas.microsoft.com/office/drawing/2015/10/21/chartex" xmlns:cx3="http://schemas.microsoft.com/office/drawing/2016/5/9/chartex" xmlns:cx4="http://schemas.microsoft.com/office/drawing/2016/5/10/chartex" xmlns:cx5="http://schemas.microsoft.com/office/drawing/2016/5/11/chartex" xmlns:cx6="http://schemas.microsoft.com/office/drawing/2016/5/12/chartex" xmlns:cx7="http://schemas.microsoft.com/office/drawing/2016/5/13/chartex" xmlns:cx8="http://schemas.microsoft.com/office/drawing/2016/5/14/chartex" xmlns:mc="http://schemas.openxmlformats.org/markup-compatibility/2006" xmlns:aink="http://schemas.microsoft.com/office/drawing/2016/ink" xmlns:am3d="http://schemas.microsoft.com/office/drawing/2017/model3d" xmlns:o="urn:schemas-microsoft-com:office:office" xmlns:oel="http://schemas.microsoft.com/office/2019/extlst" xmlns:r="http://schemas.openxmlformats.org/officeDocument/2006/relationships" xmlns:m="http://schemas.openxmlformats.org/officeDocument/2006/math" xmlns:v="urn:schemas-microsoft-com:vml" xmlns:wp14="http://schemas.microsoft.com/office/word/2010/wordprocessingDrawing" xmlns:wp="http://schemas.openxmlformats.org/drawingml/2006/wordprocessingDrawing" xmlns:w10="urn:schemas-microsoft-com:office:word" xmlns:w="http://schemas.openxmlformats.org/wordprocessingml/2006/main" xmlns:w14="http://schemas.microsoft.com/office/word/2010/wordml" xmlns:w15="http://schemas.microsoft.com/office/word/2012/wordml" xmlns:w16cex="http://schemas.microsoft.com/office/word/2018/wordml/cex" xmlns:w16cid="http://schemas.microsoft.com/office/word/2016/wordml/cid" xmlns:w16="http://schemas.microsoft.com/office/word/2018/wordml" xmlns:w16du="http://schemas.microsoft.com/office/word/2023/wordml/word16du" xmlns:w16sdtdh="http://schemas.microsoft.com/office/word/2020/wordml/sdtdatahash" xmlns:w16sdtfl="http://schemas.microsoft.com/office/word/2024/wordml/sdtformatlock" xmlns:w16se="http://schemas.microsoft.com/office/word/2015/wordml/symex" xmlns:wpg="http://schemas.microsoft.com/office/word/2010/wordprocessingGroup" xmlns:wpi="http://schemas.microsoft.com/office/word/2010/wordprocessingInk" xmlns:wne="http://schemas.microsoft.com/office/word/2006/wordml" xmlns:wps="http://schemas.microsoft.com/office/word/2010/wordprocessingShape" mc:Ignorable="w14 w15 w16se w16cid w16 w16cex w16sdtdh w16sdtfl w16du wp14">
   <w:abstractNum w:abstractNumId="0" w15:restartNumberingAfterBreak="0">
+    <w:nsid w:val="0B056880"/>
+    <w:multiLevelType w:val="multilevel"/>
+    <w:tmpl w:val="69101DC8"/>
+    <w:lvl w:ilvl="0">
+      <w:start w:val="1"/>
+      <w:numFmt w:val="decimal"/>
+      <w:lvlText w:val="%1."/>
+      <w:lvlJc w:val="left"/>
+      <w:pPr>
+        <w:tabs>
+          <w:tab w:val="num" w:pos="720"/>
+        </w:tabs>
+        <w:ind w:left="720" w:hanging="360"/>
+      </w:pPr>
+    </w:lvl>
+    <w:lvl w:ilvl="1" w:tentative="1">
+      <w:start w:val="1"/>
+      <w:numFmt w:val="decimal"/>
+      <w:lvlText w:val="%2."/>
+      <w:lvlJc w:val="left"/>
+      <w:pPr>
+        <w:tabs>
+          <w:tab w:val="num" w:pos="1440"/>
+        </w:tabs>
+        <w:ind w:left="1440" w:hanging="360"/>
+      </w:pPr>
+    </w:lvl>
+    <w:lvl w:ilvl="2" w:tentative="1">
+      <w:start w:val="1"/>
+      <w:numFmt w:val="decimal"/>
+      <w:lvlText w:val="%3."/>
+      <w:lvlJc w:val="left"/>
+      <w:pPr>
+        <w:tabs>
+          <w:tab w:val="num" w:pos="2160"/>
+        </w:tabs>
+        <w:ind w:left="2160" w:hanging="360"/>
+      </w:pPr>
+    </w:lvl>
+    <w:lvl w:ilvl="3" w:tentative="1">
+      <w:start w:val="1"/>
+      <w:numFmt w:val="decimal"/>
+      <w:lvlText w:val="%4."/>
+      <w:lvlJc w:val="left"/>
+      <w:pPr>
+        <w:tabs>
+          <w:tab w:val="num" w:pos="2880"/>
+        </w:tabs>
+        <w:ind w:left="2880" w:hanging="360"/>
+      </w:pPr>
+    </w:lvl>
+    <w:lvl w:ilvl="4" w:tentative="1">
+      <w:start w:val="1"/>
+      <w:numFmt w:val="decimal"/>
+      <w:lvlText w:val="%5."/>
+      <w:lvlJc w:val="left"/>
+      <w:pPr>
+        <w:tabs>
+          <w:tab w:val="num" w:pos="3600"/>
+        </w:tabs>
+        <w:ind w:left="3600" w:hanging="360"/>
+      </w:pPr>
+    </w:lvl>
+    <w:lvl w:ilvl="5" w:tentative="1">
+      <w:start w:val="1"/>
+      <w:numFmt w:val="decimal"/>
+      <w:lvlText w:val="%6."/>
+      <w:lvlJc w:val="left"/>
+      <w:pPr>
+        <w:tabs>
+          <w:tab w:val="num" w:pos="4320"/>
+        </w:tabs>
+        <w:ind w:left="4320" w:hanging="360"/>
+      </w:pPr>
+    </w:lvl>
+    <w:lvl w:ilvl="6" w:tentative="1">
+      <w:start w:val="1"/>
+      <w:numFmt w:val="decimal"/>
+      <w:lvlText w:val="%7."/>
+      <w:lvlJc w:val="left"/>
+      <w:pPr>
+        <w:tabs>
+          <w:tab w:val="num" w:pos="5040"/>
+        </w:tabs>
+        <w:ind w:left="5040" w:hanging="360"/>
+      </w:pPr>
+    </w:lvl>
+    <w:lvl w:ilvl="7" w:tentative="1">
+      <w:start w:val="1"/>
+      <w:numFmt w:val="decimal"/>
+      <w:lvlText w:val="%8."/>
+      <w:lvlJc w:val="left"/>
+      <w:pPr>
+        <w:tabs>
+          <w:tab w:val="num" w:pos="5760"/>
+        </w:tabs>
+        <w:ind w:left="5760" w:hanging="360"/>
+      </w:pPr>
+    </w:lvl>
+    <w:lvl w:ilvl="8" w:tentative="1">
+      <w:start w:val="1"/>
+      <w:numFmt w:val="decimal"/>
+      <w:lvlText w:val="%9."/>
+      <w:lvlJc w:val="left"/>
+      <w:pPr>
+        <w:tabs>
+          <w:tab w:val="num" w:pos="6480"/>
+        </w:tabs>
+        <w:ind w:left="6480" w:hanging="360"/>
+      </w:pPr>
+    </w:lvl>
+  </w:abstractNum>
+  <w:abstractNum w:abstractNumId="1" w15:restartNumberingAfterBreak="0">
+    <w:nsid w:val="0C235DC0"/>
+    <w:multiLevelType w:val="multilevel"/>
+    <w:tmpl w:val="9FC82A3A"/>
+    <w:lvl w:ilvl="0">
+      <w:start w:val="1"/>
+      <w:numFmt w:val="bullet"/>
+      <w:lvlText w:val=""/>
+      <w:lvlJc w:val="left"/>
+      <w:pPr>
+        <w:tabs>
+          <w:tab w:val="num" w:pos="720"/>
+        </w:tabs>
+        <w:ind w:left="720" w:hanging="360"/>
+      </w:pPr>
+      <w:rPr>
+        <w:rFonts w:ascii="Symbol" w:hAnsi="Symbol" w:hint="default"/>
+        <w:sz w:val="20"/>
+      </w:rPr>
+    </w:lvl>
+    <w:lvl w:ilvl="1" w:tentative="1">
+      <w:start w:val="1"/>
+      <w:numFmt w:val="bullet"/>
+      <w:lvlText w:val="o"/>
+      <w:lvlJc w:val="left"/>
+      <w:pPr>
+        <w:tabs>
+          <w:tab w:val="num" w:pos="1440"/>
+        </w:tabs>
+        <w:ind w:left="1440" w:hanging="360"/>
+      </w:pPr>
+      <w:rPr>
+        <w:rFonts w:ascii="Courier New" w:hAnsi="Courier New" w:hint="default"/>
+        <w:sz w:val="20"/>
+      </w:rPr>
+    </w:lvl>
+    <w:lvl w:ilvl="2" w:tentative="1">
+      <w:start w:val="1"/>
+      <w:numFmt w:val="bullet"/>
+      <w:lvlText w:val=""/>
+      <w:lvlJc w:val="left"/>
+      <w:pPr>
+        <w:tabs>
+          <w:tab w:val="num" w:pos="2160"/>
+        </w:tabs>
+        <w:ind w:left="2160" w:hanging="360"/>
+      </w:pPr>
+      <w:rPr>
+        <w:rFonts w:ascii="Wingdings" w:hAnsi="Wingdings" w:hint="default"/>
+        <w:sz w:val="20"/>
+      </w:rPr>
+    </w:lvl>
+    <w:lvl w:ilvl="3" w:tentative="1">
+      <w:start w:val="1"/>
+      <w:numFmt w:val="bullet"/>
+      <w:lvlText w:val=""/>
+      <w:lvlJc w:val="left"/>
+      <w:pPr>
+        <w:tabs>
+          <w:tab w:val="num" w:pos="2880"/>
+        </w:tabs>
+        <w:ind w:left="2880" w:hanging="360"/>
+      </w:pPr>
+      <w:rPr>
+        <w:rFonts w:ascii="Wingdings" w:hAnsi="Wingdings" w:hint="default"/>
+        <w:sz w:val="20"/>
+      </w:rPr>
+    </w:lvl>
+    <w:lvl w:ilvl="4" w:tentative="1">
+      <w:start w:val="1"/>
+      <w:numFmt w:val="bullet"/>
+      <w:lvlText w:val=""/>
+      <w:lvlJc w:val="left"/>
+      <w:pPr>
+        <w:tabs>
+          <w:tab w:val="num" w:pos="3600"/>
+        </w:tabs>
+        <w:ind w:left="3600" w:hanging="360"/>
+      </w:pPr>
+      <w:rPr>
+        <w:rFonts w:ascii="Wingdings" w:hAnsi="Wingdings" w:hint="default"/>
+        <w:sz w:val="20"/>
+      </w:rPr>
+    </w:lvl>
+    <w:lvl w:ilvl="5" w:tentative="1">
+      <w:start w:val="1"/>
+      <w:numFmt w:val="bullet"/>
+      <w:lvlText w:val=""/>
+      <w:lvlJc w:val="left"/>
+      <w:pPr>
+        <w:tabs>
+          <w:tab w:val="num" w:pos="4320"/>
+        </w:tabs>
+        <w:ind w:left="4320" w:hanging="360"/>
+      </w:pPr>
+      <w:rPr>
+        <w:rFonts w:ascii="Wingdings" w:hAnsi="Wingdings" w:hint="default"/>
+        <w:sz w:val="20"/>
+      </w:rPr>
+    </w:lvl>
+    <w:lvl w:ilvl="6" w:tentative="1">
+      <w:start w:val="1"/>
+      <w:numFmt w:val="bullet"/>
+      <w:lvlText w:val=""/>
+      <w:lvlJc w:val="left"/>
+      <w:pPr>
+        <w:tabs>
+          <w:tab w:val="num" w:pos="5040"/>
+        </w:tabs>
+        <w:ind w:left="5040" w:hanging="360"/>
+      </w:pPr>
+      <w:rPr>
+        <w:rFonts w:ascii="Wingdings" w:hAnsi="Wingdings" w:hint="default"/>
+        <w:sz w:val="20"/>
+      </w:rPr>
+    </w:lvl>
+    <w:lvl w:ilvl="7" w:tentative="1">
+      <w:start w:val="1"/>
+      <w:numFmt w:val="bullet"/>
+      <w:lvlText w:val=""/>
+      <w:lvlJc w:val="left"/>
+      <w:pPr>
+        <w:tabs>
+          <w:tab w:val="num" w:pos="5760"/>
+        </w:tabs>
+        <w:ind w:left="5760" w:hanging="360"/>
+      </w:pPr>
+      <w:rPr>
+        <w:rFonts w:ascii="Wingdings" w:hAnsi="Wingdings" w:hint="default"/>
+        <w:sz w:val="20"/>
+      </w:rPr>
+    </w:lvl>
+    <w:lvl w:ilvl="8" w:tentative="1">
+      <w:start w:val="1"/>
+      <w:numFmt w:val="bullet"/>
+      <w:lvlText w:val=""/>
+      <w:lvlJc w:val="left"/>
+      <w:pPr>
+        <w:tabs>
+          <w:tab w:val="num" w:pos="6480"/>
+        </w:tabs>
+        <w:ind w:left="6480" w:hanging="360"/>
+      </w:pPr>
+      <w:rPr>
+        <w:rFonts w:ascii="Wingdings" w:hAnsi="Wingdings" w:hint="default"/>
+        <w:sz w:val="20"/>
+      </w:rPr>
+    </w:lvl>
+  </w:abstractNum>
+  <w:abstractNum w:abstractNumId="2" w15:restartNumberingAfterBreak="0">
+    <w:nsid w:val="0D911F10"/>
+    <w:multiLevelType w:val="multilevel"/>
+    <w:tmpl w:val="B5E46BB8"/>
+    <w:lvl w:ilvl="0">
+      <w:start w:val="1"/>
+      <w:numFmt w:val="bullet"/>
+      <w:lvlText w:val=""/>
+      <w:lvlJc w:val="left"/>
+      <w:pPr>
+        <w:tabs>
+          <w:tab w:val="num" w:pos="720"/>
+        </w:tabs>
+        <w:ind w:left="720" w:hanging="360"/>
+      </w:pPr>
+      <w:rPr>
+        <w:rFonts w:ascii="Symbol" w:hAnsi="Symbol" w:hint="default"/>
+        <w:sz w:val="20"/>
+      </w:rPr>
+    </w:lvl>
+    <w:lvl w:ilvl="1" w:tentative="1">
+      <w:start w:val="1"/>
+      <w:numFmt w:val="bullet"/>
+      <w:lvlText w:val="o"/>
+      <w:lvlJc w:val="left"/>
+      <w:pPr>
+        <w:tabs>
+          <w:tab w:val="num" w:pos="1440"/>
+        </w:tabs>
+        <w:ind w:left="1440" w:hanging="360"/>
+      </w:pPr>
+      <w:rPr>
+        <w:rFonts w:ascii="Courier New" w:hAnsi="Courier New" w:hint="default"/>
+        <w:sz w:val="20"/>
+      </w:rPr>
+    </w:lvl>
+    <w:lvl w:ilvl="2" w:tentative="1">
+      <w:start w:val="1"/>
+      <w:numFmt w:val="bullet"/>
+      <w:lvlText w:val=""/>
+      <w:lvlJc w:val="left"/>
+      <w:pPr>
+        <w:tabs>
+          <w:tab w:val="num" w:pos="2160"/>
+        </w:tabs>
+        <w:ind w:left="2160" w:hanging="360"/>
+      </w:pPr>
+      <w:rPr>
+        <w:rFonts w:ascii="Wingdings" w:hAnsi="Wingdings" w:hint="default"/>
+        <w:sz w:val="20"/>
+      </w:rPr>
+    </w:lvl>
+    <w:lvl w:ilvl="3" w:tentative="1">
+      <w:start w:val="1"/>
+      <w:numFmt w:val="bullet"/>
+      <w:lvlText w:val=""/>
+      <w:lvlJc w:val="left"/>
+      <w:pPr>
+        <w:tabs>
+          <w:tab w:val="num" w:pos="2880"/>
+        </w:tabs>
+        <w:ind w:left="2880" w:hanging="360"/>
+      </w:pPr>
+      <w:rPr>
+        <w:rFonts w:ascii="Wingdings" w:hAnsi="Wingdings" w:hint="default"/>
+        <w:sz w:val="20"/>
+      </w:rPr>
+    </w:lvl>
+    <w:lvl w:ilvl="4" w:tentative="1">
+      <w:start w:val="1"/>
+      <w:numFmt w:val="bullet"/>
+      <w:lvlText w:val=""/>
+      <w:lvlJc w:val="left"/>
+      <w:pPr>
+        <w:tabs>
+          <w:tab w:val="num" w:pos="3600"/>
+        </w:tabs>
+        <w:ind w:left="3600" w:hanging="360"/>
+      </w:pPr>
+      <w:rPr>
+        <w:rFonts w:ascii="Wingdings" w:hAnsi="Wingdings" w:hint="default"/>
+        <w:sz w:val="20"/>
+      </w:rPr>
+    </w:lvl>
+    <w:lvl w:ilvl="5" w:tentative="1">
+      <w:start w:val="1"/>
+      <w:numFmt w:val="bullet"/>
+      <w:lvlText w:val=""/>
+      <w:lvlJc w:val="left"/>
+      <w:pPr>
+        <w:tabs>
+          <w:tab w:val="num" w:pos="4320"/>
+        </w:tabs>
+        <w:ind w:left="4320" w:hanging="360"/>
+      </w:pPr>
+      <w:rPr>
+        <w:rFonts w:ascii="Wingdings" w:hAnsi="Wingdings" w:hint="default"/>
+        <w:sz w:val="20"/>
+      </w:rPr>
+    </w:lvl>
+    <w:lvl w:ilvl="6" w:tentative="1">
+      <w:start w:val="1"/>
+      <w:numFmt w:val="bullet"/>
+      <w:lvlText w:val=""/>
+      <w:lvlJc w:val="left"/>
+      <w:pPr>
+        <w:tabs>
+          <w:tab w:val="num" w:pos="5040"/>
+        </w:tabs>
+        <w:ind w:left="5040" w:hanging="360"/>
+      </w:pPr>
+      <w:rPr>
+        <w:rFonts w:ascii="Wingdings" w:hAnsi="Wingdings" w:hint="default"/>
+        <w:sz w:val="20"/>
+      </w:rPr>
+    </w:lvl>
+    <w:lvl w:ilvl="7" w:tentative="1">
+      <w:start w:val="1"/>
+      <w:numFmt w:val="bullet"/>
+      <w:lvlText w:val=""/>
+      <w:lvlJc w:val="left"/>
+      <w:pPr>
+        <w:tabs>
+          <w:tab w:val="num" w:pos="5760"/>
+        </w:tabs>
+        <w:ind w:left="5760" w:hanging="360"/>
+      </w:pPr>
+      <w:rPr>
+        <w:rFonts w:ascii="Wingdings" w:hAnsi="Wingdings" w:hint="default"/>
+        <w:sz w:val="20"/>
+      </w:rPr>
+    </w:lvl>
+    <w:lvl w:ilvl="8" w:tentative="1">
+      <w:start w:val="1"/>
+      <w:numFmt w:val="bullet"/>
+      <w:lvlText w:val=""/>
+      <w:lvlJc w:val="left"/>
+      <w:pPr>
+        <w:tabs>
+          <w:tab w:val="num" w:pos="6480"/>
+        </w:tabs>
+        <w:ind w:left="6480" w:hanging="360"/>
+      </w:pPr>
+      <w:rPr>
+        <w:rFonts w:ascii="Wingdings" w:hAnsi="Wingdings" w:hint="default"/>
+        <w:sz w:val="20"/>
+      </w:rPr>
+    </w:lvl>
+  </w:abstractNum>
+  <w:abstractNum w:abstractNumId="3" w15:restartNumberingAfterBreak="0">
+    <w:nsid w:val="19255422"/>
+    <w:multiLevelType w:val="multilevel"/>
+    <w:tmpl w:val="E3E0BD1C"/>
+    <w:lvl w:ilvl="0">
+      <w:start w:val="1"/>
+      <w:numFmt w:val="bullet"/>
+      <w:lvlText w:val=""/>
+      <w:lvlJc w:val="left"/>
+      <w:pPr>
+        <w:tabs>
+          <w:tab w:val="num" w:pos="720"/>
+        </w:tabs>
+        <w:ind w:left="720" w:hanging="360"/>
+      </w:pPr>
+      <w:rPr>
+        <w:rFonts w:ascii="Symbol" w:hAnsi="Symbol" w:hint="default"/>
+        <w:sz w:val="20"/>
+      </w:rPr>
+    </w:lvl>
+    <w:lvl w:ilvl="1" w:tentative="1">
+      <w:start w:val="1"/>
+      <w:numFmt w:val="bullet"/>
+      <w:lvlText w:val="o"/>
+      <w:lvlJc w:val="left"/>
+      <w:pPr>
+        <w:tabs>
+          <w:tab w:val="num" w:pos="1440"/>
+        </w:tabs>
+        <w:ind w:left="1440" w:hanging="360"/>
+      </w:pPr>
+      <w:rPr>
+        <w:rFonts w:ascii="Courier New" w:hAnsi="Courier New" w:hint="default"/>
+        <w:sz w:val="20"/>
+      </w:rPr>
+    </w:lvl>
+    <w:lvl w:ilvl="2" w:tentative="1">
+      <w:start w:val="1"/>
+      <w:numFmt w:val="bullet"/>
+      <w:lvlText w:val=""/>
+      <w:lvlJc w:val="left"/>
+      <w:pPr>
+        <w:tabs>
+          <w:tab w:val="num" w:pos="2160"/>
+        </w:tabs>
+        <w:ind w:left="2160" w:hanging="360"/>
+      </w:pPr>
+      <w:rPr>
+        <w:rFonts w:ascii="Wingdings" w:hAnsi="Wingdings" w:hint="default"/>
+        <w:sz w:val="20"/>
+      </w:rPr>
+    </w:lvl>
+    <w:lvl w:ilvl="3" w:tentative="1">
+      <w:start w:val="1"/>
+      <w:numFmt w:val="bullet"/>
+      <w:lvlText w:val=""/>
+      <w:lvlJc w:val="left"/>
+      <w:pPr>
+        <w:tabs>
+          <w:tab w:val="num" w:pos="2880"/>
+        </w:tabs>
+        <w:ind w:left="2880" w:hanging="360"/>
+      </w:pPr>
+      <w:rPr>
+        <w:rFonts w:ascii="Wingdings" w:hAnsi="Wingdings" w:hint="default"/>
+        <w:sz w:val="20"/>
+      </w:rPr>
+    </w:lvl>
+    <w:lvl w:ilvl="4" w:tentative="1">
+      <w:start w:val="1"/>
+      <w:numFmt w:val="bullet"/>
+      <w:lvlText w:val=""/>
+      <w:lvlJc w:val="left"/>
+      <w:pPr>
+        <w:tabs>
+          <w:tab w:val="num" w:pos="3600"/>
+        </w:tabs>
+        <w:ind w:left="3600" w:hanging="360"/>
+      </w:pPr>
+      <w:rPr>
+        <w:rFonts w:ascii="Wingdings" w:hAnsi="Wingdings" w:hint="default"/>
+        <w:sz w:val="20"/>
+      </w:rPr>
+    </w:lvl>
+    <w:lvl w:ilvl="5" w:tentative="1">
+      <w:start w:val="1"/>
+      <w:numFmt w:val="bullet"/>
+      <w:lvlText w:val=""/>
+      <w:lvlJc w:val="left"/>
+      <w:pPr>
+        <w:tabs>
+          <w:tab w:val="num" w:pos="4320"/>
+        </w:tabs>
+        <w:ind w:left="4320" w:hanging="360"/>
+      </w:pPr>
+      <w:rPr>
+        <w:rFonts w:ascii="Wingdings" w:hAnsi="Wingdings" w:hint="default"/>
+        <w:sz w:val="20"/>
+      </w:rPr>
+    </w:lvl>
+    <w:lvl w:ilvl="6" w:tentative="1">
+      <w:start w:val="1"/>
+      <w:numFmt w:val="bullet"/>
+      <w:lvlText w:val=""/>
+      <w:lvlJc w:val="left"/>
+      <w:pPr>
+        <w:tabs>
+          <w:tab w:val="num" w:pos="5040"/>
+        </w:tabs>
+        <w:ind w:left="5040" w:hanging="360"/>
+      </w:pPr>
+      <w:rPr>
+        <w:rFonts w:ascii="Wingdings" w:hAnsi="Wingdings" w:hint="default"/>
+        <w:sz w:val="20"/>
+      </w:rPr>
+    </w:lvl>
+    <w:lvl w:ilvl="7" w:tentative="1">
+      <w:start w:val="1"/>
+      <w:numFmt w:val="bullet"/>
+      <w:lvlText w:val=""/>
+      <w:lvlJc w:val="left"/>
+      <w:pPr>
+        <w:tabs>
+          <w:tab w:val="num" w:pos="5760"/>
+        </w:tabs>
+        <w:ind w:left="5760" w:hanging="360"/>
+      </w:pPr>
+      <w:rPr>
+        <w:rFonts w:ascii="Wingdings" w:hAnsi="Wingdings" w:hint="default"/>
+        <w:sz w:val="20"/>
+      </w:rPr>
+    </w:lvl>
+    <w:lvl w:ilvl="8" w:tentative="1">
+      <w:start w:val="1"/>
+      <w:numFmt w:val="bullet"/>
+      <w:lvlText w:val=""/>
+      <w:lvlJc w:val="left"/>
+      <w:pPr>
+        <w:tabs>
+          <w:tab w:val="num" w:pos="6480"/>
+        </w:tabs>
+        <w:ind w:left="6480" w:hanging="360"/>
+      </w:pPr>
+      <w:rPr>
+        <w:rFonts w:ascii="Wingdings" w:hAnsi="Wingdings" w:hint="default"/>
+        <w:sz w:val="20"/>
+      </w:rPr>
+    </w:lvl>
+  </w:abstractNum>
+  <w:abstractNum w:abstractNumId="4" w15:restartNumberingAfterBreak="0">
+    <w:nsid w:val="299169AD"/>
+    <w:multiLevelType w:val="multilevel"/>
+    <w:tmpl w:val="AE4C1A74"/>
+    <w:lvl w:ilvl="0">
+      <w:start w:val="1"/>
+      <w:numFmt w:val="bullet"/>
+      <w:lvlText w:val=""/>
+      <w:lvlJc w:val="left"/>
+      <w:pPr>
+        <w:tabs>
+          <w:tab w:val="num" w:pos="720"/>
+        </w:tabs>
+        <w:ind w:left="720" w:hanging="360"/>
+      </w:pPr>
+      <w:rPr>
+        <w:rFonts w:ascii="Symbol" w:hAnsi="Symbol" w:hint="default"/>
+        <w:sz w:val="20"/>
+      </w:rPr>
+    </w:lvl>
+    <w:lvl w:ilvl="1" w:tentative="1">
+      <w:start w:val="1"/>
+      <w:numFmt w:val="bullet"/>
+      <w:lvlText w:val="o"/>
+      <w:lvlJc w:val="left"/>
+      <w:pPr>
+        <w:tabs>
+          <w:tab w:val="num" w:pos="1440"/>
+        </w:tabs>
+        <w:ind w:left="1440" w:hanging="360"/>
+      </w:pPr>
+      <w:rPr>
+        <w:rFonts w:ascii="Courier New" w:hAnsi="Courier New" w:hint="default"/>
+        <w:sz w:val="20"/>
+      </w:rPr>
+    </w:lvl>
+    <w:lvl w:ilvl="2" w:tentative="1">
+      <w:start w:val="1"/>
+      <w:numFmt w:val="bullet"/>
+      <w:lvlText w:val=""/>
+      <w:lvlJc w:val="left"/>
+      <w:pPr>
+        <w:tabs>
+          <w:tab w:val="num" w:pos="2160"/>
+        </w:tabs>
+        <w:ind w:left="2160" w:hanging="360"/>
+      </w:pPr>
+      <w:rPr>
+        <w:rFonts w:ascii="Wingdings" w:hAnsi="Wingdings" w:hint="default"/>
+        <w:sz w:val="20"/>
+      </w:rPr>
+    </w:lvl>
+    <w:lvl w:ilvl="3" w:tentative="1">
+      <w:start w:val="1"/>
+      <w:numFmt w:val="bullet"/>
+      <w:lvlText w:val=""/>
+      <w:lvlJc w:val="left"/>
+      <w:pPr>
+        <w:tabs>
+          <w:tab w:val="num" w:pos="2880"/>
+        </w:tabs>
+        <w:ind w:left="2880" w:hanging="360"/>
+      </w:pPr>
+      <w:rPr>
+        <w:rFonts w:ascii="Wingdings" w:hAnsi="Wingdings" w:hint="default"/>
+        <w:sz w:val="20"/>
+      </w:rPr>
+    </w:lvl>
+    <w:lvl w:ilvl="4" w:tentative="1">
+      <w:start w:val="1"/>
+      <w:numFmt w:val="bullet"/>
+      <w:lvlText w:val=""/>
+      <w:lvlJc w:val="left"/>
+      <w:pPr>
+        <w:tabs>
+          <w:tab w:val="num" w:pos="3600"/>
+        </w:tabs>
+        <w:ind w:left="3600" w:hanging="360"/>
+      </w:pPr>
+      <w:rPr>
+        <w:rFonts w:ascii="Wingdings" w:hAnsi="Wingdings" w:hint="default"/>
+        <w:sz w:val="20"/>
+      </w:rPr>
+    </w:lvl>
+    <w:lvl w:ilvl="5" w:tentative="1">
+      <w:start w:val="1"/>
+      <w:numFmt w:val="bullet"/>
+      <w:lvlText w:val=""/>
+      <w:lvlJc w:val="left"/>
+      <w:pPr>
+        <w:tabs>
+          <w:tab w:val="num" w:pos="4320"/>
+        </w:tabs>
+        <w:ind w:left="4320" w:hanging="360"/>
+      </w:pPr>
+      <w:rPr>
+        <w:rFonts w:ascii="Wingdings" w:hAnsi="Wingdings" w:hint="default"/>
+        <w:sz w:val="20"/>
+      </w:rPr>
+    </w:lvl>
+    <w:lvl w:ilvl="6" w:tentative="1">
+      <w:start w:val="1"/>
+      <w:numFmt w:val="bullet"/>
+      <w:lvlText w:val=""/>
+      <w:lvlJc w:val="left"/>
+      <w:pPr>
+        <w:tabs>
+          <w:tab w:val="num" w:pos="5040"/>
+        </w:tabs>
+        <w:ind w:left="5040" w:hanging="360"/>
+      </w:pPr>
+      <w:rPr>
+        <w:rFonts w:ascii="Wingdings" w:hAnsi="Wingdings" w:hint="default"/>
+        <w:sz w:val="20"/>
+      </w:rPr>
+    </w:lvl>
+    <w:lvl w:ilvl="7" w:tentative="1">
+      <w:start w:val="1"/>
+      <w:numFmt w:val="bullet"/>
+      <w:lvlText w:val=""/>
+      <w:lvlJc w:val="left"/>
+      <w:pPr>
+        <w:tabs>
+          <w:tab w:val="num" w:pos="5760"/>
+        </w:tabs>
+        <w:ind w:left="5760" w:hanging="360"/>
+      </w:pPr>
+      <w:rPr>
+        <w:rFonts w:ascii="Wingdings" w:hAnsi="Wingdings" w:hint="default"/>
+        <w:sz w:val="20"/>
+      </w:rPr>
+    </w:lvl>
+    <w:lvl w:ilvl="8" w:tentative="1">
+      <w:start w:val="1"/>
+      <w:numFmt w:val="bullet"/>
+      <w:lvlText w:val=""/>
+      <w:lvlJc w:val="left"/>
+      <w:pPr>
+        <w:tabs>
+          <w:tab w:val="num" w:pos="6480"/>
+        </w:tabs>
+        <w:ind w:left="6480" w:hanging="360"/>
+      </w:pPr>
+      <w:rPr>
+        <w:rFonts w:ascii="Wingdings" w:hAnsi="Wingdings" w:hint="default"/>
+        <w:sz w:val="20"/>
+      </w:rPr>
+    </w:lvl>
+  </w:abstractNum>
+  <w:abstractNum w:abstractNumId="5" w15:restartNumberingAfterBreak="0">
     <w:nsid w:val="40232F43"/>
     <w:multiLevelType w:val="hybridMultilevel"/>
     <w:tmpl w:val="5E623CDC"/>
@@ -1258,7 +3656,7 @@
       </w:pPr>
     </w:lvl>
   </w:abstractNum>
-  <w:abstractNum w:abstractNumId="1" w15:restartNumberingAfterBreak="0">
+  <w:abstractNum w:abstractNumId="6" w15:restartNumberingAfterBreak="0">
     <w:nsid w:val="46D9437B"/>
     <w:multiLevelType w:val="hybridMultilevel"/>
     <w:tmpl w:val="09288DAA"/>
@@ -1347,7 +3745,156 @@
       </w:pPr>
     </w:lvl>
   </w:abstractNum>
-  <w:abstractNum w:abstractNumId="2" w15:restartNumberingAfterBreak="0">
+  <w:abstractNum w:abstractNumId="7" w15:restartNumberingAfterBreak="0">
+    <w:nsid w:val="47890F39"/>
+    <w:multiLevelType w:val="multilevel"/>
+    <w:tmpl w:val="73B0C78A"/>
+    <w:lvl w:ilvl="0">
+      <w:start w:val="1"/>
+      <w:numFmt w:val="bullet"/>
+      <w:lvlText w:val=""/>
+      <w:lvlJc w:val="left"/>
+      <w:pPr>
+        <w:tabs>
+          <w:tab w:val="num" w:pos="720"/>
+        </w:tabs>
+        <w:ind w:left="720" w:hanging="360"/>
+      </w:pPr>
+      <w:rPr>
+        <w:rFonts w:ascii="Symbol" w:hAnsi="Symbol" w:hint="default"/>
+        <w:sz w:val="20"/>
+      </w:rPr>
+    </w:lvl>
+    <w:lvl w:ilvl="1" w:tentative="1">
+      <w:start w:val="1"/>
+      <w:numFmt w:val="bullet"/>
+      <w:lvlText w:val="o"/>
+      <w:lvlJc w:val="left"/>
+      <w:pPr>
+        <w:tabs>
+          <w:tab w:val="num" w:pos="1440"/>
+        </w:tabs>
+        <w:ind w:left="1440" w:hanging="360"/>
+      </w:pPr>
+      <w:rPr>
+        <w:rFonts w:ascii="Courier New" w:hAnsi="Courier New" w:hint="default"/>
+        <w:sz w:val="20"/>
+      </w:rPr>
+    </w:lvl>
+    <w:lvl w:ilvl="2" w:tentative="1">
+      <w:start w:val="1"/>
+      <w:numFmt w:val="bullet"/>
+      <w:lvlText w:val=""/>
+      <w:lvlJc w:val="left"/>
+      <w:pPr>
+        <w:tabs>
+          <w:tab w:val="num" w:pos="2160"/>
+        </w:tabs>
+        <w:ind w:left="2160" w:hanging="360"/>
+      </w:pPr>
+      <w:rPr>
+        <w:rFonts w:ascii="Wingdings" w:hAnsi="Wingdings" w:hint="default"/>
+        <w:sz w:val="20"/>
+      </w:rPr>
+    </w:lvl>
+    <w:lvl w:ilvl="3" w:tentative="1">
+      <w:start w:val="1"/>
+      <w:numFmt w:val="bullet"/>
+      <w:lvlText w:val=""/>
+      <w:lvlJc w:val="left"/>
+      <w:pPr>
+        <w:tabs>
+          <w:tab w:val="num" w:pos="2880"/>
+        </w:tabs>
+        <w:ind w:left="2880" w:hanging="360"/>
+      </w:pPr>
+      <w:rPr>
+        <w:rFonts w:ascii="Wingdings" w:hAnsi="Wingdings" w:hint="default"/>
+        <w:sz w:val="20"/>
+      </w:rPr>
+    </w:lvl>
+    <w:lvl w:ilvl="4" w:tentative="1">
+      <w:start w:val="1"/>
+      <w:numFmt w:val="bullet"/>
+      <w:lvlText w:val=""/>
+      <w:lvlJc w:val="left"/>
+      <w:pPr>
+        <w:tabs>
+          <w:tab w:val="num" w:pos="3600"/>
+        </w:tabs>
+        <w:ind w:left="3600" w:hanging="360"/>
+      </w:pPr>
+      <w:rPr>
+        <w:rFonts w:ascii="Wingdings" w:hAnsi="Wingdings" w:hint="default"/>
+        <w:sz w:val="20"/>
+      </w:rPr>
+    </w:lvl>
+    <w:lvl w:ilvl="5" w:tentative="1">
+      <w:start w:val="1"/>
+      <w:numFmt w:val="bullet"/>
+      <w:lvlText w:val=""/>
+      <w:lvlJc w:val="left"/>
+      <w:pPr>
+        <w:tabs>
+          <w:tab w:val="num" w:pos="4320"/>
+        </w:tabs>
+        <w:ind w:left="4320" w:hanging="360"/>
+      </w:pPr>
+      <w:rPr>
+        <w:rFonts w:ascii="Wingdings" w:hAnsi="Wingdings" w:hint="default"/>
+        <w:sz w:val="20"/>
+      </w:rPr>
+    </w:lvl>
+    <w:lvl w:ilvl="6" w:tentative="1">
+      <w:start w:val="1"/>
+      <w:numFmt w:val="bullet"/>
+      <w:lvlText w:val=""/>
+      <w:lvlJc w:val="left"/>
+      <w:pPr>
+        <w:tabs>
+          <w:tab w:val="num" w:pos="5040"/>
+        </w:tabs>
+        <w:ind w:left="5040" w:hanging="360"/>
+      </w:pPr>
+      <w:rPr>
+        <w:rFonts w:ascii="Wingdings" w:hAnsi="Wingdings" w:hint="default"/>
+        <w:sz w:val="20"/>
+      </w:rPr>
+    </w:lvl>
+    <w:lvl w:ilvl="7" w:tentative="1">
+      <w:start w:val="1"/>
+      <w:numFmt w:val="bullet"/>
+      <w:lvlText w:val=""/>
+      <w:lvlJc w:val="left"/>
+      <w:pPr>
+        <w:tabs>
+          <w:tab w:val="num" w:pos="5760"/>
+        </w:tabs>
+        <w:ind w:left="5760" w:hanging="360"/>
+      </w:pPr>
+      <w:rPr>
+        <w:rFonts w:ascii="Wingdings" w:hAnsi="Wingdings" w:hint="default"/>
+        <w:sz w:val="20"/>
+      </w:rPr>
+    </w:lvl>
+    <w:lvl w:ilvl="8" w:tentative="1">
+      <w:start w:val="1"/>
+      <w:numFmt w:val="bullet"/>
+      <w:lvlText w:val=""/>
+      <w:lvlJc w:val="left"/>
+      <w:pPr>
+        <w:tabs>
+          <w:tab w:val="num" w:pos="6480"/>
+        </w:tabs>
+        <w:ind w:left="6480" w:hanging="360"/>
+      </w:pPr>
+      <w:rPr>
+        <w:rFonts w:ascii="Wingdings" w:hAnsi="Wingdings" w:hint="default"/>
+        <w:sz w:val="20"/>
+      </w:rPr>
+    </w:lvl>
+  </w:abstractNum>
+  <w:abstractNum w:abstractNumId="8" w15:restartNumberingAfterBreak="0">
     <w:nsid w:val="51DA5C20"/>
     <w:multiLevelType w:val="multilevel"/>
     <w:tmpl w:val="E9F02D90"/>
@@ -1460,7 +4007,454 @@
       </w:rPr>
     </w:lvl>
   </w:abstractNum>
-  <w:abstractNum w:abstractNumId="3" w15:restartNumberingAfterBreak="0">
+  <w:abstractNum w:abstractNumId="9" w15:restartNumberingAfterBreak="0">
+    <w:nsid w:val="53B515E1"/>
+    <w:multiLevelType w:val="multilevel"/>
+    <w:tmpl w:val="2EF49A8E"/>
+    <w:lvl w:ilvl="0">
+      <w:start w:val="1"/>
+      <w:numFmt w:val="bullet"/>
+      <w:lvlText w:val=""/>
+      <w:lvlJc w:val="left"/>
+      <w:pPr>
+        <w:tabs>
+          <w:tab w:val="num" w:pos="720"/>
+        </w:tabs>
+        <w:ind w:left="720" w:hanging="360"/>
+      </w:pPr>
+      <w:rPr>
+        <w:rFonts w:ascii="Symbol" w:hAnsi="Symbol" w:hint="default"/>
+        <w:sz w:val="20"/>
+      </w:rPr>
+    </w:lvl>
+    <w:lvl w:ilvl="1" w:tentative="1">
+      <w:start w:val="1"/>
+      <w:numFmt w:val="bullet"/>
+      <w:lvlText w:val="o"/>
+      <w:lvlJc w:val="left"/>
+      <w:pPr>
+        <w:tabs>
+          <w:tab w:val="num" w:pos="1440"/>
+        </w:tabs>
+        <w:ind w:left="1440" w:hanging="360"/>
+      </w:pPr>
+      <w:rPr>
+        <w:rFonts w:ascii="Courier New" w:hAnsi="Courier New" w:hint="default"/>
+        <w:sz w:val="20"/>
+      </w:rPr>
+    </w:lvl>
+    <w:lvl w:ilvl="2" w:tentative="1">
+      <w:start w:val="1"/>
+      <w:numFmt w:val="bullet"/>
+      <w:lvlText w:val=""/>
+      <w:lvlJc w:val="left"/>
+      <w:pPr>
+        <w:tabs>
+          <w:tab w:val="num" w:pos="2160"/>
+        </w:tabs>
+        <w:ind w:left="2160" w:hanging="360"/>
+      </w:pPr>
+      <w:rPr>
+        <w:rFonts w:ascii="Wingdings" w:hAnsi="Wingdings" w:hint="default"/>
+        <w:sz w:val="20"/>
+      </w:rPr>
+    </w:lvl>
+    <w:lvl w:ilvl="3" w:tentative="1">
+      <w:start w:val="1"/>
+      <w:numFmt w:val="bullet"/>
+      <w:lvlText w:val=""/>
+      <w:lvlJc w:val="left"/>
+      <w:pPr>
+        <w:tabs>
+          <w:tab w:val="num" w:pos="2880"/>
+        </w:tabs>
+        <w:ind w:left="2880" w:hanging="360"/>
+      </w:pPr>
+      <w:rPr>
+        <w:rFonts w:ascii="Wingdings" w:hAnsi="Wingdings" w:hint="default"/>
+        <w:sz w:val="20"/>
+      </w:rPr>
+    </w:lvl>
+    <w:lvl w:ilvl="4" w:tentative="1">
+      <w:start w:val="1"/>
+      <w:numFmt w:val="bullet"/>
+      <w:lvlText w:val=""/>
+      <w:lvlJc w:val="left"/>
+      <w:pPr>
+        <w:tabs>
+          <w:tab w:val="num" w:pos="3600"/>
+        </w:tabs>
+        <w:ind w:left="3600" w:hanging="360"/>
+      </w:pPr>
+      <w:rPr>
+        <w:rFonts w:ascii="Wingdings" w:hAnsi="Wingdings" w:hint="default"/>
+        <w:sz w:val="20"/>
+      </w:rPr>
+    </w:lvl>
+    <w:lvl w:ilvl="5" w:tentative="1">
+      <w:start w:val="1"/>
+      <w:numFmt w:val="bullet"/>
+      <w:lvlText w:val=""/>
+      <w:lvlJc w:val="left"/>
+      <w:pPr>
+        <w:tabs>
+          <w:tab w:val="num" w:pos="4320"/>
+        </w:tabs>
+        <w:ind w:left="4320" w:hanging="360"/>
+      </w:pPr>
+      <w:rPr>
+        <w:rFonts w:ascii="Wingdings" w:hAnsi="Wingdings" w:hint="default"/>
+        <w:sz w:val="20"/>
+      </w:rPr>
+    </w:lvl>
+    <w:lvl w:ilvl="6" w:tentative="1">
+      <w:start w:val="1"/>
+      <w:numFmt w:val="bullet"/>
+      <w:lvlText w:val=""/>
+      <w:lvlJc w:val="left"/>
+      <w:pPr>
+        <w:tabs>
+          <w:tab w:val="num" w:pos="5040"/>
+        </w:tabs>
+        <w:ind w:left="5040" w:hanging="360"/>
+      </w:pPr>
+      <w:rPr>
+        <w:rFonts w:ascii="Wingdings" w:hAnsi="Wingdings" w:hint="default"/>
+        <w:sz w:val="20"/>
+      </w:rPr>
+    </w:lvl>
+    <w:lvl w:ilvl="7" w:tentative="1">
+      <w:start w:val="1"/>
+      <w:numFmt w:val="bullet"/>
+      <w:lvlText w:val=""/>
+      <w:lvlJc w:val="left"/>
+      <w:pPr>
+        <w:tabs>
+          <w:tab w:val="num" w:pos="5760"/>
+        </w:tabs>
+        <w:ind w:left="5760" w:hanging="360"/>
+      </w:pPr>
+      <w:rPr>
+        <w:rFonts w:ascii="Wingdings" w:hAnsi="Wingdings" w:hint="default"/>
+        <w:sz w:val="20"/>
+      </w:rPr>
+    </w:lvl>
+    <w:lvl w:ilvl="8" w:tentative="1">
+      <w:start w:val="1"/>
+      <w:numFmt w:val="bullet"/>
+      <w:lvlText w:val=""/>
+      <w:lvlJc w:val="left"/>
+      <w:pPr>
+        <w:tabs>
+          <w:tab w:val="num" w:pos="6480"/>
+        </w:tabs>
+        <w:ind w:left="6480" w:hanging="360"/>
+      </w:pPr>
+      <w:rPr>
+        <w:rFonts w:ascii="Wingdings" w:hAnsi="Wingdings" w:hint="default"/>
+        <w:sz w:val="20"/>
+      </w:rPr>
+    </w:lvl>
+  </w:abstractNum>
+  <w:abstractNum w:abstractNumId="10" w15:restartNumberingAfterBreak="0">
+    <w:nsid w:val="56136885"/>
+    <w:multiLevelType w:val="multilevel"/>
+    <w:tmpl w:val="1ACC4C1E"/>
+    <w:lvl w:ilvl="0">
+      <w:start w:val="1"/>
+      <w:numFmt w:val="bullet"/>
+      <w:lvlText w:val=""/>
+      <w:lvlJc w:val="left"/>
+      <w:pPr>
+        <w:tabs>
+          <w:tab w:val="num" w:pos="720"/>
+        </w:tabs>
+        <w:ind w:left="720" w:hanging="360"/>
+      </w:pPr>
+      <w:rPr>
+        <w:rFonts w:ascii="Symbol" w:hAnsi="Symbol" w:hint="default"/>
+        <w:sz w:val="20"/>
+      </w:rPr>
+    </w:lvl>
+    <w:lvl w:ilvl="1" w:tentative="1">
+      <w:start w:val="1"/>
+      <w:numFmt w:val="bullet"/>
+      <w:lvlText w:val="o"/>
+      <w:lvlJc w:val="left"/>
+      <w:pPr>
+        <w:tabs>
+          <w:tab w:val="num" w:pos="1440"/>
+        </w:tabs>
+        <w:ind w:left="1440" w:hanging="360"/>
+      </w:pPr>
+      <w:rPr>
+        <w:rFonts w:ascii="Courier New" w:hAnsi="Courier New" w:hint="default"/>
+        <w:sz w:val="20"/>
+      </w:rPr>
+    </w:lvl>
+    <w:lvl w:ilvl="2" w:tentative="1">
+      <w:start w:val="1"/>
+      <w:numFmt w:val="bullet"/>
+      <w:lvlText w:val=""/>
+      <w:lvlJc w:val="left"/>
+      <w:pPr>
+        <w:tabs>
+          <w:tab w:val="num" w:pos="2160"/>
+        </w:tabs>
+        <w:ind w:left="2160" w:hanging="360"/>
+      </w:pPr>
+      <w:rPr>
+        <w:rFonts w:ascii="Wingdings" w:hAnsi="Wingdings" w:hint="default"/>
+        <w:sz w:val="20"/>
+      </w:rPr>
+    </w:lvl>
+    <w:lvl w:ilvl="3" w:tentative="1">
+      <w:start w:val="1"/>
+      <w:numFmt w:val="bullet"/>
+      <w:lvlText w:val=""/>
+      <w:lvlJc w:val="left"/>
+      <w:pPr>
+        <w:tabs>
+          <w:tab w:val="num" w:pos="2880"/>
+        </w:tabs>
+        <w:ind w:left="2880" w:hanging="360"/>
+      </w:pPr>
+      <w:rPr>
+        <w:rFonts w:ascii="Wingdings" w:hAnsi="Wingdings" w:hint="default"/>
+        <w:sz w:val="20"/>
+      </w:rPr>
+    </w:lvl>
+    <w:lvl w:ilvl="4" w:tentative="1">
+      <w:start w:val="1"/>
+      <w:numFmt w:val="bullet"/>
+      <w:lvlText w:val=""/>
+      <w:lvlJc w:val="left"/>
+      <w:pPr>
+        <w:tabs>
+          <w:tab w:val="num" w:pos="3600"/>
+        </w:tabs>
+        <w:ind w:left="3600" w:hanging="360"/>
+      </w:pPr>
+      <w:rPr>
+        <w:rFonts w:ascii="Wingdings" w:hAnsi="Wingdings" w:hint="default"/>
+        <w:sz w:val="20"/>
+      </w:rPr>
+    </w:lvl>
+    <w:lvl w:ilvl="5" w:tentative="1">
+      <w:start w:val="1"/>
+      <w:numFmt w:val="bullet"/>
+      <w:lvlText w:val=""/>
+      <w:lvlJc w:val="left"/>
+      <w:pPr>
+        <w:tabs>
+          <w:tab w:val="num" w:pos="4320"/>
+        </w:tabs>
+        <w:ind w:left="4320" w:hanging="360"/>
+      </w:pPr>
+      <w:rPr>
+        <w:rFonts w:ascii="Wingdings" w:hAnsi="Wingdings" w:hint="default"/>
+        <w:sz w:val="20"/>
+      </w:rPr>
+    </w:lvl>
+    <w:lvl w:ilvl="6" w:tentative="1">
+      <w:start w:val="1"/>
+      <w:numFmt w:val="bullet"/>
+      <w:lvlText w:val=""/>
+      <w:lvlJc w:val="left"/>
+      <w:pPr>
+        <w:tabs>
+          <w:tab w:val="num" w:pos="5040"/>
+        </w:tabs>
+        <w:ind w:left="5040" w:hanging="360"/>
+      </w:pPr>
+      <w:rPr>
+        <w:rFonts w:ascii="Wingdings" w:hAnsi="Wingdings" w:hint="default"/>
+        <w:sz w:val="20"/>
+      </w:rPr>
+    </w:lvl>
+    <w:lvl w:ilvl="7" w:tentative="1">
+      <w:start w:val="1"/>
+      <w:numFmt w:val="bullet"/>
+      <w:lvlText w:val=""/>
+      <w:lvlJc w:val="left"/>
+      <w:pPr>
+        <w:tabs>
+          <w:tab w:val="num" w:pos="5760"/>
+        </w:tabs>
+        <w:ind w:left="5760" w:hanging="360"/>
+      </w:pPr>
+      <w:rPr>
+        <w:rFonts w:ascii="Wingdings" w:hAnsi="Wingdings" w:hint="default"/>
+        <w:sz w:val="20"/>
+      </w:rPr>
+    </w:lvl>
+    <w:lvl w:ilvl="8" w:tentative="1">
+      <w:start w:val="1"/>
+      <w:numFmt w:val="bullet"/>
+      <w:lvlText w:val=""/>
+      <w:lvlJc w:val="left"/>
+      <w:pPr>
+        <w:tabs>
+          <w:tab w:val="num" w:pos="6480"/>
+        </w:tabs>
+        <w:ind w:left="6480" w:hanging="360"/>
+      </w:pPr>
+      <w:rPr>
+        <w:rFonts w:ascii="Wingdings" w:hAnsi="Wingdings" w:hint="default"/>
+        <w:sz w:val="20"/>
+      </w:rPr>
+    </w:lvl>
+  </w:abstractNum>
+  <w:abstractNum w:abstractNumId="11" w15:restartNumberingAfterBreak="0">
+    <w:nsid w:val="56B65D32"/>
+    <w:multiLevelType w:val="multilevel"/>
+    <w:tmpl w:val="48BCC84C"/>
+    <w:lvl w:ilvl="0">
+      <w:start w:val="1"/>
+      <w:numFmt w:val="bullet"/>
+      <w:lvlText w:val=""/>
+      <w:lvlJc w:val="left"/>
+      <w:pPr>
+        <w:tabs>
+          <w:tab w:val="num" w:pos="720"/>
+        </w:tabs>
+        <w:ind w:left="720" w:hanging="360"/>
+      </w:pPr>
+      <w:rPr>
+        <w:rFonts w:ascii="Symbol" w:hAnsi="Symbol" w:hint="default"/>
+        <w:sz w:val="20"/>
+      </w:rPr>
+    </w:lvl>
+    <w:lvl w:ilvl="1" w:tentative="1">
+      <w:start w:val="1"/>
+      <w:numFmt w:val="bullet"/>
+      <w:lvlText w:val="o"/>
+      <w:lvlJc w:val="left"/>
+      <w:pPr>
+        <w:tabs>
+          <w:tab w:val="num" w:pos="1440"/>
+        </w:tabs>
+        <w:ind w:left="1440" w:hanging="360"/>
+      </w:pPr>
+      <w:rPr>
+        <w:rFonts w:ascii="Courier New" w:hAnsi="Courier New" w:hint="default"/>
+        <w:sz w:val="20"/>
+      </w:rPr>
+    </w:lvl>
+    <w:lvl w:ilvl="2" w:tentative="1">
+      <w:start w:val="1"/>
+      <w:numFmt w:val="bullet"/>
+      <w:lvlText w:val=""/>
+      <w:lvlJc w:val="left"/>
+      <w:pPr>
+        <w:tabs>
+          <w:tab w:val="num" w:pos="2160"/>
+        </w:tabs>
+        <w:ind w:left="2160" w:hanging="360"/>
+      </w:pPr>
+      <w:rPr>
+        <w:rFonts w:ascii="Wingdings" w:hAnsi="Wingdings" w:hint="default"/>
+        <w:sz w:val="20"/>
+      </w:rPr>
+    </w:lvl>
+    <w:lvl w:ilvl="3" w:tentative="1">
+      <w:start w:val="1"/>
+      <w:numFmt w:val="bullet"/>
+      <w:lvlText w:val=""/>
+      <w:lvlJc w:val="left"/>
+      <w:pPr>
+        <w:tabs>
+          <w:tab w:val="num" w:pos="2880"/>
+        </w:tabs>
+        <w:ind w:left="2880" w:hanging="360"/>
+      </w:pPr>
+      <w:rPr>
+        <w:rFonts w:ascii="Wingdings" w:hAnsi="Wingdings" w:hint="default"/>
+        <w:sz w:val="20"/>
+      </w:rPr>
+    </w:lvl>
+    <w:lvl w:ilvl="4" w:tentative="1">
+      <w:start w:val="1"/>
+      <w:numFmt w:val="bullet"/>
+      <w:lvlText w:val=""/>
+      <w:lvlJc w:val="left"/>
+      <w:pPr>
+        <w:tabs>
+          <w:tab w:val="num" w:pos="3600"/>
+        </w:tabs>
+        <w:ind w:left="3600" w:hanging="360"/>
+      </w:pPr>
+      <w:rPr>
+        <w:rFonts w:ascii="Wingdings" w:hAnsi="Wingdings" w:hint="default"/>
+        <w:sz w:val="20"/>
+      </w:rPr>
+    </w:lvl>
+    <w:lvl w:ilvl="5" w:tentative="1">
+      <w:start w:val="1"/>
+      <w:numFmt w:val="bullet"/>
+      <w:lvlText w:val=""/>
+      <w:lvlJc w:val="left"/>
+      <w:pPr>
+        <w:tabs>
+          <w:tab w:val="num" w:pos="4320"/>
+        </w:tabs>
+        <w:ind w:left="4320" w:hanging="360"/>
+      </w:pPr>
+      <w:rPr>
+        <w:rFonts w:ascii="Wingdings" w:hAnsi="Wingdings" w:hint="default"/>
+        <w:sz w:val="20"/>
+      </w:rPr>
+    </w:lvl>
+    <w:lvl w:ilvl="6" w:tentative="1">
+      <w:start w:val="1"/>
+      <w:numFmt w:val="bullet"/>
+      <w:lvlText w:val=""/>
+      <w:lvlJc w:val="left"/>
+      <w:pPr>
+        <w:tabs>
+          <w:tab w:val="num" w:pos="5040"/>
+        </w:tabs>
+        <w:ind w:left="5040" w:hanging="360"/>
+      </w:pPr>
+      <w:rPr>
+        <w:rFonts w:ascii="Wingdings" w:hAnsi="Wingdings" w:hint="default"/>
+        <w:sz w:val="20"/>
+      </w:rPr>
+    </w:lvl>
+    <w:lvl w:ilvl="7" w:tentative="1">
+      <w:start w:val="1"/>
+      <w:numFmt w:val="bullet"/>
+      <w:lvlText w:val=""/>
+      <w:lvlJc w:val="left"/>
+      <w:pPr>
+        <w:tabs>
+          <w:tab w:val="num" w:pos="5760"/>
+        </w:tabs>
+        <w:ind w:left="5760" w:hanging="360"/>
+      </w:pPr>
+      <w:rPr>
+        <w:rFonts w:ascii="Wingdings" w:hAnsi="Wingdings" w:hint="default"/>
+        <w:sz w:val="20"/>
+      </w:rPr>
+    </w:lvl>
+    <w:lvl w:ilvl="8" w:tentative="1">
+      <w:start w:val="1"/>
+      <w:numFmt w:val="bullet"/>
+      <w:lvlText w:val=""/>
+      <w:lvlJc w:val="left"/>
+      <w:pPr>
+        <w:tabs>
+          <w:tab w:val="num" w:pos="6480"/>
+        </w:tabs>
+        <w:ind w:left="6480" w:hanging="360"/>
+      </w:pPr>
+      <w:rPr>
+        <w:rFonts w:ascii="Wingdings" w:hAnsi="Wingdings" w:hint="default"/>
+        <w:sz w:val="20"/>
+      </w:rPr>
+    </w:lvl>
+  </w:abstractNum>
+  <w:abstractNum w:abstractNumId="12" w15:restartNumberingAfterBreak="0">
     <w:nsid w:val="60B36B2E"/>
     <w:multiLevelType w:val="hybridMultilevel"/>
     <w:tmpl w:val="8E5E3328"/>
@@ -1549,7 +4543,305 @@
       </w:pPr>
     </w:lvl>
   </w:abstractNum>
-  <w:abstractNum w:abstractNumId="4" w15:restartNumberingAfterBreak="0">
+  <w:abstractNum w:abstractNumId="13" w15:restartNumberingAfterBreak="0">
+    <w:nsid w:val="63CD7D00"/>
+    <w:multiLevelType w:val="multilevel"/>
+    <w:tmpl w:val="5C8E2ED8"/>
+    <w:lvl w:ilvl="0">
+      <w:start w:val="1"/>
+      <w:numFmt w:val="bullet"/>
+      <w:lvlText w:val=""/>
+      <w:lvlJc w:val="left"/>
+      <w:pPr>
+        <w:tabs>
+          <w:tab w:val="num" w:pos="720"/>
+        </w:tabs>
+        <w:ind w:left="720" w:hanging="360"/>
+      </w:pPr>
+      <w:rPr>
+        <w:rFonts w:ascii="Symbol" w:hAnsi="Symbol" w:hint="default"/>
+        <w:sz w:val="20"/>
+      </w:rPr>
+    </w:lvl>
+    <w:lvl w:ilvl="1" w:tentative="1">
+      <w:start w:val="1"/>
+      <w:numFmt w:val="bullet"/>
+      <w:lvlText w:val="o"/>
+      <w:lvlJc w:val="left"/>
+      <w:pPr>
+        <w:tabs>
+          <w:tab w:val="num" w:pos="1440"/>
+        </w:tabs>
+        <w:ind w:left="1440" w:hanging="360"/>
+      </w:pPr>
+      <w:rPr>
+        <w:rFonts w:ascii="Courier New" w:hAnsi="Courier New" w:hint="default"/>
+        <w:sz w:val="20"/>
+      </w:rPr>
+    </w:lvl>
+    <w:lvl w:ilvl="2" w:tentative="1">
+      <w:start w:val="1"/>
+      <w:numFmt w:val="bullet"/>
+      <w:lvlText w:val=""/>
+      <w:lvlJc w:val="left"/>
+      <w:pPr>
+        <w:tabs>
+          <w:tab w:val="num" w:pos="2160"/>
+        </w:tabs>
+        <w:ind w:left="2160" w:hanging="360"/>
+      </w:pPr>
+      <w:rPr>
+        <w:rFonts w:ascii="Wingdings" w:hAnsi="Wingdings" w:hint="default"/>
+        <w:sz w:val="20"/>
+      </w:rPr>
+    </w:lvl>
+    <w:lvl w:ilvl="3" w:tentative="1">
+      <w:start w:val="1"/>
+      <w:numFmt w:val="bullet"/>
+      <w:lvlText w:val=""/>
+      <w:lvlJc w:val="left"/>
+      <w:pPr>
+        <w:tabs>
+          <w:tab w:val="num" w:pos="2880"/>
+        </w:tabs>
+        <w:ind w:left="2880" w:hanging="360"/>
+      </w:pPr>
+      <w:rPr>
+        <w:rFonts w:ascii="Wingdings" w:hAnsi="Wingdings" w:hint="default"/>
+        <w:sz w:val="20"/>
+      </w:rPr>
+    </w:lvl>
+    <w:lvl w:ilvl="4" w:tentative="1">
+      <w:start w:val="1"/>
+      <w:numFmt w:val="bullet"/>
+      <w:lvlText w:val=""/>
+      <w:lvlJc w:val="left"/>
+      <w:pPr>
+        <w:tabs>
+          <w:tab w:val="num" w:pos="3600"/>
+        </w:tabs>
+        <w:ind w:left="3600" w:hanging="360"/>
+      </w:pPr>
+      <w:rPr>
+        <w:rFonts w:ascii="Wingdings" w:hAnsi="Wingdings" w:hint="default"/>
+        <w:sz w:val="20"/>
+      </w:rPr>
+    </w:lvl>
+    <w:lvl w:ilvl="5" w:tentative="1">
+      <w:start w:val="1"/>
+      <w:numFmt w:val="bullet"/>
+      <w:lvlText w:val=""/>
+      <w:lvlJc w:val="left"/>
+      <w:pPr>
+        <w:tabs>
+          <w:tab w:val="num" w:pos="4320"/>
+        </w:tabs>
+        <w:ind w:left="4320" w:hanging="360"/>
+      </w:pPr>
+      <w:rPr>
+        <w:rFonts w:ascii="Wingdings" w:hAnsi="Wingdings" w:hint="default"/>
+        <w:sz w:val="20"/>
+      </w:rPr>
+    </w:lvl>
+    <w:lvl w:ilvl="6" w:tentative="1">
+      <w:start w:val="1"/>
+      <w:numFmt w:val="bullet"/>
+      <w:lvlText w:val=""/>
+      <w:lvlJc w:val="left"/>
+      <w:pPr>
+        <w:tabs>
+          <w:tab w:val="num" w:pos="5040"/>
+        </w:tabs>
+        <w:ind w:left="5040" w:hanging="360"/>
+      </w:pPr>
+      <w:rPr>
+        <w:rFonts w:ascii="Wingdings" w:hAnsi="Wingdings" w:hint="default"/>
+        <w:sz w:val="20"/>
+      </w:rPr>
+    </w:lvl>
+    <w:lvl w:ilvl="7" w:tentative="1">
+      <w:start w:val="1"/>
+      <w:numFmt w:val="bullet"/>
+      <w:lvlText w:val=""/>
+      <w:lvlJc w:val="left"/>
+      <w:pPr>
+        <w:tabs>
+          <w:tab w:val="num" w:pos="5760"/>
+        </w:tabs>
+        <w:ind w:left="5760" w:hanging="360"/>
+      </w:pPr>
+      <w:rPr>
+        <w:rFonts w:ascii="Wingdings" w:hAnsi="Wingdings" w:hint="default"/>
+        <w:sz w:val="20"/>
+      </w:rPr>
+    </w:lvl>
+    <w:lvl w:ilvl="8" w:tentative="1">
+      <w:start w:val="1"/>
+      <w:numFmt w:val="bullet"/>
+      <w:lvlText w:val=""/>
+      <w:lvlJc w:val="left"/>
+      <w:pPr>
+        <w:tabs>
+          <w:tab w:val="num" w:pos="6480"/>
+        </w:tabs>
+        <w:ind w:left="6480" w:hanging="360"/>
+      </w:pPr>
+      <w:rPr>
+        <w:rFonts w:ascii="Wingdings" w:hAnsi="Wingdings" w:hint="default"/>
+        <w:sz w:val="20"/>
+      </w:rPr>
+    </w:lvl>
+  </w:abstractNum>
+  <w:abstractNum w:abstractNumId="14" w15:restartNumberingAfterBreak="0">
+    <w:nsid w:val="6AF74D27"/>
+    <w:multiLevelType w:val="multilevel"/>
+    <w:tmpl w:val="48125EF8"/>
+    <w:lvl w:ilvl="0">
+      <w:start w:val="1"/>
+      <w:numFmt w:val="bullet"/>
+      <w:lvlText w:val=""/>
+      <w:lvlJc w:val="left"/>
+      <w:pPr>
+        <w:tabs>
+          <w:tab w:val="num" w:pos="720"/>
+        </w:tabs>
+        <w:ind w:left="720" w:hanging="360"/>
+      </w:pPr>
+      <w:rPr>
+        <w:rFonts w:ascii="Symbol" w:hAnsi="Symbol" w:hint="default"/>
+        <w:sz w:val="20"/>
+      </w:rPr>
+    </w:lvl>
+    <w:lvl w:ilvl="1" w:tentative="1">
+      <w:start w:val="1"/>
+      <w:numFmt w:val="bullet"/>
+      <w:lvlText w:val="o"/>
+      <w:lvlJc w:val="left"/>
+      <w:pPr>
+        <w:tabs>
+          <w:tab w:val="num" w:pos="1440"/>
+        </w:tabs>
+        <w:ind w:left="1440" w:hanging="360"/>
+      </w:pPr>
+      <w:rPr>
+        <w:rFonts w:ascii="Courier New" w:hAnsi="Courier New" w:hint="default"/>
+        <w:sz w:val="20"/>
+      </w:rPr>
+    </w:lvl>
+    <w:lvl w:ilvl="2" w:tentative="1">
+      <w:start w:val="1"/>
+      <w:numFmt w:val="bullet"/>
+      <w:lvlText w:val=""/>
+      <w:lvlJc w:val="left"/>
+      <w:pPr>
+        <w:tabs>
+          <w:tab w:val="num" w:pos="2160"/>
+        </w:tabs>
+        <w:ind w:left="2160" w:hanging="360"/>
+      </w:pPr>
+      <w:rPr>
+        <w:rFonts w:ascii="Wingdings" w:hAnsi="Wingdings" w:hint="default"/>
+        <w:sz w:val="20"/>
+      </w:rPr>
+    </w:lvl>
+    <w:lvl w:ilvl="3" w:tentative="1">
+      <w:start w:val="1"/>
+      <w:numFmt w:val="bullet"/>
+      <w:lvlText w:val=""/>
+      <w:lvlJc w:val="left"/>
+      <w:pPr>
+        <w:tabs>
+          <w:tab w:val="num" w:pos="2880"/>
+        </w:tabs>
+        <w:ind w:left="2880" w:hanging="360"/>
+      </w:pPr>
+      <w:rPr>
+        <w:rFonts w:ascii="Wingdings" w:hAnsi="Wingdings" w:hint="default"/>
+        <w:sz w:val="20"/>
+      </w:rPr>
+    </w:lvl>
+    <w:lvl w:ilvl="4" w:tentative="1">
+      <w:start w:val="1"/>
+      <w:numFmt w:val="bullet"/>
+      <w:lvlText w:val=""/>
+      <w:lvlJc w:val="left"/>
+      <w:pPr>
+        <w:tabs>
+          <w:tab w:val="num" w:pos="3600"/>
+        </w:tabs>
+        <w:ind w:left="3600" w:hanging="360"/>
+      </w:pPr>
+      <w:rPr>
+        <w:rFonts w:ascii="Wingdings" w:hAnsi="Wingdings" w:hint="default"/>
+        <w:sz w:val="20"/>
+      </w:rPr>
+    </w:lvl>
+    <w:lvl w:ilvl="5" w:tentative="1">
+      <w:start w:val="1"/>
+      <w:numFmt w:val="bullet"/>
+      <w:lvlText w:val=""/>
+      <w:lvlJc w:val="left"/>
+      <w:pPr>
+        <w:tabs>
+          <w:tab w:val="num" w:pos="4320"/>
+        </w:tabs>
+        <w:ind w:left="4320" w:hanging="360"/>
+      </w:pPr>
+      <w:rPr>
+        <w:rFonts w:ascii="Wingdings" w:hAnsi="Wingdings" w:hint="default"/>
+        <w:sz w:val="20"/>
+      </w:rPr>
+    </w:lvl>
+    <w:lvl w:ilvl="6" w:tentative="1">
+      <w:start w:val="1"/>
+      <w:numFmt w:val="bullet"/>
+      <w:lvlText w:val=""/>
+      <w:lvlJc w:val="left"/>
+      <w:pPr>
+        <w:tabs>
+          <w:tab w:val="num" w:pos="5040"/>
+        </w:tabs>
+        <w:ind w:left="5040" w:hanging="360"/>
+      </w:pPr>
+      <w:rPr>
+        <w:rFonts w:ascii="Wingdings" w:hAnsi="Wingdings" w:hint="default"/>
+        <w:sz w:val="20"/>
+      </w:rPr>
+    </w:lvl>
+    <w:lvl w:ilvl="7" w:tentative="1">
+      <w:start w:val="1"/>
+      <w:numFmt w:val="bullet"/>
+      <w:lvlText w:val=""/>
+      <w:lvlJc w:val="left"/>
+      <w:pPr>
+        <w:tabs>
+          <w:tab w:val="num" w:pos="5760"/>
+        </w:tabs>
+        <w:ind w:left="5760" w:hanging="360"/>
+      </w:pPr>
+      <w:rPr>
+        <w:rFonts w:ascii="Wingdings" w:hAnsi="Wingdings" w:hint="default"/>
+        <w:sz w:val="20"/>
+      </w:rPr>
+    </w:lvl>
+    <w:lvl w:ilvl="8" w:tentative="1">
+      <w:start w:val="1"/>
+      <w:numFmt w:val="bullet"/>
+      <w:lvlText w:val=""/>
+      <w:lvlJc w:val="left"/>
+      <w:pPr>
+        <w:tabs>
+          <w:tab w:val="num" w:pos="6480"/>
+        </w:tabs>
+        <w:ind w:left="6480" w:hanging="360"/>
+      </w:pPr>
+      <w:rPr>
+        <w:rFonts w:ascii="Wingdings" w:hAnsi="Wingdings" w:hint="default"/>
+        <w:sz w:val="20"/>
+      </w:rPr>
+    </w:lvl>
+  </w:abstractNum>
+  <w:abstractNum w:abstractNumId="15" w15:restartNumberingAfterBreak="0">
     <w:nsid w:val="6B77074E"/>
     <w:multiLevelType w:val="hybridMultilevel"/>
     <w:tmpl w:val="7A5C9772"/>
@@ -1638,7 +4930,156 @@
       </w:pPr>
     </w:lvl>
   </w:abstractNum>
-  <w:abstractNum w:abstractNumId="5" w15:restartNumberingAfterBreak="0">
+  <w:abstractNum w:abstractNumId="16" w15:restartNumberingAfterBreak="0">
+    <w:nsid w:val="6FF72081"/>
+    <w:multiLevelType w:val="multilevel"/>
+    <w:tmpl w:val="5026297A"/>
+    <w:lvl w:ilvl="0">
+      <w:start w:val="1"/>
+      <w:numFmt w:val="bullet"/>
+      <w:lvlText w:val=""/>
+      <w:lvlJc w:val="left"/>
+      <w:pPr>
+        <w:tabs>
+          <w:tab w:val="num" w:pos="720"/>
+        </w:tabs>
+        <w:ind w:left="720" w:hanging="360"/>
+      </w:pPr>
+      <w:rPr>
+        <w:rFonts w:ascii="Symbol" w:hAnsi="Symbol" w:hint="default"/>
+        <w:sz w:val="20"/>
+      </w:rPr>
+    </w:lvl>
+    <w:lvl w:ilvl="1" w:tentative="1">
+      <w:start w:val="1"/>
+      <w:numFmt w:val="bullet"/>
+      <w:lvlText w:val="o"/>
+      <w:lvlJc w:val="left"/>
+      <w:pPr>
+        <w:tabs>
+          <w:tab w:val="num" w:pos="1440"/>
+        </w:tabs>
+        <w:ind w:left="1440" w:hanging="360"/>
+      </w:pPr>
+      <w:rPr>
+        <w:rFonts w:ascii="Courier New" w:hAnsi="Courier New" w:hint="default"/>
+        <w:sz w:val="20"/>
+      </w:rPr>
+    </w:lvl>
+    <w:lvl w:ilvl="2" w:tentative="1">
+      <w:start w:val="1"/>
+      <w:numFmt w:val="bullet"/>
+      <w:lvlText w:val=""/>
+      <w:lvlJc w:val="left"/>
+      <w:pPr>
+        <w:tabs>
+          <w:tab w:val="num" w:pos="2160"/>
+        </w:tabs>
+        <w:ind w:left="2160" w:hanging="360"/>
+      </w:pPr>
+      <w:rPr>
+        <w:rFonts w:ascii="Wingdings" w:hAnsi="Wingdings" w:hint="default"/>
+        <w:sz w:val="20"/>
+      </w:rPr>
+    </w:lvl>
+    <w:lvl w:ilvl="3" w:tentative="1">
+      <w:start w:val="1"/>
+      <w:numFmt w:val="bullet"/>
+      <w:lvlText w:val=""/>
+      <w:lvlJc w:val="left"/>
+      <w:pPr>
+        <w:tabs>
+          <w:tab w:val="num" w:pos="2880"/>
+        </w:tabs>
+        <w:ind w:left="2880" w:hanging="360"/>
+      </w:pPr>
+      <w:rPr>
+        <w:rFonts w:ascii="Wingdings" w:hAnsi="Wingdings" w:hint="default"/>
+        <w:sz w:val="20"/>
+      </w:rPr>
+    </w:lvl>
+    <w:lvl w:ilvl="4" w:tentative="1">
+      <w:start w:val="1"/>
+      <w:numFmt w:val="bullet"/>
+      <w:lvlText w:val=""/>
+      <w:lvlJc w:val="left"/>
+      <w:pPr>
+        <w:tabs>
+          <w:tab w:val="num" w:pos="3600"/>
+        </w:tabs>
+        <w:ind w:left="3600" w:hanging="360"/>
+      </w:pPr>
+      <w:rPr>
+        <w:rFonts w:ascii="Wingdings" w:hAnsi="Wingdings" w:hint="default"/>
+        <w:sz w:val="20"/>
+      </w:rPr>
+    </w:lvl>
+    <w:lvl w:ilvl="5" w:tentative="1">
+      <w:start w:val="1"/>
+      <w:numFmt w:val="bullet"/>
+      <w:lvlText w:val=""/>
+      <w:lvlJc w:val="left"/>
+      <w:pPr>
+        <w:tabs>
+          <w:tab w:val="num" w:pos="4320"/>
+        </w:tabs>
+        <w:ind w:left="4320" w:hanging="360"/>
+      </w:pPr>
+      <w:rPr>
+        <w:rFonts w:ascii="Wingdings" w:hAnsi="Wingdings" w:hint="default"/>
+        <w:sz w:val="20"/>
+      </w:rPr>
+    </w:lvl>
+    <w:lvl w:ilvl="6" w:tentative="1">
+      <w:start w:val="1"/>
+      <w:numFmt w:val="bullet"/>
+      <w:lvlText w:val=""/>
+      <w:lvlJc w:val="left"/>
+      <w:pPr>
+        <w:tabs>
+          <w:tab w:val="num" w:pos="5040"/>
+        </w:tabs>
+        <w:ind w:left="5040" w:hanging="360"/>
+      </w:pPr>
+      <w:rPr>
+        <w:rFonts w:ascii="Wingdings" w:hAnsi="Wingdings" w:hint="default"/>
+        <w:sz w:val="20"/>
+      </w:rPr>
+    </w:lvl>
+    <w:lvl w:ilvl="7" w:tentative="1">
+      <w:start w:val="1"/>
+      <w:numFmt w:val="bullet"/>
+      <w:lvlText w:val=""/>
+      <w:lvlJc w:val="left"/>
+      <w:pPr>
+        <w:tabs>
+          <w:tab w:val="num" w:pos="5760"/>
+        </w:tabs>
+        <w:ind w:left="5760" w:hanging="360"/>
+      </w:pPr>
+      <w:rPr>
+        <w:rFonts w:ascii="Wingdings" w:hAnsi="Wingdings" w:hint="default"/>
+        <w:sz w:val="20"/>
+      </w:rPr>
+    </w:lvl>
+    <w:lvl w:ilvl="8" w:tentative="1">
+      <w:start w:val="1"/>
+      <w:numFmt w:val="bullet"/>
+      <w:lvlText w:val=""/>
+      <w:lvlJc w:val="left"/>
+      <w:pPr>
+        <w:tabs>
+          <w:tab w:val="num" w:pos="6480"/>
+        </w:tabs>
+        <w:ind w:left="6480" w:hanging="360"/>
+      </w:pPr>
+      <w:rPr>
+        <w:rFonts w:ascii="Wingdings" w:hAnsi="Wingdings" w:hint="default"/>
+        <w:sz w:val="20"/>
+      </w:rPr>
+    </w:lvl>
+  </w:abstractNum>
+  <w:abstractNum w:abstractNumId="17" w15:restartNumberingAfterBreak="0">
     <w:nsid w:val="7AA843DD"/>
     <w:multiLevelType w:val="hybridMultilevel"/>
     <w:tmpl w:val="5C12A5DA"/>
@@ -1728,22 +5169,58 @@
     </w:lvl>
   </w:abstractNum>
   <w:num w:numId="1" w16cid:durableId="664934734">
+    <w:abstractNumId w:val="8"/>
+  </w:num>
+  <w:num w:numId="2" w16cid:durableId="706758807">
+    <w:abstractNumId w:val="6"/>
+  </w:num>
+  <w:num w:numId="3" w16cid:durableId="1807972047">
+    <w:abstractNumId w:val="15"/>
+  </w:num>
+  <w:num w:numId="4" w16cid:durableId="1406730771">
+    <w:abstractNumId w:val="5"/>
+  </w:num>
+  <w:num w:numId="5" w16cid:durableId="63725701">
+    <w:abstractNumId w:val="17"/>
+  </w:num>
+  <w:num w:numId="6" w16cid:durableId="1108500060">
+    <w:abstractNumId w:val="12"/>
+  </w:num>
+  <w:num w:numId="7" w16cid:durableId="1934432317">
+    <w:abstractNumId w:val="0"/>
+  </w:num>
+  <w:num w:numId="8" w16cid:durableId="1380590915">
+    <w:abstractNumId w:val="13"/>
+  </w:num>
+  <w:num w:numId="9" w16cid:durableId="208955879">
+    <w:abstractNumId w:val="4"/>
+  </w:num>
+  <w:num w:numId="10" w16cid:durableId="1174107923">
+    <w:abstractNumId w:val="3"/>
+  </w:num>
+  <w:num w:numId="11" w16cid:durableId="994146575">
+    <w:abstractNumId w:val="10"/>
+  </w:num>
+  <w:num w:numId="12" w16cid:durableId="1835952565">
+    <w:abstractNumId w:val="14"/>
+  </w:num>
+  <w:num w:numId="13" w16cid:durableId="610599663">
+    <w:abstractNumId w:val="1"/>
+  </w:num>
+  <w:num w:numId="14" w16cid:durableId="982931535">
+    <w:abstractNumId w:val="7"/>
+  </w:num>
+  <w:num w:numId="15" w16cid:durableId="15279351">
     <w:abstractNumId w:val="2"/>
   </w:num>
-  <w:num w:numId="2" w16cid:durableId="706758807">
-    <w:abstractNumId w:val="1"/>
+  <w:num w:numId="16" w16cid:durableId="1429425789">
+    <w:abstractNumId w:val="11"/>
   </w:num>
-  <w:num w:numId="3" w16cid:durableId="1807972047">
-    <w:abstractNumId w:val="4"/>
+  <w:num w:numId="17" w16cid:durableId="1134297695">
+    <w:abstractNumId w:val="16"/>
   </w:num>
-  <w:num w:numId="4" w16cid:durableId="1406730771">
-    <w:abstractNumId w:val="0"/>
-  </w:num>
-  <w:num w:numId="5" w16cid:durableId="63725701">
-    <w:abstractNumId w:val="5"/>
-  </w:num>
-  <w:num w:numId="6" w16cid:durableId="1108500060">
-    <w:abstractNumId w:val="3"/>
+  <w:num w:numId="18" w16cid:durableId="1579747112">
+    <w:abstractNumId w:val="9"/>
   </w:num>
 </w:numbering>
 </file>
@@ -2176,7 +5653,6 @@
     <w:next w:val="Normal"/>
     <w:link w:val="Heading2Char"/>
     <w:uiPriority w:val="9"/>
-    <w:semiHidden/>
     <w:unhideWhenUsed/>
     <w:qFormat/>
     <w:rsid w:val="008000F4"/>
@@ -2199,7 +5675,6 @@
     <w:next w:val="Normal"/>
     <w:link w:val="Heading3Char"/>
     <w:uiPriority w:val="9"/>
-    <w:semiHidden/>
     <w:unhideWhenUsed/>
     <w:qFormat/>
     <w:rsid w:val="008000F4"/>
@@ -2392,7 +5867,6 @@
     <w:basedOn w:val="DefaultParagraphFont"/>
     <w:link w:val="Heading2"/>
     <w:uiPriority w:val="9"/>
-    <w:semiHidden/>
     <w:rsid w:val="008000F4"/>
     <w:rPr>
       <w:rFonts w:asciiTheme="majorHAnsi" w:eastAsiaTheme="majorEastAsia" w:hAnsiTheme="majorHAnsi" w:cstheme="majorBidi"/>
@@ -2406,7 +5880,6 @@
     <w:basedOn w:val="DefaultParagraphFont"/>
     <w:link w:val="Heading3"/>
     <w:uiPriority w:val="9"/>
-    <w:semiHidden/>
     <w:rsid w:val="008000F4"/>
     <w:rPr>
       <w:rFonts w:eastAsiaTheme="majorEastAsia" w:cstheme="majorBidi"/>

</xml_diff>

<commit_message>
push current version of documentation
</commit_message>
<xml_diff>
--- a/Improving JB Platform Documentation.docx
+++ b/Improving JB Platform Documentation.docx
@@ -289,6 +289,7 @@
           <w:szCs w:val="40"/>
         </w:rPr>
       </w:pPr>
+      <w:proofErr w:type="spellStart"/>
       <w:r>
         <w:rPr>
           <w:b/>
@@ -308,6 +309,7 @@
         </w:rPr>
         <w:t>Introduction</w:t>
       </w:r>
+      <w:proofErr w:type="spellEnd"/>
     </w:p>
     <w:p>
       <w:pPr>
@@ -738,9 +740,11 @@
       <w:r>
         <w:t xml:space="preserve">This approach enables rapid experimentation while maintaining </w:t>
       </w:r>
+      <w:proofErr w:type="gramStart"/>
       <w:r>
         <w:t>an enjoyable</w:t>
       </w:r>
+      <w:proofErr w:type="gramEnd"/>
       <w:r>
         <w:t xml:space="preserve"> user experience. Features are prioritized based on their potential impact on user engagement, platform growth, and overall ecosystem value.</w:t>
       </w:r>
@@ -927,8 +931,13 @@
         <w:pStyle w:val="NormalWeb"/>
       </w:pPr>
       <w:r>
-        <w:t>• Supabase</w:t>
-      </w:r>
+        <w:t xml:space="preserve">• </w:t>
+      </w:r>
+      <w:proofErr w:type="spellStart"/>
+      <w:r>
+        <w:t>Supabase</w:t>
+      </w:r>
+      <w:proofErr w:type="spellEnd"/>
       <w:r>
         <w:br/>
         <w:t>• PostgreSQL</w:t>
@@ -955,8 +964,13 @@
         <w:pStyle w:val="NormalWeb"/>
       </w:pPr>
       <w:r>
-        <w:t>• Vercel</w:t>
-      </w:r>
+        <w:t xml:space="preserve">• </w:t>
+      </w:r>
+      <w:proofErr w:type="spellStart"/>
+      <w:r>
+        <w:t>Vercel</w:t>
+      </w:r>
+      <w:proofErr w:type="spellEnd"/>
       <w:r>
         <w:br/>
         <w:t>• Railway</w:t>
@@ -1254,7 +1268,13 @@
         </w:tabs>
       </w:pPr>
       <w:r>
-        <w:t>The Improving JB platform follows a modern full-stack architecture consisting of a React frontend, Express backend, OpenAI integration layer, analytics services, newsletter infrastructure, and future community functionality.</w:t>
+        <w:t xml:space="preserve">The Improving JB platform follows a modern full-stack architecture </w:t>
+      </w:r>
+      <w:r>
+        <w:t>which consists</w:t>
+      </w:r>
+      <w:r>
+        <w:t xml:space="preserve"> of a React frontend, Express backend, OpenAI integration layer, analytics services, newsletter infrastructure, and future community functionality.</w:t>
       </w:r>
     </w:p>
     <w:p>
@@ -1316,7 +1336,10 @@
         <w:t xml:space="preserve">Separation of concerns between </w:t>
       </w:r>
       <w:r>
-        <w:t xml:space="preserve">visual </w:t>
+        <w:t>physical</w:t>
+      </w:r>
+      <w:r>
+        <w:t xml:space="preserve"> </w:t>
       </w:r>
       <w:r>
         <w:t xml:space="preserve">presentation, business logic, and data storage </w:t>
@@ -1353,7 +1376,7 @@
           <w:b/>
           <w:bCs/>
         </w:rPr>
-        <w:t>Figure 1: Improving JB Platform Architecture</w:t>
+        <w:t>Figure 1: Platform Architecture</w:t>
       </w:r>
     </w:p>
     <w:p>
@@ -1366,6 +1389,61 @@
           <w:bCs/>
         </w:rPr>
       </w:pPr>
+      <w:r>
+        <w:rPr>
+          <w:b/>
+          <w:bCs/>
+          <w:noProof/>
+        </w:rPr>
+        <w:drawing>
+          <wp:inline distT="0" distB="0" distL="0" distR="0" wp14:anchorId="79EA4059" wp14:editId="6C34EB5F">
+            <wp:extent cx="5943600" cy="2600325"/>
+            <wp:effectExtent l="0" t="0" r="0" b="9525"/>
+            <wp:docPr id="2047139400" name="Picture 2"/>
+            <wp:cNvGraphicFramePr>
+              <a:graphicFrameLocks xmlns:a="http://schemas.openxmlformats.org/drawingml/2006/main" noChangeAspect="1"/>
+            </wp:cNvGraphicFramePr>
+            <a:graphic xmlns:a="http://schemas.openxmlformats.org/drawingml/2006/main">
+              <a:graphicData uri="http://schemas.openxmlformats.org/drawingml/2006/picture">
+                <pic:pic xmlns:pic="http://schemas.openxmlformats.org/drawingml/2006/picture">
+                  <pic:nvPicPr>
+                    <pic:cNvPr id="0" name="Picture 2"/>
+                    <pic:cNvPicPr>
+                      <a:picLocks noChangeAspect="1" noChangeArrowheads="1"/>
+                    </pic:cNvPicPr>
+                  </pic:nvPicPr>
+                  <pic:blipFill>
+                    <a:blip r:embed="rId8">
+                      <a:extLst>
+                        <a:ext uri="{28A0092B-C50C-407E-A947-70E740481C1C}">
+                          <a14:useLocalDpi xmlns:a14="http://schemas.microsoft.com/office/drawing/2010/main" val="0"/>
+                        </a:ext>
+                      </a:extLst>
+                    </a:blip>
+                    <a:srcRect/>
+                    <a:stretch>
+                      <a:fillRect/>
+                    </a:stretch>
+                  </pic:blipFill>
+                  <pic:spPr bwMode="auto">
+                    <a:xfrm>
+                      <a:off x="0" y="0"/>
+                      <a:ext cx="5943600" cy="2600325"/>
+                    </a:xfrm>
+                    <a:prstGeom prst="rect">
+                      <a:avLst/>
+                    </a:prstGeom>
+                    <a:noFill/>
+                    <a:ln>
+                      <a:noFill/>
+                    </a:ln>
+                  </pic:spPr>
+                </pic:pic>
+              </a:graphicData>
+            </a:graphic>
+          </wp:inline>
+        </w:drawing>
+      </w:r>
     </w:p>
     <w:p>
       <w:pPr>
@@ -1384,7 +1462,13 @@
         </w:tabs>
       </w:pPr>
       <w:r>
-        <w:t>The frontend is responsible for presenting all user-facing functionality and serves as the primary interaction layer of the platform.</w:t>
+        <w:t>The frontend is responsible for presenting all user-facing functionality and serves as the primary interaction layer o</w:t>
+      </w:r>
+      <w:r>
+        <w:t>n</w:t>
+      </w:r>
+      <w:r>
+        <w:t xml:space="preserve"> the platform.</w:t>
       </w:r>
     </w:p>
     <w:p>
@@ -1516,6 +1600,7 @@
         </w:tabs>
       </w:pPr>
       <w:r>
+        <w:lastRenderedPageBreak/>
         <w:t xml:space="preserve">Newsletter signup </w:t>
       </w:r>
     </w:p>
@@ -1603,7 +1688,6 @@
         </w:tabs>
       </w:pPr>
       <w:r>
-        <w:lastRenderedPageBreak/>
         <w:t xml:space="preserve">Home </w:t>
       </w:r>
     </w:p>
@@ -1675,8 +1759,89 @@
         <w:tabs>
           <w:tab w:val="left" w:pos="6530"/>
         </w:tabs>
-      </w:pPr>
-      <w:r>
+        <w:rPr>
+          <w:b/>
+          <w:bCs/>
+        </w:rPr>
+      </w:pPr>
+      <w:r>
+        <w:rPr>
+          <w:b/>
+          <w:bCs/>
+        </w:rPr>
+        <w:t>Figure 2: Website Navigation</w:t>
+      </w:r>
+    </w:p>
+    <w:p>
+      <w:pPr>
+        <w:tabs>
+          <w:tab w:val="left" w:pos="6530"/>
+        </w:tabs>
+      </w:pPr>
+      <w:r>
+        <w:rPr>
+          <w:b/>
+          <w:bCs/>
+          <w:noProof/>
+        </w:rPr>
+        <w:drawing>
+          <wp:inline distT="0" distB="0" distL="0" distR="0" wp14:anchorId="0BBD64DC" wp14:editId="0271F822">
+            <wp:extent cx="5943600" cy="3267075"/>
+            <wp:effectExtent l="0" t="0" r="0" b="9525"/>
+            <wp:docPr id="1387262183" name="Picture 1"/>
+            <wp:cNvGraphicFramePr>
+              <a:graphicFrameLocks xmlns:a="http://schemas.openxmlformats.org/drawingml/2006/main" noChangeAspect="1"/>
+            </wp:cNvGraphicFramePr>
+            <a:graphic xmlns:a="http://schemas.openxmlformats.org/drawingml/2006/main">
+              <a:graphicData uri="http://schemas.openxmlformats.org/drawingml/2006/picture">
+                <pic:pic xmlns:pic="http://schemas.openxmlformats.org/drawingml/2006/picture">
+                  <pic:nvPicPr>
+                    <pic:cNvPr id="0" name="Picture 1"/>
+                    <pic:cNvPicPr>
+                      <a:picLocks noChangeAspect="1" noChangeArrowheads="1"/>
+                    </pic:cNvPicPr>
+                  </pic:nvPicPr>
+                  <pic:blipFill>
+                    <a:blip r:embed="rId9">
+                      <a:extLst>
+                        <a:ext uri="{28A0092B-C50C-407E-A947-70E740481C1C}">
+                          <a14:useLocalDpi xmlns:a14="http://schemas.microsoft.com/office/drawing/2010/main" val="0"/>
+                        </a:ext>
+                      </a:extLst>
+                    </a:blip>
+                    <a:srcRect/>
+                    <a:stretch>
+                      <a:fillRect/>
+                    </a:stretch>
+                  </pic:blipFill>
+                  <pic:spPr bwMode="auto">
+                    <a:xfrm>
+                      <a:off x="0" y="0"/>
+                      <a:ext cx="5943600" cy="3267075"/>
+                    </a:xfrm>
+                    <a:prstGeom prst="rect">
+                      <a:avLst/>
+                    </a:prstGeom>
+                    <a:noFill/>
+                    <a:ln>
+                      <a:noFill/>
+                    </a:ln>
+                  </pic:spPr>
+                </pic:pic>
+              </a:graphicData>
+            </a:graphic>
+          </wp:inline>
+        </w:drawing>
+      </w:r>
+    </w:p>
+    <w:p>
+      <w:pPr>
+        <w:tabs>
+          <w:tab w:val="left" w:pos="6530"/>
+        </w:tabs>
+      </w:pPr>
+      <w:r>
+        <w:lastRenderedPageBreak/>
         <w:t>3.3 Backend Architecture</w:t>
       </w:r>
     </w:p>
@@ -1687,7 +1852,13 @@
         </w:tabs>
       </w:pPr>
       <w:r>
-        <w:t>The backend functions as the central processing layer for the platform.</w:t>
+        <w:t xml:space="preserve">The backend </w:t>
+      </w:r>
+      <w:r>
+        <w:t>work</w:t>
+      </w:r>
+      <w:r>
+        <w:t>s as the central processing layer for the platform.</w:t>
       </w:r>
     </w:p>
     <w:p>
@@ -1864,18 +2035,584 @@
         </w:tabs>
       </w:pPr>
       <w:r>
-        <w:t>One of the platform's primary features is the AI assistant "Bands."</w:t>
-      </w:r>
-    </w:p>
-    <w:p>
-      <w:pPr>
-        <w:tabs>
-          <w:tab w:val="left" w:pos="6530"/>
-        </w:tabs>
-      </w:pPr>
-      <w:r>
-        <w:t>Unlike traditional AI assistants, Bands was intentionally designed to function as a website guide rather than a personal coach.</w:t>
-      </w:r>
+        <w:t>One of the platform's primary features is the AI assistant "Bands"</w:t>
+      </w:r>
+      <w:r>
+        <w:t xml:space="preserve"> AKA the stickman </w:t>
+      </w:r>
+      <w:r>
+        <w:t>all throughout the social media.</w:t>
+      </w:r>
+    </w:p>
+    <w:p>
+      <w:pPr>
+        <w:tabs>
+          <w:tab w:val="left" w:pos="6530"/>
+        </w:tabs>
+      </w:pPr>
+      <w:r>
+        <w:t xml:space="preserve">Bands </w:t>
+      </w:r>
+      <w:proofErr w:type="gramStart"/>
+      <w:r>
+        <w:t>was</w:t>
+      </w:r>
+      <w:proofErr w:type="gramEnd"/>
+      <w:r>
+        <w:t xml:space="preserve"> intentionally designed to function as a website guide rather than a personal coach</w:t>
+      </w:r>
+      <w:r>
+        <w:t>, due to future systems being held future responsibilities for that</w:t>
+      </w:r>
+      <w:r>
+        <w:t>.</w:t>
+      </w:r>
+    </w:p>
+    <w:p>
+      <w:pPr>
+        <w:tabs>
+          <w:tab w:val="left" w:pos="6530"/>
+        </w:tabs>
+        <w:rPr>
+          <w:b/>
+          <w:bCs/>
+        </w:rPr>
+      </w:pPr>
+      <w:r>
+        <w:rPr>
+          <w:b/>
+          <w:bCs/>
+        </w:rPr>
+        <w:t>Design Goals</w:t>
+      </w:r>
+    </w:p>
+    <w:p>
+      <w:pPr>
+        <w:numPr>
+          <w:ilvl w:val="0"/>
+          <w:numId w:val="14"/>
+        </w:numPr>
+        <w:tabs>
+          <w:tab w:val="left" w:pos="6530"/>
+        </w:tabs>
+      </w:pPr>
+      <w:r>
+        <w:t xml:space="preserve">Explain website features </w:t>
+      </w:r>
+    </w:p>
+    <w:p>
+      <w:pPr>
+        <w:numPr>
+          <w:ilvl w:val="0"/>
+          <w:numId w:val="14"/>
+        </w:numPr>
+        <w:tabs>
+          <w:tab w:val="left" w:pos="6530"/>
+        </w:tabs>
+      </w:pPr>
+      <w:r>
+        <w:t xml:space="preserve">Help users navigate the platform </w:t>
+      </w:r>
+    </w:p>
+    <w:p>
+      <w:pPr>
+        <w:numPr>
+          <w:ilvl w:val="0"/>
+          <w:numId w:val="14"/>
+        </w:numPr>
+        <w:tabs>
+          <w:tab w:val="left" w:pos="6530"/>
+        </w:tabs>
+      </w:pPr>
+      <w:r>
+        <w:t xml:space="preserve">Describe available systems </w:t>
+      </w:r>
+    </w:p>
+    <w:p>
+      <w:pPr>
+        <w:numPr>
+          <w:ilvl w:val="0"/>
+          <w:numId w:val="14"/>
+        </w:numPr>
+        <w:tabs>
+          <w:tab w:val="left" w:pos="6530"/>
+        </w:tabs>
+      </w:pPr>
+      <w:r>
+        <w:t xml:space="preserve">Explain YouTube content </w:t>
+      </w:r>
+    </w:p>
+    <w:p>
+      <w:pPr>
+        <w:numPr>
+          <w:ilvl w:val="0"/>
+          <w:numId w:val="14"/>
+        </w:numPr>
+        <w:tabs>
+          <w:tab w:val="left" w:pos="6530"/>
+        </w:tabs>
+      </w:pPr>
+      <w:r>
+        <w:lastRenderedPageBreak/>
+        <w:t>Introducing</w:t>
+      </w:r>
+      <w:r>
+        <w:t xml:space="preserve"> the Improving JB ecosystem </w:t>
+      </w:r>
+    </w:p>
+    <w:p>
+      <w:pPr>
+        <w:numPr>
+          <w:ilvl w:val="0"/>
+          <w:numId w:val="14"/>
+        </w:numPr>
+        <w:tabs>
+          <w:tab w:val="left" w:pos="6530"/>
+        </w:tabs>
+      </w:pPr>
+      <w:r>
+        <w:t>Give information about JB himself</w:t>
+      </w:r>
+    </w:p>
+    <w:p>
+      <w:pPr>
+        <w:tabs>
+          <w:tab w:val="left" w:pos="6530"/>
+        </w:tabs>
+      </w:pPr>
+      <w:r>
+        <w:t>The AI system uses contextual prompting to determine which knowledge source should be used when generating responses. Different prompt sets exist for:</w:t>
+      </w:r>
+    </w:p>
+    <w:p>
+      <w:pPr>
+        <w:numPr>
+          <w:ilvl w:val="0"/>
+          <w:numId w:val="15"/>
+        </w:numPr>
+        <w:tabs>
+          <w:tab w:val="left" w:pos="6530"/>
+        </w:tabs>
+      </w:pPr>
+      <w:r>
+        <w:t xml:space="preserve">Website Information </w:t>
+      </w:r>
+    </w:p>
+    <w:p>
+      <w:pPr>
+        <w:numPr>
+          <w:ilvl w:val="0"/>
+          <w:numId w:val="15"/>
+        </w:numPr>
+        <w:tabs>
+          <w:tab w:val="left" w:pos="6530"/>
+        </w:tabs>
+      </w:pPr>
+      <w:r>
+        <w:t xml:space="preserve">Systems &amp; Programs </w:t>
+      </w:r>
+    </w:p>
+    <w:p>
+      <w:pPr>
+        <w:numPr>
+          <w:ilvl w:val="0"/>
+          <w:numId w:val="15"/>
+        </w:numPr>
+        <w:tabs>
+          <w:tab w:val="left" w:pos="6530"/>
+        </w:tabs>
+      </w:pPr>
+      <w:r>
+        <w:t xml:space="preserve">YouTube Content </w:t>
+      </w:r>
+    </w:p>
+    <w:p>
+      <w:pPr>
+        <w:numPr>
+          <w:ilvl w:val="0"/>
+          <w:numId w:val="15"/>
+        </w:numPr>
+        <w:tabs>
+          <w:tab w:val="left" w:pos="6530"/>
+        </w:tabs>
+      </w:pPr>
+      <w:r>
+        <w:t xml:space="preserve">About JB </w:t>
+      </w:r>
+    </w:p>
+    <w:p>
+      <w:pPr>
+        <w:numPr>
+          <w:ilvl w:val="0"/>
+          <w:numId w:val="15"/>
+        </w:numPr>
+        <w:tabs>
+          <w:tab w:val="left" w:pos="6530"/>
+        </w:tabs>
+      </w:pPr>
+      <w:r>
+        <w:t xml:space="preserve">Community Features </w:t>
+      </w:r>
+    </w:p>
+    <w:p>
+      <w:pPr>
+        <w:tabs>
+          <w:tab w:val="left" w:pos="6530"/>
+        </w:tabs>
+      </w:pPr>
+      <w:r>
+        <w:t xml:space="preserve">This structure improves response accuracy while preventing the assistant from providing information outside its intended scope. </w:t>
+      </w:r>
+    </w:p>
+    <w:p>
+      <w:pPr>
+        <w:tabs>
+          <w:tab w:val="left" w:pos="6530"/>
+        </w:tabs>
+        <w:rPr>
+          <w:b/>
+          <w:bCs/>
+        </w:rPr>
+      </w:pPr>
+      <w:r>
+        <w:rPr>
+          <w:b/>
+          <w:bCs/>
+        </w:rPr>
+        <w:t xml:space="preserve">Figure 3: </w:t>
+      </w:r>
+      <w:r>
+        <w:rPr>
+          <w:b/>
+          <w:bCs/>
+        </w:rPr>
+        <w:t>Chat Flow</w:t>
+      </w:r>
+    </w:p>
+    <w:p>
+      <w:pPr>
+        <w:tabs>
+          <w:tab w:val="left" w:pos="6530"/>
+        </w:tabs>
+        <w:rPr>
+          <w:b/>
+          <w:bCs/>
+        </w:rPr>
+      </w:pPr>
+      <w:r>
+        <w:rPr>
+          <w:b/>
+          <w:bCs/>
+          <w:noProof/>
+        </w:rPr>
+        <w:drawing>
+          <wp:inline distT="0" distB="0" distL="0" distR="0" wp14:anchorId="39A621FB" wp14:editId="6C7648A2">
+            <wp:extent cx="5934075" cy="3371850"/>
+            <wp:effectExtent l="0" t="0" r="9525" b="0"/>
+            <wp:docPr id="1253481482" name="Picture 2"/>
+            <wp:cNvGraphicFramePr>
+              <a:graphicFrameLocks xmlns:a="http://schemas.openxmlformats.org/drawingml/2006/main" noChangeAspect="1"/>
+            </wp:cNvGraphicFramePr>
+            <a:graphic xmlns:a="http://schemas.openxmlformats.org/drawingml/2006/main">
+              <a:graphicData uri="http://schemas.openxmlformats.org/drawingml/2006/picture">
+                <pic:pic xmlns:pic="http://schemas.openxmlformats.org/drawingml/2006/picture">
+                  <pic:nvPicPr>
+                    <pic:cNvPr id="0" name="Picture 2"/>
+                    <pic:cNvPicPr>
+                      <a:picLocks noChangeAspect="1" noChangeArrowheads="1"/>
+                    </pic:cNvPicPr>
+                  </pic:nvPicPr>
+                  <pic:blipFill>
+                    <a:blip r:embed="rId10">
+                      <a:extLst>
+                        <a:ext uri="{28A0092B-C50C-407E-A947-70E740481C1C}">
+                          <a14:useLocalDpi xmlns:a14="http://schemas.microsoft.com/office/drawing/2010/main" val="0"/>
+                        </a:ext>
+                      </a:extLst>
+                    </a:blip>
+                    <a:srcRect/>
+                    <a:stretch>
+                      <a:fillRect/>
+                    </a:stretch>
+                  </pic:blipFill>
+                  <pic:spPr bwMode="auto">
+                    <a:xfrm>
+                      <a:off x="0" y="0"/>
+                      <a:ext cx="5934075" cy="3371850"/>
+                    </a:xfrm>
+                    <a:prstGeom prst="rect">
+                      <a:avLst/>
+                    </a:prstGeom>
+                    <a:noFill/>
+                    <a:ln>
+                      <a:noFill/>
+                    </a:ln>
+                  </pic:spPr>
+                </pic:pic>
+              </a:graphicData>
+            </a:graphic>
+          </wp:inline>
+        </w:drawing>
+      </w:r>
+    </w:p>
+    <w:p>
+      <w:pPr>
+        <w:tabs>
+          <w:tab w:val="left" w:pos="6530"/>
+        </w:tabs>
+      </w:pPr>
+    </w:p>
+    <w:p>
+      <w:pPr>
+        <w:tabs>
+          <w:tab w:val="left" w:pos="6530"/>
+        </w:tabs>
+      </w:pPr>
+    </w:p>
+    <w:p>
+      <w:pPr>
+        <w:tabs>
+          <w:tab w:val="left" w:pos="6530"/>
+        </w:tabs>
+      </w:pPr>
+    </w:p>
+    <w:p>
+      <w:pPr>
+        <w:tabs>
+          <w:tab w:val="left" w:pos="6530"/>
+        </w:tabs>
+      </w:pPr>
+      <w:r>
+        <w:lastRenderedPageBreak/>
+        <w:t>3.5 Analytics Architecture</w:t>
+      </w:r>
+    </w:p>
+    <w:p>
+      <w:pPr>
+        <w:tabs>
+          <w:tab w:val="left" w:pos="6530"/>
+        </w:tabs>
+      </w:pPr>
+      <w:r>
+        <w:t>The analytics system was implemented to better understand user behavior and measure the effectiveness of the platform.</w:t>
+      </w:r>
+    </w:p>
+    <w:p>
+      <w:pPr>
+        <w:tabs>
+          <w:tab w:val="left" w:pos="6530"/>
+        </w:tabs>
+      </w:pPr>
+      <w:r>
+        <w:t>Primary Events Tracked:</w:t>
+      </w:r>
+    </w:p>
+    <w:p>
+      <w:pPr>
+        <w:numPr>
+          <w:ilvl w:val="0"/>
+          <w:numId w:val="16"/>
+        </w:numPr>
+        <w:tabs>
+          <w:tab w:val="left" w:pos="6530"/>
+        </w:tabs>
+      </w:pPr>
+      <w:r>
+        <w:t xml:space="preserve">Page Views </w:t>
+      </w:r>
+    </w:p>
+    <w:p>
+      <w:pPr>
+        <w:numPr>
+          <w:ilvl w:val="0"/>
+          <w:numId w:val="16"/>
+        </w:numPr>
+        <w:tabs>
+          <w:tab w:val="left" w:pos="6530"/>
+        </w:tabs>
+      </w:pPr>
+      <w:r>
+        <w:t xml:space="preserve">System Views </w:t>
+      </w:r>
+    </w:p>
+    <w:p>
+      <w:pPr>
+        <w:numPr>
+          <w:ilvl w:val="0"/>
+          <w:numId w:val="16"/>
+        </w:numPr>
+        <w:tabs>
+          <w:tab w:val="left" w:pos="6530"/>
+        </w:tabs>
+      </w:pPr>
+      <w:r>
+        <w:t xml:space="preserve">User Navigation Patterns </w:t>
+      </w:r>
+    </w:p>
+    <w:p>
+      <w:pPr>
+        <w:numPr>
+          <w:ilvl w:val="0"/>
+          <w:numId w:val="16"/>
+        </w:numPr>
+        <w:tabs>
+          <w:tab w:val="left" w:pos="6530"/>
+        </w:tabs>
+      </w:pPr>
+      <w:r>
+        <w:t xml:space="preserve">Future Conversion Events </w:t>
+      </w:r>
+    </w:p>
+    <w:p>
+      <w:pPr>
+        <w:tabs>
+          <w:tab w:val="left" w:pos="6530"/>
+        </w:tabs>
+      </w:pPr>
+      <w:r>
+        <w:t>The analytics infrastructure provides insight into how visitors move throughout the platform and which content generates the highest engagement.</w:t>
+      </w:r>
+      <w:r>
+        <w:t xml:space="preserve"> Used to influence future videos and versions of the website.</w:t>
+      </w:r>
+    </w:p>
+    <w:p>
+      <w:pPr>
+        <w:tabs>
+          <w:tab w:val="left" w:pos="6530"/>
+        </w:tabs>
+      </w:pPr>
+    </w:p>
+    <w:p>
+      <w:pPr>
+        <w:tabs>
+          <w:tab w:val="left" w:pos="6530"/>
+        </w:tabs>
+      </w:pPr>
+      <w:r>
+        <w:t>3.6 Newsletter Infrastructure</w:t>
+      </w:r>
+    </w:p>
+    <w:p>
+      <w:pPr>
+        <w:tabs>
+          <w:tab w:val="left" w:pos="6530"/>
+        </w:tabs>
+      </w:pPr>
+      <w:r>
+        <w:t>The newsletter system serves as the primary audience ownership mechanism within the platform.</w:t>
+      </w:r>
+    </w:p>
+    <w:p>
+      <w:pPr>
+        <w:tabs>
+          <w:tab w:val="left" w:pos="6530"/>
+        </w:tabs>
+      </w:pPr>
+      <w:r>
+        <w:t>Its responsibilities include:</w:t>
+      </w:r>
+    </w:p>
+    <w:p>
+      <w:pPr>
+        <w:numPr>
+          <w:ilvl w:val="0"/>
+          <w:numId w:val="17"/>
+        </w:numPr>
+        <w:tabs>
+          <w:tab w:val="left" w:pos="6530"/>
+        </w:tabs>
+      </w:pPr>
+      <w:r>
+        <w:t xml:space="preserve">Email collection </w:t>
+      </w:r>
+    </w:p>
+    <w:p>
+      <w:pPr>
+        <w:numPr>
+          <w:ilvl w:val="0"/>
+          <w:numId w:val="17"/>
+        </w:numPr>
+        <w:tabs>
+          <w:tab w:val="left" w:pos="6530"/>
+        </w:tabs>
+      </w:pPr>
+      <w:r>
+        <w:t xml:space="preserve">Subscriber management </w:t>
+      </w:r>
+    </w:p>
+    <w:p>
+      <w:pPr>
+        <w:numPr>
+          <w:ilvl w:val="0"/>
+          <w:numId w:val="17"/>
+        </w:numPr>
+        <w:tabs>
+          <w:tab w:val="left" w:pos="6530"/>
+        </w:tabs>
+      </w:pPr>
+      <w:r>
+        <w:t xml:space="preserve">Future campaign distribution </w:t>
+      </w:r>
+    </w:p>
+    <w:p>
+      <w:pPr>
+        <w:numPr>
+          <w:ilvl w:val="0"/>
+          <w:numId w:val="17"/>
+        </w:numPr>
+        <w:tabs>
+          <w:tab w:val="left" w:pos="6530"/>
+        </w:tabs>
+      </w:pPr>
+      <w:r>
+        <w:t xml:space="preserve">Program delivery </w:t>
+      </w:r>
+    </w:p>
+    <w:p>
+      <w:pPr>
+        <w:tabs>
+          <w:tab w:val="left" w:pos="6530"/>
+        </w:tabs>
+      </w:pPr>
+      <w:r>
+        <w:t>The system creates a direct communication channel between the platform and users without relying entirely on social media algorithms.</w:t>
+      </w:r>
+    </w:p>
+    <w:p>
+      <w:pPr>
+        <w:tabs>
+          <w:tab w:val="left" w:pos="6530"/>
+        </w:tabs>
+      </w:pPr>
+    </w:p>
+    <w:p>
+      <w:pPr>
+        <w:tabs>
+          <w:tab w:val="left" w:pos="6530"/>
+        </w:tabs>
+      </w:pPr>
+    </w:p>
+    <w:p>
+      <w:pPr>
+        <w:tabs>
+          <w:tab w:val="left" w:pos="6530"/>
+        </w:tabs>
+      </w:pPr>
+    </w:p>
+    <w:p>
+      <w:pPr>
+        <w:tabs>
+          <w:tab w:val="left" w:pos="6530"/>
+        </w:tabs>
+      </w:pPr>
+    </w:p>
+    <w:p>
+      <w:pPr>
+        <w:tabs>
+          <w:tab w:val="left" w:pos="6530"/>
+        </w:tabs>
+      </w:pPr>
     </w:p>
     <w:p>
       <w:pPr>
@@ -1893,522 +2630,74 @@
           <w:bCs/>
         </w:rPr>
         <w:lastRenderedPageBreak/>
-        <w:t>Design Goals</w:t>
-      </w:r>
-    </w:p>
-    <w:p>
-      <w:pPr>
-        <w:numPr>
-          <w:ilvl w:val="0"/>
-          <w:numId w:val="14"/>
-        </w:numPr>
-        <w:tabs>
-          <w:tab w:val="left" w:pos="6530"/>
-        </w:tabs>
-      </w:pPr>
-      <w:r>
-        <w:t xml:space="preserve">Explain website features </w:t>
-      </w:r>
-    </w:p>
-    <w:p>
-      <w:pPr>
-        <w:numPr>
-          <w:ilvl w:val="0"/>
-          <w:numId w:val="14"/>
-        </w:numPr>
-        <w:tabs>
-          <w:tab w:val="left" w:pos="6530"/>
-        </w:tabs>
-      </w:pPr>
-      <w:r>
-        <w:t xml:space="preserve">Help users navigate the platform </w:t>
-      </w:r>
-    </w:p>
-    <w:p>
-      <w:pPr>
-        <w:numPr>
-          <w:ilvl w:val="0"/>
-          <w:numId w:val="14"/>
-        </w:numPr>
-        <w:tabs>
-          <w:tab w:val="left" w:pos="6530"/>
-        </w:tabs>
-      </w:pPr>
-      <w:r>
-        <w:t xml:space="preserve">Describe available systems </w:t>
-      </w:r>
-    </w:p>
-    <w:p>
-      <w:pPr>
-        <w:numPr>
-          <w:ilvl w:val="0"/>
-          <w:numId w:val="14"/>
-        </w:numPr>
-        <w:tabs>
-          <w:tab w:val="left" w:pos="6530"/>
-        </w:tabs>
-      </w:pPr>
-      <w:r>
-        <w:t xml:space="preserve">Explain YouTube content </w:t>
-      </w:r>
-    </w:p>
-    <w:p>
-      <w:pPr>
-        <w:numPr>
-          <w:ilvl w:val="0"/>
-          <w:numId w:val="14"/>
-        </w:numPr>
-        <w:tabs>
-          <w:tab w:val="left" w:pos="6530"/>
-        </w:tabs>
-      </w:pPr>
-      <w:r>
-        <w:t>Introducing</w:t>
-      </w:r>
-      <w:r>
-        <w:t xml:space="preserve"> the Improving JB ecosystem </w:t>
-      </w:r>
-    </w:p>
-    <w:p>
-      <w:pPr>
-        <w:numPr>
-          <w:ilvl w:val="0"/>
-          <w:numId w:val="14"/>
-        </w:numPr>
-        <w:tabs>
-          <w:tab w:val="left" w:pos="6530"/>
-        </w:tabs>
-      </w:pPr>
-      <w:r>
-        <w:t>Give information about JB himself</w:t>
-      </w:r>
-    </w:p>
-    <w:p>
-      <w:pPr>
-        <w:tabs>
-          <w:tab w:val="left" w:pos="6530"/>
-        </w:tabs>
-      </w:pPr>
-      <w:r>
-        <w:t>The AI system uses contextual prompting to determine which knowledge source should be used when generating responses. Different prompt sets exist for:</w:t>
-      </w:r>
-    </w:p>
-    <w:p>
-      <w:pPr>
-        <w:numPr>
-          <w:ilvl w:val="0"/>
-          <w:numId w:val="15"/>
-        </w:numPr>
-        <w:tabs>
-          <w:tab w:val="left" w:pos="6530"/>
-        </w:tabs>
-      </w:pPr>
-      <w:r>
-        <w:t xml:space="preserve">Website Information </w:t>
-      </w:r>
-    </w:p>
-    <w:p>
-      <w:pPr>
-        <w:numPr>
-          <w:ilvl w:val="0"/>
-          <w:numId w:val="15"/>
-        </w:numPr>
-        <w:tabs>
-          <w:tab w:val="left" w:pos="6530"/>
-        </w:tabs>
-      </w:pPr>
-      <w:r>
-        <w:t xml:space="preserve">Systems &amp; Programs </w:t>
-      </w:r>
-    </w:p>
-    <w:p>
-      <w:pPr>
-        <w:numPr>
-          <w:ilvl w:val="0"/>
-          <w:numId w:val="15"/>
-        </w:numPr>
-        <w:tabs>
-          <w:tab w:val="left" w:pos="6530"/>
-        </w:tabs>
-      </w:pPr>
-      <w:r>
-        <w:t xml:space="preserve">YouTube Content </w:t>
-      </w:r>
-    </w:p>
-    <w:p>
-      <w:pPr>
-        <w:numPr>
-          <w:ilvl w:val="0"/>
-          <w:numId w:val="15"/>
-        </w:numPr>
-        <w:tabs>
-          <w:tab w:val="left" w:pos="6530"/>
-        </w:tabs>
-      </w:pPr>
-      <w:r>
-        <w:t xml:space="preserve">About JB </w:t>
-      </w:r>
-    </w:p>
-    <w:p>
-      <w:pPr>
-        <w:numPr>
-          <w:ilvl w:val="0"/>
-          <w:numId w:val="15"/>
-        </w:numPr>
-        <w:tabs>
-          <w:tab w:val="left" w:pos="6530"/>
-        </w:tabs>
-      </w:pPr>
-      <w:r>
-        <w:t xml:space="preserve">Community Features </w:t>
-      </w:r>
-    </w:p>
-    <w:p>
-      <w:pPr>
-        <w:tabs>
-          <w:tab w:val="left" w:pos="6530"/>
-        </w:tabs>
-      </w:pPr>
-      <w:r>
-        <w:t xml:space="preserve">This structure improves response accuracy while preventing the assistant from providing information outside its intended scope. </w:t>
-      </w:r>
-    </w:p>
-    <w:p>
-      <w:pPr>
-        <w:tabs>
-          <w:tab w:val="left" w:pos="6530"/>
-        </w:tabs>
+        <w:t xml:space="preserve">Figure 4: </w:t>
+      </w:r>
+      <w:r>
         <w:rPr>
           <w:b/>
           <w:bCs/>
         </w:rPr>
+        <w:t>Engagement and Conversion Dataflow</w:t>
+      </w:r>
+    </w:p>
+    <w:p>
+      <w:pPr>
+        <w:tabs>
+          <w:tab w:val="left" w:pos="6530"/>
+        </w:tabs>
       </w:pPr>
       <w:r>
         <w:rPr>
-          <w:b/>
-          <w:bCs/>
+          <w:noProof/>
         </w:rPr>
-        <w:t>Chat Flow</w:t>
-      </w:r>
-    </w:p>
-    <w:p>
-      <w:pPr>
-        <w:tabs>
-          <w:tab w:val="left" w:pos="6530"/>
-        </w:tabs>
-      </w:pPr>
-      <w:r>
-        <w:t>User Message</w:t>
-      </w:r>
-    </w:p>
-    <w:p>
-      <w:pPr>
-        <w:tabs>
-          <w:tab w:val="left" w:pos="6530"/>
-        </w:tabs>
-      </w:pPr>
-      <w:r>
-        <w:t>↓</w:t>
-      </w:r>
-    </w:p>
-    <w:p>
-      <w:pPr>
-        <w:tabs>
-          <w:tab w:val="left" w:pos="6530"/>
-        </w:tabs>
-      </w:pPr>
-      <w:r>
-        <w:t>Context Selection</w:t>
-      </w:r>
-    </w:p>
-    <w:p>
-      <w:pPr>
-        <w:tabs>
-          <w:tab w:val="left" w:pos="6530"/>
-        </w:tabs>
-      </w:pPr>
-      <w:r>
-        <w:t>↓</w:t>
-      </w:r>
-    </w:p>
-    <w:p>
-      <w:pPr>
-        <w:tabs>
-          <w:tab w:val="left" w:pos="6530"/>
-        </w:tabs>
-      </w:pPr>
-      <w:r>
-        <w:t>Knowledge Base Injection</w:t>
-      </w:r>
-    </w:p>
-    <w:p>
-      <w:pPr>
-        <w:tabs>
-          <w:tab w:val="left" w:pos="6530"/>
-        </w:tabs>
-      </w:pPr>
-      <w:r>
-        <w:t>↓</w:t>
-      </w:r>
-    </w:p>
-    <w:p>
-      <w:pPr>
-        <w:tabs>
-          <w:tab w:val="left" w:pos="6530"/>
-        </w:tabs>
-      </w:pPr>
-      <w:r>
-        <w:t>OpenAI API</w:t>
-      </w:r>
-    </w:p>
-    <w:p>
-      <w:pPr>
-        <w:tabs>
-          <w:tab w:val="left" w:pos="6530"/>
-        </w:tabs>
-      </w:pPr>
-      <w:r>
-        <w:t>↓</w:t>
-      </w:r>
-    </w:p>
-    <w:p>
-      <w:pPr>
-        <w:tabs>
-          <w:tab w:val="left" w:pos="6530"/>
-        </w:tabs>
-      </w:pPr>
-      <w:r>
-        <w:t>Response Generation</w:t>
-      </w:r>
-    </w:p>
-    <w:p>
-      <w:pPr>
-        <w:tabs>
-          <w:tab w:val="left" w:pos="6530"/>
-        </w:tabs>
-      </w:pPr>
-      <w:r>
-        <w:lastRenderedPageBreak/>
-        <w:t>↓</w:t>
-      </w:r>
-    </w:p>
-    <w:p>
-      <w:pPr>
-        <w:tabs>
-          <w:tab w:val="left" w:pos="6530"/>
-        </w:tabs>
-      </w:pPr>
-      <w:r>
-        <w:t>Frontend Display</w:t>
-      </w:r>
-    </w:p>
-    <w:p>
-      <w:pPr>
-        <w:tabs>
-          <w:tab w:val="left" w:pos="6530"/>
-        </w:tabs>
-      </w:pPr>
-    </w:p>
-    <w:p>
-      <w:pPr>
-        <w:tabs>
-          <w:tab w:val="left" w:pos="6530"/>
-        </w:tabs>
-      </w:pPr>
-      <w:r>
-        <w:t>3.5 Analytics Architecture</w:t>
-      </w:r>
-    </w:p>
-    <w:p>
-      <w:pPr>
-        <w:tabs>
-          <w:tab w:val="left" w:pos="6530"/>
-        </w:tabs>
-      </w:pPr>
-      <w:r>
-        <w:t>The analytics system was implemented to better understand user behavior and measure the effectiveness of the platform.</w:t>
-      </w:r>
-    </w:p>
-    <w:p>
-      <w:pPr>
-        <w:tabs>
-          <w:tab w:val="left" w:pos="6530"/>
-        </w:tabs>
-      </w:pPr>
-      <w:r>
-        <w:t>Primary Events Tracked:</w:t>
-      </w:r>
-    </w:p>
-    <w:p>
-      <w:pPr>
-        <w:numPr>
-          <w:ilvl w:val="0"/>
-          <w:numId w:val="16"/>
-        </w:numPr>
-        <w:tabs>
-          <w:tab w:val="left" w:pos="6530"/>
-        </w:tabs>
-      </w:pPr>
-      <w:r>
-        <w:t xml:space="preserve">Page Views </w:t>
-      </w:r>
-    </w:p>
-    <w:p>
-      <w:pPr>
-        <w:numPr>
-          <w:ilvl w:val="0"/>
-          <w:numId w:val="16"/>
-        </w:numPr>
-        <w:tabs>
-          <w:tab w:val="left" w:pos="6530"/>
-        </w:tabs>
-      </w:pPr>
-      <w:r>
-        <w:t xml:space="preserve">System Views </w:t>
-      </w:r>
-    </w:p>
-    <w:p>
-      <w:pPr>
-        <w:numPr>
-          <w:ilvl w:val="0"/>
-          <w:numId w:val="16"/>
-        </w:numPr>
-        <w:tabs>
-          <w:tab w:val="left" w:pos="6530"/>
-        </w:tabs>
-      </w:pPr>
-      <w:r>
-        <w:t xml:space="preserve">User Navigation Patterns </w:t>
-      </w:r>
-    </w:p>
-    <w:p>
-      <w:pPr>
-        <w:numPr>
-          <w:ilvl w:val="0"/>
-          <w:numId w:val="16"/>
-        </w:numPr>
-        <w:tabs>
-          <w:tab w:val="left" w:pos="6530"/>
-        </w:tabs>
-      </w:pPr>
-      <w:r>
-        <w:t xml:space="preserve">Future Conversion Events </w:t>
-      </w:r>
-    </w:p>
-    <w:p>
-      <w:pPr>
-        <w:tabs>
-          <w:tab w:val="left" w:pos="6530"/>
-        </w:tabs>
-      </w:pPr>
-      <w:r>
-        <w:t>The analytics infrastructure provides insight into how visitors move throughout the platform and which content generates the highest engagement.</w:t>
-      </w:r>
-      <w:r>
-        <w:t xml:space="preserve"> Used to influence future videos and versions of the website.</w:t>
-      </w:r>
-    </w:p>
-    <w:p>
-      <w:pPr>
-        <w:tabs>
-          <w:tab w:val="left" w:pos="6530"/>
-        </w:tabs>
-      </w:pPr>
-    </w:p>
-    <w:p>
-      <w:pPr>
-        <w:tabs>
-          <w:tab w:val="left" w:pos="6530"/>
-        </w:tabs>
-      </w:pPr>
-      <w:r>
-        <w:t>3.6 Newsletter Infrastructure</w:t>
-      </w:r>
-    </w:p>
-    <w:p>
-      <w:pPr>
-        <w:tabs>
-          <w:tab w:val="left" w:pos="6530"/>
-        </w:tabs>
-      </w:pPr>
-      <w:r>
-        <w:t>The newsletter system serves as the primary audience ownership mechanism within the platform.</w:t>
-      </w:r>
-    </w:p>
-    <w:p>
-      <w:pPr>
-        <w:tabs>
-          <w:tab w:val="left" w:pos="6530"/>
-        </w:tabs>
-      </w:pPr>
-      <w:r>
-        <w:t>Its responsibilities include:</w:t>
-      </w:r>
-    </w:p>
-    <w:p>
-      <w:pPr>
-        <w:numPr>
-          <w:ilvl w:val="0"/>
-          <w:numId w:val="17"/>
-        </w:numPr>
-        <w:tabs>
-          <w:tab w:val="left" w:pos="6530"/>
-        </w:tabs>
-      </w:pPr>
-      <w:r>
-        <w:t xml:space="preserve">Email collection </w:t>
-      </w:r>
-    </w:p>
-    <w:p>
-      <w:pPr>
-        <w:numPr>
-          <w:ilvl w:val="0"/>
-          <w:numId w:val="17"/>
-        </w:numPr>
-        <w:tabs>
-          <w:tab w:val="left" w:pos="6530"/>
-        </w:tabs>
-      </w:pPr>
-      <w:r>
-        <w:t xml:space="preserve">Subscriber management </w:t>
-      </w:r>
-    </w:p>
-    <w:p>
-      <w:pPr>
-        <w:numPr>
-          <w:ilvl w:val="0"/>
-          <w:numId w:val="17"/>
-        </w:numPr>
-        <w:tabs>
-          <w:tab w:val="left" w:pos="6530"/>
-        </w:tabs>
-      </w:pPr>
-      <w:r>
-        <w:t xml:space="preserve">Future campaign distribution </w:t>
-      </w:r>
-    </w:p>
-    <w:p>
-      <w:pPr>
-        <w:numPr>
-          <w:ilvl w:val="0"/>
-          <w:numId w:val="17"/>
-        </w:numPr>
-        <w:tabs>
-          <w:tab w:val="left" w:pos="6530"/>
-        </w:tabs>
-      </w:pPr>
-      <w:r>
-        <w:t xml:space="preserve">Program delivery </w:t>
-      </w:r>
-    </w:p>
-    <w:p>
-      <w:pPr>
-        <w:tabs>
-          <w:tab w:val="left" w:pos="6530"/>
-        </w:tabs>
-      </w:pPr>
-      <w:r>
-        <w:t>The system creates a direct communication channel between the platform and users without relying entirely on social media algorithms.</w:t>
+        <w:drawing>
+          <wp:inline distT="0" distB="0" distL="0" distR="0" wp14:anchorId="069727F2" wp14:editId="2F01650C">
+            <wp:extent cx="4010025" cy="6105525"/>
+            <wp:effectExtent l="0" t="0" r="9525" b="9525"/>
+            <wp:docPr id="1243727524" name="Picture 3"/>
+            <wp:cNvGraphicFramePr>
+              <a:graphicFrameLocks xmlns:a="http://schemas.openxmlformats.org/drawingml/2006/main" noChangeAspect="1"/>
+            </wp:cNvGraphicFramePr>
+            <a:graphic xmlns:a="http://schemas.openxmlformats.org/drawingml/2006/main">
+              <a:graphicData uri="http://schemas.openxmlformats.org/drawingml/2006/picture">
+                <pic:pic xmlns:pic="http://schemas.openxmlformats.org/drawingml/2006/picture">
+                  <pic:nvPicPr>
+                    <pic:cNvPr id="0" name="Picture 3"/>
+                    <pic:cNvPicPr>
+                      <a:picLocks noChangeAspect="1" noChangeArrowheads="1"/>
+                    </pic:cNvPicPr>
+                  </pic:nvPicPr>
+                  <pic:blipFill>
+                    <a:blip r:embed="rId11">
+                      <a:extLst>
+                        <a:ext uri="{28A0092B-C50C-407E-A947-70E740481C1C}">
+                          <a14:useLocalDpi xmlns:a14="http://schemas.microsoft.com/office/drawing/2010/main" val="0"/>
+                        </a:ext>
+                      </a:extLst>
+                    </a:blip>
+                    <a:srcRect/>
+                    <a:stretch>
+                      <a:fillRect/>
+                    </a:stretch>
+                  </pic:blipFill>
+                  <pic:spPr bwMode="auto">
+                    <a:xfrm>
+                      <a:off x="0" y="0"/>
+                      <a:ext cx="4010025" cy="6105525"/>
+                    </a:xfrm>
+                    <a:prstGeom prst="rect">
+                      <a:avLst/>
+                    </a:prstGeom>
+                    <a:noFill/>
+                    <a:ln>
+                      <a:noFill/>
+                    </a:ln>
+                  </pic:spPr>
+                </pic:pic>
+              </a:graphicData>
+            </a:graphic>
+          </wp:inline>
+        </w:drawing>
       </w:r>
     </w:p>
     <w:p>
@@ -2435,7 +2724,6 @@
         </w:tabs>
       </w:pPr>
       <w:r>
-        <w:lastRenderedPageBreak/>
         <w:t>Several measures were implemented to improve stability and reliability.</w:t>
       </w:r>
     </w:p>
@@ -2464,6 +2752,7 @@
         </w:tabs>
       </w:pPr>
       <w:r>
+        <w:lastRenderedPageBreak/>
         <w:t xml:space="preserve">User inputs are validated before being processed by backend services. </w:t>
       </w:r>
     </w:p>
@@ -2585,7 +2874,7 @@
         </w:tabs>
       </w:pPr>
       <w:r>
-        <w:t xml:space="preserve">User accounts </w:t>
+        <w:t xml:space="preserve">Expanded analytics dashboards </w:t>
       </w:r>
     </w:p>
     <w:p>
@@ -2599,7 +2888,7 @@
         </w:tabs>
       </w:pPr>
       <w:r>
-        <w:t xml:space="preserve">Expanded analytics dashboards </w:t>
+        <w:t xml:space="preserve">Additional downloadable systems </w:t>
       </w:r>
     </w:p>
     <w:p>
@@ -2613,20 +2902,6 @@
         </w:tabs>
       </w:pPr>
       <w:r>
-        <w:t xml:space="preserve">Additional downloadable systems </w:t>
-      </w:r>
-    </w:p>
-    <w:p>
-      <w:pPr>
-        <w:numPr>
-          <w:ilvl w:val="0"/>
-          <w:numId w:val="18"/>
-        </w:numPr>
-        <w:tabs>
-          <w:tab w:val="left" w:pos="6530"/>
-        </w:tabs>
-      </w:pPr>
-      <w:r>
         <w:t xml:space="preserve">Enhanced AI capabilities </w:t>
       </w:r>
     </w:p>
@@ -2659,6 +2934,517 @@
         <w:tabs>
           <w:tab w:val="left" w:pos="6530"/>
         </w:tabs>
+        <w:rPr>
+          <w:b/>
+          <w:bCs/>
+          <w:sz w:val="40"/>
+          <w:szCs w:val="40"/>
+        </w:rPr>
+      </w:pPr>
+      <w:r>
+        <w:rPr>
+          <w:b/>
+          <w:bCs/>
+          <w:sz w:val="40"/>
+          <w:szCs w:val="40"/>
+        </w:rPr>
+        <w:t xml:space="preserve">IV. Deployment </w:t>
+      </w:r>
+      <w:r>
+        <w:rPr>
+          <w:b/>
+          <w:bCs/>
+          <w:sz w:val="40"/>
+          <w:szCs w:val="40"/>
+        </w:rPr>
+        <w:t>Progress and Deliverables</w:t>
+      </w:r>
+    </w:p>
+    <w:p>
+      <w:pPr>
+        <w:tabs>
+          <w:tab w:val="left" w:pos="6530"/>
+        </w:tabs>
+      </w:pPr>
+    </w:p>
+    <w:p>
+      <w:pPr>
+        <w:tabs>
+          <w:tab w:val="left" w:pos="6530"/>
+        </w:tabs>
+      </w:pPr>
+      <w:r>
+        <w:t>4.1 Major Deliverables Completed</w:t>
+      </w:r>
+    </w:p>
+    <w:p>
+      <w:pPr>
+        <w:tabs>
+          <w:tab w:val="left" w:pos="6530"/>
+        </w:tabs>
+      </w:pPr>
+      <w:r>
+        <w:t>Several major components of the Improving JB platform have been successfully developed and deployed.</w:t>
+      </w:r>
+    </w:p>
+    <w:p>
+      <w:pPr>
+        <w:tabs>
+          <w:tab w:val="left" w:pos="6530"/>
+        </w:tabs>
+      </w:pPr>
+    </w:p>
+    <w:p>
+      <w:pPr>
+        <w:tabs>
+          <w:tab w:val="left" w:pos="6530"/>
+        </w:tabs>
+      </w:pPr>
+    </w:p>
+    <w:p>
+      <w:pPr>
+        <w:tabs>
+          <w:tab w:val="left" w:pos="6530"/>
+        </w:tabs>
+      </w:pPr>
+      <w:r>
+        <w:lastRenderedPageBreak/>
+        <w:t>Completed Deliverables:</w:t>
+      </w:r>
+    </w:p>
+    <w:p>
+      <w:pPr>
+        <w:tabs>
+          <w:tab w:val="left" w:pos="6530"/>
+        </w:tabs>
+      </w:pPr>
+      <w:r>
+        <w:t>• Responsive multi-page website</w:t>
+      </w:r>
+      <w:r>
+        <w:br/>
+        <w:t>• Home, Systems, About, and Community pages</w:t>
+      </w:r>
+      <w:r>
+        <w:br/>
+        <w:t>• AI-powered chatbot ("Bands")</w:t>
+      </w:r>
+      <w:r>
+        <w:br/>
+        <w:t xml:space="preserve">• Social media </w:t>
+      </w:r>
+      <w:r>
+        <w:t xml:space="preserve">link </w:t>
+      </w:r>
+      <w:r>
+        <w:t>integration</w:t>
+      </w:r>
+      <w:r>
+        <w:br/>
+        <w:t>• Mobile optimization</w:t>
+      </w:r>
+      <w:r>
+        <w:br/>
+        <w:t>• Backend API infrastructure</w:t>
+      </w:r>
+      <w:r>
+        <w:br/>
+        <w:t>• Analytics tracking foundation</w:t>
+      </w:r>
+      <w:r>
+        <w:br/>
+        <w:t>• Newsletter infrastructure</w:t>
+      </w:r>
+      <w:r>
+        <w:br/>
+        <w:t>• 30 Day Reset system</w:t>
+      </w:r>
+      <w:r>
+        <w:br/>
+        <w:t xml:space="preserve">• </w:t>
+      </w:r>
+      <w:r>
+        <w:t>T</w:t>
+      </w:r>
+      <w:r>
+        <w:t>he 10 Week Build program</w:t>
+      </w:r>
+    </w:p>
+    <w:p>
+      <w:pPr>
+        <w:tabs>
+          <w:tab w:val="left" w:pos="6530"/>
+        </w:tabs>
+      </w:pPr>
+      <w:r>
+        <w:t xml:space="preserve">These deliverables establish the core ecosystem of the platform and provide a foundation for future expansion. The current architecture supports additional systems, analytics improvements, </w:t>
+      </w:r>
+      <w:r>
+        <w:t>and newsletter functionality</w:t>
+      </w:r>
+      <w:r>
+        <w:t xml:space="preserve"> without requiring significant changes to the </w:t>
+      </w:r>
+      <w:r>
+        <w:t>current website version</w:t>
+      </w:r>
+      <w:r>
+        <w:t>.</w:t>
+      </w:r>
+    </w:p>
+    <w:p>
+      <w:pPr>
+        <w:tabs>
+          <w:tab w:val="left" w:pos="6530"/>
+        </w:tabs>
+      </w:pPr>
+    </w:p>
+    <w:p>
+      <w:pPr>
+        <w:tabs>
+          <w:tab w:val="left" w:pos="6530"/>
+        </w:tabs>
+      </w:pPr>
+      <w:r>
+        <w:t>4.2 Version 2 Development Timeline</w:t>
+      </w:r>
+    </w:p>
+    <w:p>
+      <w:pPr>
+        <w:tabs>
+          <w:tab w:val="left" w:pos="6530"/>
+        </w:tabs>
+      </w:pPr>
+    </w:p>
+    <w:p>
+      <w:pPr>
+        <w:tabs>
+          <w:tab w:val="left" w:pos="6530"/>
+        </w:tabs>
+      </w:pPr>
+      <w:r>
+        <w:t xml:space="preserve">Work on V2 of the Improving JB ecosystem began </w:t>
+      </w:r>
+      <w:r>
+        <w:t>May 10th</w:t>
+      </w:r>
+    </w:p>
+    <w:tbl>
+      <w:tblPr>
+        <w:tblStyle w:val="TableGrid"/>
+        <w:tblW w:w="0" w:type="auto"/>
+        <w:tblLook w:val="04A0" w:firstRow="1" w:lastRow="0" w:firstColumn="1" w:lastColumn="0" w:noHBand="0" w:noVBand="1"/>
+      </w:tblPr>
+      <w:tblGrid>
+        <w:gridCol w:w="4675"/>
+        <w:gridCol w:w="4675"/>
+      </w:tblGrid>
+      <w:tr>
+        <w:tc>
+          <w:tcPr>
+            <w:tcW w:w="4675" w:type="dxa"/>
+          </w:tcPr>
+          <w:p>
+            <w:pPr>
+              <w:tabs>
+                <w:tab w:val="left" w:pos="6530"/>
+              </w:tabs>
+              <w:rPr>
+                <w:b/>
+                <w:bCs/>
+              </w:rPr>
+            </w:pPr>
+            <w:r>
+              <w:rPr>
+                <w:b/>
+                <w:bCs/>
+              </w:rPr>
+              <w:t>Feature</w:t>
+            </w:r>
+          </w:p>
+        </w:tc>
+        <w:tc>
+          <w:tcPr>
+            <w:tcW w:w="4675" w:type="dxa"/>
+          </w:tcPr>
+          <w:p>
+            <w:pPr>
+              <w:tabs>
+                <w:tab w:val="left" w:pos="6530"/>
+              </w:tabs>
+              <w:rPr>
+                <w:b/>
+                <w:bCs/>
+              </w:rPr>
+            </w:pPr>
+            <w:r>
+              <w:rPr>
+                <w:b/>
+                <w:bCs/>
+              </w:rPr>
+              <w:t xml:space="preserve">When </w:t>
+            </w:r>
+            <w:r>
+              <w:rPr>
+                <w:b/>
+                <w:bCs/>
+              </w:rPr>
+              <w:t>completed</w:t>
+            </w:r>
+          </w:p>
+        </w:tc>
+      </w:tr>
+      <w:tr>
+        <w:tc>
+          <w:tcPr>
+            <w:tcW w:w="4675" w:type="dxa"/>
+          </w:tcPr>
+          <w:p>
+            <w:pPr>
+              <w:tabs>
+                <w:tab w:val="left" w:pos="6530"/>
+              </w:tabs>
+            </w:pPr>
+            <w:r>
+              <w:t>New</w:t>
+            </w:r>
+            <w:r>
+              <w:t>s</w:t>
+            </w:r>
+            <w:r>
+              <w:t>letter</w:t>
+            </w:r>
+            <w:r>
+              <w:t xml:space="preserve"> / email capture</w:t>
+            </w:r>
+          </w:p>
+        </w:tc>
+        <w:tc>
+          <w:tcPr>
+            <w:tcW w:w="4675" w:type="dxa"/>
+          </w:tcPr>
+          <w:p>
+            <w:pPr>
+              <w:tabs>
+                <w:tab w:val="left" w:pos="6530"/>
+              </w:tabs>
+            </w:pPr>
+            <w:r>
+              <w:t>5/14/2026</w:t>
+            </w:r>
+          </w:p>
+        </w:tc>
+      </w:tr>
+      <w:tr>
+        <w:tc>
+          <w:tcPr>
+            <w:tcW w:w="4675" w:type="dxa"/>
+          </w:tcPr>
+          <w:p>
+            <w:pPr>
+              <w:tabs>
+                <w:tab w:val="left" w:pos="6530"/>
+              </w:tabs>
+            </w:pPr>
+            <w:r>
+              <w:t>Updated Flow and Design</w:t>
+            </w:r>
+          </w:p>
+        </w:tc>
+        <w:tc>
+          <w:tcPr>
+            <w:tcW w:w="4675" w:type="dxa"/>
+          </w:tcPr>
+          <w:p>
+            <w:pPr>
+              <w:tabs>
+                <w:tab w:val="left" w:pos="6530"/>
+              </w:tabs>
+            </w:pPr>
+            <w:r>
+              <w:t>5/17/2026</w:t>
+            </w:r>
+          </w:p>
+        </w:tc>
+      </w:tr>
+      <w:tr>
+        <w:tc>
+          <w:tcPr>
+            <w:tcW w:w="4675" w:type="dxa"/>
+          </w:tcPr>
+          <w:p>
+            <w:pPr>
+              <w:tabs>
+                <w:tab w:val="left" w:pos="6530"/>
+              </w:tabs>
+            </w:pPr>
+            <w:r>
+              <w:t>Updated Chatbot</w:t>
+            </w:r>
+          </w:p>
+        </w:tc>
+        <w:tc>
+          <w:tcPr>
+            <w:tcW w:w="4675" w:type="dxa"/>
+          </w:tcPr>
+          <w:p>
+            <w:pPr>
+              <w:tabs>
+                <w:tab w:val="left" w:pos="6530"/>
+              </w:tabs>
+            </w:pPr>
+            <w:r>
+              <w:t>5/20/2026</w:t>
+            </w:r>
+          </w:p>
+        </w:tc>
+      </w:tr>
+      <w:tr>
+        <w:tc>
+          <w:tcPr>
+            <w:tcW w:w="4675" w:type="dxa"/>
+          </w:tcPr>
+          <w:p>
+            <w:pPr>
+              <w:tabs>
+                <w:tab w:val="left" w:pos="6530"/>
+              </w:tabs>
+            </w:pPr>
+            <w:r>
+              <w:t>Analytics</w:t>
+            </w:r>
+          </w:p>
+        </w:tc>
+        <w:tc>
+          <w:tcPr>
+            <w:tcW w:w="4675" w:type="dxa"/>
+          </w:tcPr>
+          <w:p>
+            <w:pPr>
+              <w:tabs>
+                <w:tab w:val="left" w:pos="6530"/>
+              </w:tabs>
+            </w:pPr>
+            <w:r>
+              <w:t>5/24/2026</w:t>
+            </w:r>
+          </w:p>
+        </w:tc>
+      </w:tr>
+      <w:tr>
+        <w:tc>
+          <w:tcPr>
+            <w:tcW w:w="4675" w:type="dxa"/>
+          </w:tcPr>
+          <w:p>
+            <w:pPr>
+              <w:tabs>
+                <w:tab w:val="left" w:pos="6530"/>
+              </w:tabs>
+            </w:pPr>
+            <w:r>
+              <w:t>10 Week Build</w:t>
+            </w:r>
+          </w:p>
+        </w:tc>
+        <w:tc>
+          <w:tcPr>
+            <w:tcW w:w="4675" w:type="dxa"/>
+          </w:tcPr>
+          <w:p>
+            <w:pPr>
+              <w:tabs>
+                <w:tab w:val="left" w:pos="6530"/>
+              </w:tabs>
+            </w:pPr>
+            <w:r>
+              <w:t>?</w:t>
+            </w:r>
+          </w:p>
+        </w:tc>
+      </w:tr>
+      <w:tr>
+        <w:tc>
+          <w:tcPr>
+            <w:tcW w:w="4675" w:type="dxa"/>
+          </w:tcPr>
+          <w:p>
+            <w:pPr>
+              <w:tabs>
+                <w:tab w:val="left" w:pos="6530"/>
+              </w:tabs>
+            </w:pPr>
+            <w:r>
+              <w:t>Documentation</w:t>
+            </w:r>
+          </w:p>
+        </w:tc>
+        <w:tc>
+          <w:tcPr>
+            <w:tcW w:w="4675" w:type="dxa"/>
+          </w:tcPr>
+          <w:p>
+            <w:pPr>
+              <w:tabs>
+                <w:tab w:val="left" w:pos="6530"/>
+              </w:tabs>
+            </w:pPr>
+            <w:r>
+              <w:t>?</w:t>
+            </w:r>
+          </w:p>
+        </w:tc>
+      </w:tr>
+    </w:tbl>
+    <w:p>
+      <w:pPr>
+        <w:tabs>
+          <w:tab w:val="left" w:pos="6530"/>
+        </w:tabs>
+        <w:jc w:val="center"/>
+        <w:rPr>
+          <w:sz w:val="16"/>
+          <w:szCs w:val="16"/>
+        </w:rPr>
+      </w:pPr>
+      <w:r>
+        <w:rPr>
+          <w:sz w:val="16"/>
+          <w:szCs w:val="16"/>
+        </w:rPr>
+        <w:t xml:space="preserve">Table 1: </w:t>
+      </w:r>
+      <w:r>
+        <w:rPr>
+          <w:sz w:val="16"/>
+          <w:szCs w:val="16"/>
+        </w:rPr>
+        <w:t>V2 roadmap</w:t>
+      </w:r>
+    </w:p>
+    <w:p>
+      <w:pPr>
+        <w:tabs>
+          <w:tab w:val="left" w:pos="6530"/>
+        </w:tabs>
+        <w:rPr>
+          <w:sz w:val="22"/>
+          <w:szCs w:val="22"/>
+        </w:rPr>
+      </w:pPr>
+      <w:r>
+        <w:rPr>
+          <w:sz w:val="22"/>
+          <w:szCs w:val="22"/>
+        </w:rPr>
+        <w:t>(left off here)</w:t>
+      </w:r>
+    </w:p>
+    <w:p>
+      <w:pPr>
+        <w:tabs>
+          <w:tab w:val="left" w:pos="6530"/>
+        </w:tabs>
       </w:pPr>
     </w:p>
     <w:p>
@@ -2714,8 +3500,8 @@
       </w:pPr>
     </w:p>
     <w:sectPr>
-      <w:headerReference w:type="default" r:id="rId8"/>
-      <w:footerReference w:type="default" r:id="rId9"/>
+      <w:headerReference w:type="default" r:id="rId12"/>
+      <w:footerReference w:type="default" r:id="rId13"/>
       <w:pgSz w:w="12240" w:h="15840"/>
       <w:pgMar w:top="1440" w:right="1440" w:bottom="1440" w:left="1440" w:header="720" w:footer="720" w:gutter="0"/>
       <w:cols w:space="720"/>
@@ -6210,6 +6996,25 @@
       <w14:ligatures w14:val="none"/>
     </w:rPr>
   </w:style>
+  <w:style w:type="table" w:styleId="TableGrid">
+    <w:name w:val="Table Grid"/>
+    <w:basedOn w:val="TableNormal"/>
+    <w:uiPriority w:val="39"/>
+    <w:rsid w:val="00BD4D8D"/>
+    <w:pPr>
+      <w:spacing w:after="0" w:line="240" w:lineRule="auto"/>
+    </w:pPr>
+    <w:tblPr>
+      <w:tblBorders>
+        <w:top w:val="single" w:sz="4" w:space="0" w:color="auto"/>
+        <w:left w:val="single" w:sz="4" w:space="0" w:color="auto"/>
+        <w:bottom w:val="single" w:sz="4" w:space="0" w:color="auto"/>
+        <w:right w:val="single" w:sz="4" w:space="0" w:color="auto"/>
+        <w:insideH w:val="single" w:sz="4" w:space="0" w:color="auto"/>
+        <w:insideV w:val="single" w:sz="4" w:space="0" w:color="auto"/>
+      </w:tblBorders>
+    </w:tblPr>
+  </w:style>
 </w:styles>
 </file>
 

</xml_diff>

<commit_message>
video 15 & completed V2 documentation
</commit_message>
<xml_diff>
--- a/Improving JB Platform Documentation.docx
+++ b/Improving JB Platform Documentation.docx
@@ -260,6 +260,1262 @@
       </w:pPr>
     </w:p>
     <w:p/>
+    <w:p>
+      <w:r>
+        <w:rPr>
+          <w:b/>
+          <w:bCs/>
+        </w:rPr>
+        <w:t>I. Introduction</w:t>
+      </w:r>
+      <w:r>
+        <w:rPr>
+          <w:b/>
+          <w:bCs/>
+        </w:rPr>
+        <w:tab/>
+      </w:r>
+      <w:r>
+        <w:rPr>
+          <w:b/>
+          <w:bCs/>
+        </w:rPr>
+        <w:tab/>
+        <w:t xml:space="preserve">                                                                                 </w:t>
+      </w:r>
+      <w:r>
+        <w:rPr>
+          <w:b/>
+          <w:bCs/>
+        </w:rPr>
+        <w:tab/>
+      </w:r>
+      <w:r>
+        <w:rPr>
+          <w:b/>
+          <w:bCs/>
+        </w:rPr>
+        <w:t xml:space="preserve">                              </w:t>
+      </w:r>
+      <w:r>
+        <w:rPr>
+          <w:b/>
+          <w:bCs/>
+        </w:rPr>
+        <w:t>4</w:t>
+      </w:r>
+      <w:r>
+        <w:rPr>
+          <w:b/>
+          <w:bCs/>
+        </w:rPr>
+        <w:tab/>
+      </w:r>
+    </w:p>
+    <w:p>
+      <w:r>
+        <w:tab/>
+        <w:t>1.1 Purpose</w:t>
+      </w:r>
+      <w:r>
+        <w:tab/>
+      </w:r>
+      <w:r>
+        <w:tab/>
+      </w:r>
+      <w:r>
+        <w:tab/>
+      </w:r>
+      <w:r>
+        <w:tab/>
+      </w:r>
+      <w:r>
+        <w:tab/>
+      </w:r>
+      <w:r>
+        <w:tab/>
+      </w:r>
+      <w:r>
+        <w:tab/>
+      </w:r>
+      <w:r>
+        <w:tab/>
+      </w:r>
+      <w:r>
+        <w:tab/>
+      </w:r>
+      <w:r>
+        <w:tab/>
+      </w:r>
+      <w:r>
+        <w:t>4</w:t>
+      </w:r>
+    </w:p>
+    <w:p>
+      <w:r>
+        <w:tab/>
+        <w:t xml:space="preserve">1.2 </w:t>
+      </w:r>
+      <w:r>
+        <w:t>Platform Overview</w:t>
+      </w:r>
+      <w:r>
+        <w:tab/>
+      </w:r>
+      <w:r>
+        <w:tab/>
+      </w:r>
+      <w:r>
+        <w:tab/>
+      </w:r>
+      <w:r>
+        <w:tab/>
+      </w:r>
+      <w:r>
+        <w:tab/>
+      </w:r>
+      <w:r>
+        <w:tab/>
+      </w:r>
+      <w:r>
+        <w:tab/>
+      </w:r>
+      <w:r>
+        <w:tab/>
+      </w:r>
+      <w:r>
+        <w:t>4</w:t>
+      </w:r>
+    </w:p>
+    <w:p>
+      <w:r>
+        <w:tab/>
+        <w:t xml:space="preserve">1.3 </w:t>
+      </w:r>
+      <w:r>
+        <w:t>Project Scope</w:t>
+      </w:r>
+      <w:r>
+        <w:tab/>
+      </w:r>
+      <w:r>
+        <w:tab/>
+      </w:r>
+      <w:r>
+        <w:tab/>
+      </w:r>
+      <w:r>
+        <w:tab/>
+      </w:r>
+      <w:r>
+        <w:tab/>
+      </w:r>
+      <w:r>
+        <w:tab/>
+      </w:r>
+      <w:r>
+        <w:t xml:space="preserve">     </w:t>
+      </w:r>
+      <w:r>
+        <w:tab/>
+      </w:r>
+      <w:r>
+        <w:tab/>
+      </w:r>
+      <w:r>
+        <w:tab/>
+      </w:r>
+      <w:r>
+        <w:t>5</w:t>
+      </w:r>
+      <w:r>
+        <w:tab/>
+      </w:r>
+    </w:p>
+    <w:p>
+      <w:r>
+        <w:tab/>
+        <w:t xml:space="preserve">1.4 </w:t>
+      </w:r>
+      <w:r>
+        <w:t>Project Ownership</w:t>
+      </w:r>
+      <w:r>
+        <w:tab/>
+      </w:r>
+      <w:r>
+        <w:tab/>
+      </w:r>
+      <w:r>
+        <w:tab/>
+      </w:r>
+      <w:r>
+        <w:tab/>
+      </w:r>
+      <w:r>
+        <w:tab/>
+      </w:r>
+      <w:r>
+        <w:tab/>
+      </w:r>
+      <w:r>
+        <w:tab/>
+      </w:r>
+      <w:r>
+        <w:tab/>
+      </w:r>
+      <w:r>
+        <w:t>5</w:t>
+      </w:r>
+    </w:p>
+    <w:p>
+      <w:r>
+        <w:rPr>
+          <w:b/>
+          <w:bCs/>
+        </w:rPr>
+        <w:t>II. Technical Approach and Methodology</w:t>
+      </w:r>
+      <w:r>
+        <w:rPr>
+          <w:b/>
+          <w:bCs/>
+        </w:rPr>
+        <w:tab/>
+      </w:r>
+      <w:r>
+        <w:rPr>
+          <w:b/>
+          <w:bCs/>
+        </w:rPr>
+        <w:tab/>
+      </w:r>
+      <w:r>
+        <w:rPr>
+          <w:b/>
+          <w:bCs/>
+        </w:rPr>
+        <w:tab/>
+      </w:r>
+      <w:r>
+        <w:rPr>
+          <w:b/>
+          <w:bCs/>
+        </w:rPr>
+        <w:tab/>
+      </w:r>
+      <w:r>
+        <w:rPr>
+          <w:b/>
+          <w:bCs/>
+        </w:rPr>
+        <w:tab/>
+      </w:r>
+      <w:r>
+        <w:rPr>
+          <w:b/>
+          <w:bCs/>
+        </w:rPr>
+        <w:tab/>
+      </w:r>
+      <w:r>
+        <w:rPr>
+          <w:b/>
+          <w:bCs/>
+        </w:rPr>
+        <w:t>6</w:t>
+      </w:r>
+      <w:r>
+        <w:rPr>
+          <w:b/>
+          <w:bCs/>
+        </w:rPr>
+        <w:tab/>
+      </w:r>
+    </w:p>
+    <w:p>
+      <w:r>
+        <w:tab/>
+        <w:t xml:space="preserve">2.1 </w:t>
+      </w:r>
+      <w:r>
+        <w:t>Development Methodology</w:t>
+      </w:r>
+      <w:r>
+        <w:tab/>
+      </w:r>
+      <w:r>
+        <w:tab/>
+      </w:r>
+      <w:r>
+        <w:tab/>
+      </w:r>
+      <w:r>
+        <w:tab/>
+      </w:r>
+      <w:r>
+        <w:tab/>
+      </w:r>
+      <w:r>
+        <w:tab/>
+      </w:r>
+      <w:r>
+        <w:tab/>
+      </w:r>
+      <w:r>
+        <w:t>6</w:t>
+      </w:r>
+      <w:r>
+        <w:tab/>
+      </w:r>
+    </w:p>
+    <w:p>
+      <w:r>
+        <w:tab/>
+        <w:t xml:space="preserve">2.2 </w:t>
+      </w:r>
+      <w:r>
+        <w:t>Technical Stack and Development Environment</w:t>
+      </w:r>
+      <w:r>
+        <w:tab/>
+      </w:r>
+      <w:r>
+        <w:tab/>
+      </w:r>
+      <w:r>
+        <w:tab/>
+      </w:r>
+      <w:r>
+        <w:tab/>
+      </w:r>
+      <w:r>
+        <w:t>6</w:t>
+      </w:r>
+      <w:r>
+        <w:tab/>
+      </w:r>
+    </w:p>
+    <w:p>
+      <w:r>
+        <w:tab/>
+        <w:t xml:space="preserve">2.3 Version Control and </w:t>
+      </w:r>
+      <w:r>
+        <w:t>Development</w:t>
+      </w:r>
+      <w:r>
+        <w:t xml:space="preserve"> Practices</w:t>
+      </w:r>
+      <w:r>
+        <w:tab/>
+      </w:r>
+      <w:r>
+        <w:tab/>
+      </w:r>
+      <w:r>
+        <w:tab/>
+      </w:r>
+      <w:r>
+        <w:tab/>
+      </w:r>
+      <w:r>
+        <w:tab/>
+      </w:r>
+      <w:r>
+        <w:t>8</w:t>
+      </w:r>
+    </w:p>
+    <w:p>
+      <w:r>
+        <w:rPr>
+          <w:b/>
+          <w:bCs/>
+        </w:rPr>
+        <w:t>III. System Architecture</w:t>
+      </w:r>
+      <w:r>
+        <w:rPr>
+          <w:b/>
+          <w:bCs/>
+        </w:rPr>
+        <w:tab/>
+      </w:r>
+      <w:r>
+        <w:rPr>
+          <w:b/>
+          <w:bCs/>
+        </w:rPr>
+        <w:tab/>
+      </w:r>
+      <w:r>
+        <w:rPr>
+          <w:b/>
+          <w:bCs/>
+        </w:rPr>
+        <w:tab/>
+      </w:r>
+      <w:r>
+        <w:rPr>
+          <w:b/>
+          <w:bCs/>
+        </w:rPr>
+        <w:tab/>
+      </w:r>
+      <w:r>
+        <w:rPr>
+          <w:b/>
+          <w:bCs/>
+        </w:rPr>
+        <w:tab/>
+      </w:r>
+      <w:r>
+        <w:rPr>
+          <w:b/>
+          <w:bCs/>
+        </w:rPr>
+        <w:tab/>
+      </w:r>
+      <w:r>
+        <w:rPr>
+          <w:b/>
+          <w:bCs/>
+        </w:rPr>
+        <w:tab/>
+        <w:t xml:space="preserve">     </w:t>
+      </w:r>
+      <w:r>
+        <w:rPr>
+          <w:b/>
+          <w:bCs/>
+        </w:rPr>
+        <w:tab/>
+      </w:r>
+      <w:r>
+        <w:rPr>
+          <w:b/>
+          <w:bCs/>
+        </w:rPr>
+        <w:tab/>
+      </w:r>
+      <w:r>
+        <w:rPr>
+          <w:b/>
+          <w:bCs/>
+        </w:rPr>
+        <w:t>8</w:t>
+      </w:r>
+      <w:r>
+        <w:rPr>
+          <w:b/>
+          <w:bCs/>
+        </w:rPr>
+        <w:tab/>
+      </w:r>
+    </w:p>
+    <w:p>
+      <w:r>
+        <w:tab/>
+        <w:t xml:space="preserve">3.1 </w:t>
+      </w:r>
+      <w:r>
+        <w:t>Architecture Overview</w:t>
+      </w:r>
+      <w:r>
+        <w:tab/>
+      </w:r>
+      <w:r>
+        <w:tab/>
+      </w:r>
+      <w:r>
+        <w:tab/>
+      </w:r>
+      <w:r>
+        <w:tab/>
+      </w:r>
+      <w:r>
+        <w:tab/>
+      </w:r>
+      <w:r>
+        <w:tab/>
+      </w:r>
+      <w:r>
+        <w:tab/>
+      </w:r>
+      <w:r>
+        <w:tab/>
+      </w:r>
+      <w:r>
+        <w:t>8</w:t>
+      </w:r>
+    </w:p>
+    <w:p>
+      <w:r>
+        <w:tab/>
+        <w:t xml:space="preserve">3.2 Frontend </w:t>
+      </w:r>
+      <w:r>
+        <w:t>Architecture</w:t>
+      </w:r>
+      <w:r>
+        <w:tab/>
+      </w:r>
+      <w:r>
+        <w:tab/>
+      </w:r>
+      <w:r>
+        <w:tab/>
+      </w:r>
+      <w:r>
+        <w:tab/>
+      </w:r>
+      <w:r>
+        <w:tab/>
+      </w:r>
+      <w:r>
+        <w:tab/>
+      </w:r>
+      <w:r>
+        <w:tab/>
+      </w:r>
+      <w:r>
+        <w:tab/>
+      </w:r>
+      <w:r>
+        <w:t>9</w:t>
+      </w:r>
+    </w:p>
+    <w:p>
+      <w:r>
+        <w:tab/>
+      </w:r>
+      <w:r>
+        <w:t xml:space="preserve">3.3 Backend </w:t>
+      </w:r>
+      <w:r>
+        <w:t>Architecture</w:t>
+      </w:r>
+      <w:r>
+        <w:tab/>
+      </w:r>
+      <w:r>
+        <w:tab/>
+      </w:r>
+      <w:r>
+        <w:tab/>
+      </w:r>
+      <w:r>
+        <w:tab/>
+      </w:r>
+      <w:r>
+        <w:tab/>
+      </w:r>
+      <w:r>
+        <w:tab/>
+      </w:r>
+      <w:r>
+        <w:tab/>
+      </w:r>
+      <w:r>
+        <w:tab/>
+      </w:r>
+      <w:r>
+        <w:t>11</w:t>
+      </w:r>
+    </w:p>
+    <w:p>
+      <w:r>
+        <w:tab/>
+      </w:r>
+      <w:r>
+        <w:t xml:space="preserve">3.4 </w:t>
+      </w:r>
+      <w:r>
+        <w:t>Artificial Intelligence System</w:t>
+      </w:r>
+      <w:r>
+        <w:tab/>
+      </w:r>
+      <w:r>
+        <w:tab/>
+      </w:r>
+      <w:r>
+        <w:tab/>
+      </w:r>
+      <w:r>
+        <w:tab/>
+      </w:r>
+      <w:r>
+        <w:tab/>
+      </w:r>
+      <w:r>
+        <w:tab/>
+      </w:r>
+      <w:r>
+        <w:tab/>
+      </w:r>
+      <w:r>
+        <w:t>11</w:t>
+      </w:r>
+    </w:p>
+    <w:p>
+      <w:r>
+        <w:tab/>
+      </w:r>
+      <w:r>
+        <w:t xml:space="preserve">3.5 </w:t>
+      </w:r>
+      <w:r>
+        <w:t>Analytics Architecture</w:t>
+      </w:r>
+      <w:r>
+        <w:tab/>
+      </w:r>
+      <w:r>
+        <w:tab/>
+      </w:r>
+      <w:r>
+        <w:tab/>
+      </w:r>
+      <w:r>
+        <w:tab/>
+      </w:r>
+      <w:r>
+        <w:tab/>
+      </w:r>
+      <w:r>
+        <w:tab/>
+      </w:r>
+      <w:r>
+        <w:tab/>
+      </w:r>
+      <w:r>
+        <w:tab/>
+      </w:r>
+      <w:r>
+        <w:t>13</w:t>
+      </w:r>
+    </w:p>
+    <w:p>
+      <w:r>
+        <w:tab/>
+      </w:r>
+      <w:r>
+        <w:t xml:space="preserve">3.6 </w:t>
+      </w:r>
+      <w:r>
+        <w:t>Newsletter Infrastructure</w:t>
+      </w:r>
+      <w:r>
+        <w:tab/>
+      </w:r>
+      <w:r>
+        <w:tab/>
+      </w:r>
+      <w:r>
+        <w:tab/>
+      </w:r>
+      <w:r>
+        <w:tab/>
+      </w:r>
+      <w:r>
+        <w:tab/>
+      </w:r>
+      <w:r>
+        <w:tab/>
+      </w:r>
+      <w:r>
+        <w:tab/>
+      </w:r>
+      <w:r>
+        <w:t>13</w:t>
+      </w:r>
+    </w:p>
+    <w:p>
+      <w:r>
+        <w:tab/>
+      </w:r>
+      <w:r>
+        <w:t>3.7 Security and Reliability</w:t>
+      </w:r>
+      <w:r>
+        <w:tab/>
+      </w:r>
+      <w:r>
+        <w:tab/>
+      </w:r>
+      <w:r>
+        <w:tab/>
+      </w:r>
+      <w:r>
+        <w:tab/>
+      </w:r>
+      <w:r>
+        <w:tab/>
+      </w:r>
+      <w:r>
+        <w:tab/>
+      </w:r>
+      <w:r>
+        <w:tab/>
+      </w:r>
+      <w:r>
+        <w:tab/>
+        <w:t>14</w:t>
+      </w:r>
+    </w:p>
+    <w:p>
+      <w:r>
+        <w:tab/>
+        <w:t>3.8 Future Architecture Expansion</w:t>
+      </w:r>
+      <w:r>
+        <w:tab/>
+      </w:r>
+      <w:r>
+        <w:tab/>
+      </w:r>
+      <w:r>
+        <w:tab/>
+      </w:r>
+      <w:r>
+        <w:tab/>
+      </w:r>
+      <w:r>
+        <w:tab/>
+      </w:r>
+      <w:r>
+        <w:tab/>
+      </w:r>
+      <w:r>
+        <w:tab/>
+        <w:t>15</w:t>
+      </w:r>
+    </w:p>
+    <w:p>
+      <w:r>
+        <w:rPr>
+          <w:b/>
+          <w:bCs/>
+        </w:rPr>
+        <w:t>IV. Development Progress &amp; Deliverables</w:t>
+      </w:r>
+      <w:r>
+        <w:rPr>
+          <w:b/>
+          <w:bCs/>
+        </w:rPr>
+        <w:tab/>
+      </w:r>
+      <w:r>
+        <w:rPr>
+          <w:b/>
+          <w:bCs/>
+        </w:rPr>
+        <w:tab/>
+      </w:r>
+      <w:r>
+        <w:rPr>
+          <w:b/>
+          <w:bCs/>
+        </w:rPr>
+        <w:tab/>
+      </w:r>
+      <w:r>
+        <w:rPr>
+          <w:b/>
+          <w:bCs/>
+        </w:rPr>
+        <w:tab/>
+      </w:r>
+      <w:r>
+        <w:rPr>
+          <w:b/>
+          <w:bCs/>
+        </w:rPr>
+        <w:tab/>
+      </w:r>
+      <w:r>
+        <w:rPr>
+          <w:b/>
+          <w:bCs/>
+        </w:rPr>
+        <w:tab/>
+      </w:r>
+      <w:r>
+        <w:rPr>
+          <w:b/>
+          <w:bCs/>
+        </w:rPr>
+        <w:t>15</w:t>
+      </w:r>
+      <w:r>
+        <w:rPr>
+          <w:b/>
+          <w:bCs/>
+        </w:rPr>
+        <w:tab/>
+      </w:r>
+    </w:p>
+    <w:p>
+      <w:r>
+        <w:tab/>
+        <w:t xml:space="preserve">4.1 </w:t>
+      </w:r>
+      <w:r>
+        <w:t>Major Deliverables Completed</w:t>
+      </w:r>
+      <w:r>
+        <w:tab/>
+      </w:r>
+      <w:r>
+        <w:tab/>
+      </w:r>
+      <w:r>
+        <w:tab/>
+      </w:r>
+      <w:r>
+        <w:tab/>
+      </w:r>
+      <w:r>
+        <w:tab/>
+      </w:r>
+      <w:r>
+        <w:tab/>
+      </w:r>
+      <w:r>
+        <w:tab/>
+      </w:r>
+      <w:r>
+        <w:t>15</w:t>
+      </w:r>
+    </w:p>
+    <w:p>
+      <w:r>
+        <w:lastRenderedPageBreak/>
+        <w:tab/>
+        <w:t xml:space="preserve">4.2 </w:t>
+      </w:r>
+      <w:r>
+        <w:t>Version 2 Development Timeline</w:t>
+      </w:r>
+      <w:r>
+        <w:tab/>
+      </w:r>
+      <w:r>
+        <w:tab/>
+      </w:r>
+      <w:r>
+        <w:tab/>
+      </w:r>
+      <w:r>
+        <w:tab/>
+      </w:r>
+      <w:r>
+        <w:tab/>
+      </w:r>
+      <w:r>
+        <w:tab/>
+        <w:t>1</w:t>
+      </w:r>
+      <w:r>
+        <w:t>6</w:t>
+      </w:r>
+    </w:p>
+    <w:p>
+      <w:r>
+        <w:tab/>
+      </w:r>
+      <w:r>
+        <w:t xml:space="preserve">4.3 </w:t>
+      </w:r>
+      <w:r>
+        <w:t>Future Roadmap &amp; Planned Enhancements</w:t>
+      </w:r>
+      <w:r>
+        <w:tab/>
+      </w:r>
+      <w:r>
+        <w:tab/>
+      </w:r>
+      <w:r>
+        <w:tab/>
+      </w:r>
+      <w:r>
+        <w:tab/>
+      </w:r>
+      <w:r>
+        <w:tab/>
+        <w:t>1</w:t>
+      </w:r>
+      <w:r>
+        <w:t>6</w:t>
+      </w:r>
+    </w:p>
+    <w:p>
+      <w:r>
+        <w:rPr>
+          <w:b/>
+          <w:bCs/>
+        </w:rPr>
+        <w:t>V. Adjustments &amp; Challenges</w:t>
+      </w:r>
+      <w:r>
+        <w:rPr>
+          <w:b/>
+          <w:bCs/>
+        </w:rPr>
+        <w:tab/>
+      </w:r>
+      <w:r>
+        <w:rPr>
+          <w:b/>
+          <w:bCs/>
+        </w:rPr>
+        <w:tab/>
+      </w:r>
+      <w:r>
+        <w:rPr>
+          <w:b/>
+          <w:bCs/>
+        </w:rPr>
+        <w:tab/>
+      </w:r>
+      <w:r>
+        <w:rPr>
+          <w:b/>
+          <w:bCs/>
+        </w:rPr>
+        <w:tab/>
+      </w:r>
+      <w:r>
+        <w:rPr>
+          <w:b/>
+          <w:bCs/>
+        </w:rPr>
+        <w:tab/>
+      </w:r>
+      <w:r>
+        <w:rPr>
+          <w:b/>
+          <w:bCs/>
+        </w:rPr>
+        <w:tab/>
+      </w:r>
+      <w:r>
+        <w:rPr>
+          <w:b/>
+          <w:bCs/>
+        </w:rPr>
+        <w:tab/>
+      </w:r>
+      <w:r>
+        <w:rPr>
+          <w:b/>
+          <w:bCs/>
+        </w:rPr>
+        <w:tab/>
+      </w:r>
+      <w:r>
+        <w:rPr>
+          <w:b/>
+          <w:bCs/>
+        </w:rPr>
+        <w:t>1</w:t>
+      </w:r>
+      <w:r>
+        <w:rPr>
+          <w:b/>
+          <w:bCs/>
+        </w:rPr>
+        <w:t>8</w:t>
+      </w:r>
+    </w:p>
+    <w:p>
+      <w:r>
+        <w:tab/>
+      </w:r>
+      <w:r>
+        <w:t xml:space="preserve">5.1 </w:t>
+      </w:r>
+      <w:r>
+        <w:t>Major Development Challenges</w:t>
+      </w:r>
+      <w:r>
+        <w:tab/>
+      </w:r>
+      <w:r>
+        <w:tab/>
+      </w:r>
+      <w:r>
+        <w:tab/>
+      </w:r>
+      <w:r>
+        <w:tab/>
+      </w:r>
+      <w:r>
+        <w:tab/>
+      </w:r>
+      <w:r>
+        <w:tab/>
+      </w:r>
+      <w:r>
+        <w:t>1</w:t>
+      </w:r>
+      <w:r>
+        <w:t>8</w:t>
+      </w:r>
+    </w:p>
+    <w:p>
+      <w:r>
+        <w:tab/>
+      </w:r>
+      <w:r>
+        <w:t xml:space="preserve">5.2 </w:t>
+      </w:r>
+      <w:r>
+        <w:t>Solutions and Key Decisions</w:t>
+      </w:r>
+      <w:r>
+        <w:tab/>
+      </w:r>
+      <w:r>
+        <w:tab/>
+      </w:r>
+      <w:r>
+        <w:tab/>
+      </w:r>
+      <w:r>
+        <w:tab/>
+      </w:r>
+      <w:r>
+        <w:tab/>
+      </w:r>
+      <w:r>
+        <w:tab/>
+      </w:r>
+      <w:r>
+        <w:tab/>
+      </w:r>
+      <w:r>
+        <w:t>1</w:t>
+      </w:r>
+      <w:r>
+        <w:t>9</w:t>
+      </w:r>
+    </w:p>
+    <w:p>
+      <w:r>
+        <w:tab/>
+      </w:r>
+      <w:r>
+        <w:t xml:space="preserve">5.3 </w:t>
+      </w:r>
+      <w:r>
+        <w:t>Lessons Learned</w:t>
+      </w:r>
+      <w:r>
+        <w:tab/>
+      </w:r>
+      <w:r>
+        <w:tab/>
+      </w:r>
+      <w:r>
+        <w:tab/>
+      </w:r>
+      <w:r>
+        <w:tab/>
+      </w:r>
+      <w:r>
+        <w:tab/>
+      </w:r>
+      <w:r>
+        <w:tab/>
+      </w:r>
+      <w:r>
+        <w:tab/>
+      </w:r>
+      <w:r>
+        <w:tab/>
+      </w:r>
+      <w:r>
+        <w:tab/>
+        <w:t>20</w:t>
+      </w:r>
+    </w:p>
+    <w:p>
+      <w:r>
+        <w:rPr>
+          <w:b/>
+          <w:bCs/>
+        </w:rPr>
+        <w:t xml:space="preserve">VI. </w:t>
+      </w:r>
+      <w:r>
+        <w:rPr>
+          <w:b/>
+          <w:bCs/>
+        </w:rPr>
+        <w:t>Conclusion</w:t>
+      </w:r>
+      <w:r>
+        <w:rPr>
+          <w:b/>
+          <w:bCs/>
+        </w:rPr>
+        <w:tab/>
+      </w:r>
+      <w:r>
+        <w:rPr>
+          <w:b/>
+          <w:bCs/>
+        </w:rPr>
+        <w:tab/>
+      </w:r>
+      <w:r>
+        <w:rPr>
+          <w:b/>
+          <w:bCs/>
+        </w:rPr>
+        <w:tab/>
+      </w:r>
+      <w:r>
+        <w:rPr>
+          <w:b/>
+          <w:bCs/>
+        </w:rPr>
+        <w:tab/>
+      </w:r>
+      <w:r>
+        <w:rPr>
+          <w:b/>
+          <w:bCs/>
+        </w:rPr>
+        <w:tab/>
+      </w:r>
+      <w:r>
+        <w:rPr>
+          <w:b/>
+          <w:bCs/>
+        </w:rPr>
+        <w:tab/>
+      </w:r>
+      <w:r>
+        <w:rPr>
+          <w:b/>
+          <w:bCs/>
+        </w:rPr>
+        <w:tab/>
+      </w:r>
+      <w:r>
+        <w:rPr>
+          <w:b/>
+          <w:bCs/>
+        </w:rPr>
+        <w:tab/>
+      </w:r>
+      <w:r>
+        <w:rPr>
+          <w:b/>
+          <w:bCs/>
+        </w:rPr>
+        <w:tab/>
+      </w:r>
+      <w:r>
+        <w:rPr>
+          <w:b/>
+          <w:bCs/>
+        </w:rPr>
+        <w:tab/>
+        <w:t>21</w:t>
+      </w:r>
+      <w:r>
+        <w:rPr>
+          <w:b/>
+          <w:bCs/>
+        </w:rPr>
+        <w:tab/>
+      </w:r>
+    </w:p>
+    <w:p>
+      <w:r>
+        <w:tab/>
+      </w:r>
+      <w:r>
+        <w:t xml:space="preserve">6.1 </w:t>
+      </w:r>
+      <w:r>
+        <w:t>Project Summary</w:t>
+      </w:r>
+      <w:r>
+        <w:tab/>
+      </w:r>
+      <w:r>
+        <w:tab/>
+      </w:r>
+      <w:r>
+        <w:tab/>
+      </w:r>
+      <w:r>
+        <w:tab/>
+      </w:r>
+      <w:r>
+        <w:tab/>
+      </w:r>
+      <w:r>
+        <w:tab/>
+      </w:r>
+      <w:r>
+        <w:tab/>
+      </w:r>
+      <w:r>
+        <w:tab/>
+      </w:r>
+      <w:r>
+        <w:tab/>
+        <w:t>21</w:t>
+      </w:r>
+    </w:p>
+    <w:p>
+      <w:r>
+        <w:tab/>
+      </w:r>
+      <w:r>
+        <w:t xml:space="preserve">6.2 </w:t>
+      </w:r>
+      <w:r>
+        <w:t>Future Outlook</w:t>
+      </w:r>
+      <w:r>
+        <w:tab/>
+      </w:r>
+      <w:r>
+        <w:tab/>
+        <w:t xml:space="preserve"> </w:t>
+      </w:r>
+      <w:r>
+        <w:tab/>
+      </w:r>
+      <w:r>
+        <w:tab/>
+      </w:r>
+      <w:r>
+        <w:tab/>
+      </w:r>
+      <w:r>
+        <w:tab/>
+      </w:r>
+      <w:r>
+        <w:tab/>
+      </w:r>
+      <w:r>
+        <w:tab/>
+      </w:r>
+      <w:r>
+        <w:tab/>
+        <w:t>22</w:t>
+      </w:r>
+    </w:p>
     <w:p/>
     <w:p/>
     <w:p/>
@@ -276,12 +1532,10 @@
     <w:p/>
     <w:p/>
     <w:p/>
-    <w:p/>
-    <w:p/>
-    <w:p/>
-    <w:p/>
-    <w:p>
-      <w:pPr>
+    <w:p>
+      <w:pPr>
+        <w:pStyle w:val="ListParagraph"/>
+        <w:ind w:left="1080"/>
         <w:rPr>
           <w:b/>
           <w:bCs/>
@@ -289,44 +1543,64 @@
           <w:szCs w:val="40"/>
         </w:rPr>
       </w:pPr>
-      <w:r>
+    </w:p>
+    <w:p>
+      <w:pPr>
+        <w:pStyle w:val="ListParagraph"/>
+        <w:ind w:left="1080"/>
         <w:rPr>
           <w:b/>
           <w:bCs/>
           <w:sz w:val="40"/>
           <w:szCs w:val="40"/>
         </w:rPr>
-        <w:lastRenderedPageBreak/>
-        <w:t>I.</w:t>
-      </w:r>
-      <w:r>
+      </w:pPr>
+    </w:p>
+    <w:p>
+      <w:pPr>
         <w:rPr>
           <w:b/>
           <w:bCs/>
           <w:sz w:val="40"/>
           <w:szCs w:val="40"/>
         </w:rPr>
-        <w:t>Introduction</w:t>
-      </w:r>
-    </w:p>
-    <w:p>
-      <w:pPr>
+      </w:pPr>
+      <w:r>
         <w:rPr>
           <w:b/>
           <w:bCs/>
           <w:sz w:val="40"/>
           <w:szCs w:val="40"/>
         </w:rPr>
-      </w:pPr>
-    </w:p>
-    <w:p>
-      <w:pPr>
-        <w:pStyle w:val="ListParagraph"/>
-        <w:numPr>
-          <w:ilvl w:val="1"/>
-          <w:numId w:val="1"/>
-        </w:numPr>
-        <w:rPr>
+        <w:t>I.</w:t>
+      </w:r>
+      <w:r>
+        <w:rPr>
+          <w:b/>
+          <w:bCs/>
+          <w:sz w:val="40"/>
+          <w:szCs w:val="40"/>
+        </w:rPr>
+        <w:t xml:space="preserve"> Introduction</w:t>
+      </w:r>
+    </w:p>
+    <w:p>
+      <w:pPr>
+        <w:rPr>
+          <w:b/>
+          <w:bCs/>
+          <w:sz w:val="40"/>
+          <w:szCs w:val="40"/>
+        </w:rPr>
+      </w:pPr>
+    </w:p>
+    <w:p>
+      <w:pPr>
+        <w:rPr>
+          <w:b/>
+          <w:bCs/>
+          <w:sz w:val="40"/>
+          <w:szCs w:val="40"/>
           <w:u w:val="single"/>
         </w:rPr>
       </w:pPr>
@@ -334,6 +1608,12 @@
         <w:rPr>
           <w:u w:val="single"/>
         </w:rPr>
+        <w:t xml:space="preserve">1.1 </w:t>
+      </w:r>
+      <w:r>
+        <w:rPr>
+          <w:u w:val="single"/>
+        </w:rPr>
         <w:t>Purpose</w:t>
       </w:r>
     </w:p>
@@ -391,21 +1671,23 @@
     </w:p>
     <w:p/>
     <w:p>
-      <w:pPr>
-        <w:pStyle w:val="ListParagraph"/>
-        <w:numPr>
-          <w:ilvl w:val="1"/>
-          <w:numId w:val="1"/>
-        </w:numPr>
+      <w:r>
         <w:rPr>
           <w:u w:val="single"/>
         </w:rPr>
-      </w:pPr>
+        <w:t xml:space="preserve">1.2 </w:t>
+      </w:r>
       <w:r>
         <w:rPr>
           <w:u w:val="single"/>
         </w:rPr>
-        <w:t>Platform Overview</w:t>
+        <w:t>Platform</w:t>
+      </w:r>
+      <w:r>
+        <w:rPr>
+          <w:u w:val="single"/>
+        </w:rPr>
+        <w:t xml:space="preserve"> Overview</w:t>
       </w:r>
     </w:p>
     <w:p>
@@ -469,6 +1751,7 @@
     </w:p>
     <w:p>
       <w:r>
+        <w:lastRenderedPageBreak/>
         <w:t xml:space="preserve">Rather than functioning as a traditional portfolio website, the platform was designed as a product ecosystem that connects content, systems, and user engagement into </w:t>
       </w:r>
       <w:r>
@@ -480,82 +1763,134 @@
     </w:p>
     <w:p/>
     <w:p>
-      <w:pPr>
-        <w:pStyle w:val="ListParagraph"/>
-        <w:numPr>
-          <w:ilvl w:val="1"/>
-          <w:numId w:val="1"/>
-        </w:numPr>
+      <w:r>
         <w:rPr>
           <w:u w:val="single"/>
         </w:rPr>
-      </w:pPr>
+        <w:t xml:space="preserve">1.3 </w:t>
+      </w:r>
       <w:r>
         <w:rPr>
           <w:u w:val="single"/>
         </w:rPr>
-        <w:lastRenderedPageBreak/>
-        <w:t>Project Scope</w:t>
+        <w:t>Project</w:t>
+      </w:r>
+      <w:r>
+        <w:rPr>
+          <w:u w:val="single"/>
+        </w:rPr>
+        <w:t xml:space="preserve"> Scope</w:t>
       </w:r>
     </w:p>
     <w:p>
       <w:pPr>
         <w:pStyle w:val="isselectedend"/>
-      </w:pPr>
-      <w:r>
+        <w:rPr>
+          <w:rFonts w:asciiTheme="minorHAnsi" w:hAnsiTheme="minorHAnsi"/>
+        </w:rPr>
+      </w:pPr>
+      <w:r>
+        <w:rPr>
+          <w:rFonts w:asciiTheme="minorHAnsi" w:hAnsiTheme="minorHAnsi"/>
+        </w:rPr>
         <w:t xml:space="preserve">The scope of Version 2 of the platform focuses on improving user experience, increasing engagement, and creating measurable conversion pathways throughout the </w:t>
       </w:r>
       <w:r>
+        <w:rPr>
+          <w:rFonts w:asciiTheme="minorHAnsi" w:hAnsiTheme="minorHAnsi"/>
+        </w:rPr>
         <w:t>ecosystem. Version</w:t>
       </w:r>
       <w:r>
+        <w:rPr>
+          <w:rFonts w:asciiTheme="minorHAnsi" w:hAnsiTheme="minorHAnsi"/>
+        </w:rPr>
         <w:t xml:space="preserve"> 1’s </w:t>
       </w:r>
       <w:r>
+        <w:rPr>
+          <w:rFonts w:asciiTheme="minorHAnsi" w:hAnsiTheme="minorHAnsi"/>
+        </w:rPr>
         <w:t xml:space="preserve">primary </w:t>
       </w:r>
       <w:r>
+        <w:rPr>
+          <w:rFonts w:asciiTheme="minorHAnsi" w:hAnsiTheme="minorHAnsi"/>
+        </w:rPr>
         <w:t xml:space="preserve">goal was </w:t>
       </w:r>
       <w:r>
+        <w:rPr>
+          <w:rFonts w:asciiTheme="minorHAnsi" w:hAnsiTheme="minorHAnsi"/>
+        </w:rPr>
         <w:t xml:space="preserve">to have the skeleton for future </w:t>
       </w:r>
       <w:r>
+        <w:rPr>
+          <w:rFonts w:asciiTheme="minorHAnsi" w:hAnsiTheme="minorHAnsi"/>
+        </w:rPr>
         <w:t>versions.</w:t>
       </w:r>
     </w:p>
     <w:p>
       <w:pPr>
         <w:pStyle w:val="isselectedend"/>
-      </w:pPr>
-      <w:r>
+        <w:rPr>
+          <w:rFonts w:asciiTheme="minorHAnsi" w:hAnsiTheme="minorHAnsi"/>
+        </w:rPr>
+      </w:pPr>
+      <w:r>
+        <w:rPr>
+          <w:rFonts w:asciiTheme="minorHAnsi" w:hAnsiTheme="minorHAnsi"/>
+        </w:rPr>
         <w:t>Major areas of development include:</w:t>
       </w:r>
     </w:p>
     <w:p>
       <w:pPr>
         <w:pStyle w:val="isselectedend"/>
-      </w:pPr>
-      <w:r>
+        <w:rPr>
+          <w:rFonts w:asciiTheme="minorHAnsi" w:hAnsiTheme="minorHAnsi"/>
+        </w:rPr>
+      </w:pPr>
+      <w:r>
+        <w:rPr>
+          <w:rFonts w:asciiTheme="minorHAnsi" w:hAnsiTheme="minorHAnsi"/>
+        </w:rPr>
         <w:t>• Enhanced AI chatbot functionality</w:t>
       </w:r>
       <w:r>
+        <w:rPr>
+          <w:rFonts w:asciiTheme="minorHAnsi" w:hAnsiTheme="minorHAnsi"/>
+        </w:rPr>
         <w:br/>
         <w:t>• Newsletter integration and email capture</w:t>
       </w:r>
       <w:r>
+        <w:rPr>
+          <w:rFonts w:asciiTheme="minorHAnsi" w:hAnsiTheme="minorHAnsi"/>
+        </w:rPr>
         <w:br/>
         <w:t>• Analytics and user engagement tracking</w:t>
       </w:r>
       <w:r>
+        <w:rPr>
+          <w:rFonts w:asciiTheme="minorHAnsi" w:hAnsiTheme="minorHAnsi"/>
+        </w:rPr>
         <w:br/>
         <w:t>• Expansion of downloadable systems and programs</w:t>
       </w:r>
       <w:r>
+        <w:rPr>
+          <w:rFonts w:asciiTheme="minorHAnsi" w:hAnsiTheme="minorHAnsi"/>
+        </w:rPr>
         <w:br/>
         <w:t>• User interface and navigation improvements</w:t>
       </w:r>
       <w:r>
+        <w:rPr>
+          <w:rFonts w:asciiTheme="minorHAnsi" w:hAnsiTheme="minorHAnsi"/>
+        </w:rPr>
         <w:br/>
         <w:t>• Foundation for future community features</w:t>
       </w:r>
@@ -563,84 +1898,134 @@
     <w:p>
       <w:pPr>
         <w:pStyle w:val="NormalWeb"/>
-      </w:pPr>
-      <w:r>
+        <w:rPr>
+          <w:rFonts w:asciiTheme="minorHAnsi" w:hAnsiTheme="minorHAnsi"/>
+        </w:rPr>
+      </w:pPr>
+      <w:r>
+        <w:rPr>
+          <w:rFonts w:asciiTheme="minorHAnsi" w:hAnsiTheme="minorHAnsi"/>
+        </w:rPr>
         <w:t>These improvements support the long-term goal of transforming the website from a content hub into a scalable platform that supports audience growth, system distribution, and community engagement.</w:t>
       </w:r>
     </w:p>
     <w:p>
       <w:pPr>
-        <w:rPr>
+        <w:pStyle w:val="NormalWeb"/>
+        <w:rPr>
+          <w:rFonts w:asciiTheme="minorHAnsi" w:hAnsiTheme="minorHAnsi"/>
+        </w:rPr>
+      </w:pPr>
+    </w:p>
+    <w:p>
+      <w:pPr>
+        <w:pStyle w:val="NormalWeb"/>
+        <w:rPr>
+          <w:rFonts w:asciiTheme="minorHAnsi" w:hAnsiTheme="minorHAnsi"/>
+        </w:rPr>
+      </w:pPr>
+      <w:r>
+        <w:rPr>
+          <w:rFonts w:asciiTheme="minorHAnsi" w:hAnsiTheme="minorHAnsi"/>
           <w:u w:val="single"/>
         </w:rPr>
-      </w:pPr>
-    </w:p>
-    <w:p>
-      <w:pPr>
-        <w:pStyle w:val="ListParagraph"/>
-        <w:numPr>
-          <w:ilvl w:val="1"/>
-          <w:numId w:val="1"/>
-        </w:numPr>
-        <w:rPr>
+        <w:t xml:space="preserve">1.4 </w:t>
+      </w:r>
+      <w:r>
+        <w:rPr>
+          <w:rFonts w:asciiTheme="minorHAnsi" w:hAnsiTheme="minorHAnsi"/>
           <w:u w:val="single"/>
         </w:rPr>
-      </w:pPr>
-      <w:r>
-        <w:rPr>
-          <w:u w:val="single"/>
-        </w:rPr>
         <w:t>Project Ownership</w:t>
       </w:r>
     </w:p>
     <w:p>
       <w:pPr>
         <w:pStyle w:val="isselectedend"/>
-      </w:pPr>
-      <w:r>
+        <w:rPr>
+          <w:rFonts w:asciiTheme="minorHAnsi" w:hAnsiTheme="minorHAnsi"/>
+        </w:rPr>
+      </w:pPr>
+      <w:r>
+        <w:rPr>
+          <w:rFonts w:asciiTheme="minorHAnsi" w:hAnsiTheme="minorHAnsi"/>
+        </w:rPr>
         <w:t>This project is independently designed, developed, maintained, and managed by Jordan Burr.</w:t>
       </w:r>
     </w:p>
     <w:p>
       <w:pPr>
         <w:pStyle w:val="isselectedend"/>
-      </w:pPr>
-      <w:r>
+        <w:rPr>
+          <w:rFonts w:asciiTheme="minorHAnsi" w:hAnsiTheme="minorHAnsi"/>
+        </w:rPr>
+      </w:pPr>
+      <w:r>
+        <w:rPr>
+          <w:rFonts w:asciiTheme="minorHAnsi" w:hAnsiTheme="minorHAnsi"/>
+        </w:rPr>
         <w:t>Primary responsibilities include:</w:t>
       </w:r>
     </w:p>
     <w:p>
       <w:pPr>
         <w:pStyle w:val="isselectedend"/>
-      </w:pPr>
-      <w:r>
+        <w:rPr>
+          <w:rFonts w:asciiTheme="minorHAnsi" w:hAnsiTheme="minorHAnsi"/>
+        </w:rPr>
+      </w:pPr>
+      <w:r>
+        <w:rPr>
+          <w:rFonts w:asciiTheme="minorHAnsi" w:hAnsiTheme="minorHAnsi"/>
+        </w:rPr>
         <w:t>• Product planning and roadmap development</w:t>
       </w:r>
       <w:r>
+        <w:rPr>
+          <w:rFonts w:asciiTheme="minorHAnsi" w:hAnsiTheme="minorHAnsi"/>
+        </w:rPr>
         <w:br/>
         <w:t>• Frontend development</w:t>
       </w:r>
       <w:r>
+        <w:rPr>
+          <w:rFonts w:asciiTheme="minorHAnsi" w:hAnsiTheme="minorHAnsi"/>
+        </w:rPr>
         <w:br/>
         <w:t>• Backend development</w:t>
       </w:r>
       <w:r>
+        <w:rPr>
+          <w:rFonts w:asciiTheme="minorHAnsi" w:hAnsiTheme="minorHAnsi"/>
+        </w:rPr>
         <w:br/>
         <w:t>• Database integration</w:t>
       </w:r>
       <w:r>
+        <w:rPr>
+          <w:rFonts w:asciiTheme="minorHAnsi" w:hAnsiTheme="minorHAnsi"/>
+        </w:rPr>
         <w:br/>
         <w:t>• User experience design</w:t>
       </w:r>
       <w:r>
+        <w:rPr>
+          <w:rFonts w:asciiTheme="minorHAnsi" w:hAnsiTheme="minorHAnsi"/>
+        </w:rPr>
         <w:br/>
         <w:t>• Analytics implementation</w:t>
       </w:r>
       <w:r>
+        <w:rPr>
+          <w:rFonts w:asciiTheme="minorHAnsi" w:hAnsiTheme="minorHAnsi"/>
+        </w:rPr>
         <w:br/>
         <w:t>• Content strategy</w:t>
       </w:r>
       <w:r>
+        <w:rPr>
+          <w:rFonts w:asciiTheme="minorHAnsi" w:hAnsiTheme="minorHAnsi"/>
+        </w:rPr>
         <w:br/>
         <w:t>• Documentation and maintenance</w:t>
       </w:r>
@@ -648,30 +2033,23 @@
     <w:p>
       <w:pPr>
         <w:pStyle w:val="NormalWeb"/>
-      </w:pPr>
-      <w:r>
+        <w:rPr>
+          <w:rFonts w:asciiTheme="minorHAnsi" w:hAnsiTheme="minorHAnsi"/>
+        </w:rPr>
+      </w:pPr>
+      <w:r>
+        <w:rPr>
+          <w:rFonts w:asciiTheme="minorHAnsi" w:hAnsiTheme="minorHAnsi"/>
+        </w:rPr>
+        <w:lastRenderedPageBreak/>
         <w:t>The project serves as both a production platform for the Improving JB brand and a demonstration of full-stack product development capabilities.</w:t>
       </w:r>
     </w:p>
     <w:p>
       <w:pPr>
         <w:pStyle w:val="NormalWeb"/>
-      </w:pPr>
-    </w:p>
-    <w:p>
-      <w:pPr>
-        <w:pStyle w:val="NormalWeb"/>
-      </w:pPr>
-    </w:p>
-    <w:p>
-      <w:pPr>
-        <w:pStyle w:val="NormalWeb"/>
-      </w:pPr>
-    </w:p>
-    <w:p>
-      <w:pPr>
-        <w:pStyle w:val="NormalWeb"/>
-        <w:rPr>
+        <w:rPr>
+          <w:rFonts w:asciiTheme="minorHAnsi" w:hAnsiTheme="minorHAnsi"/>
           <w:b/>
           <w:bCs/>
           <w:sz w:val="40"/>
@@ -680,16 +2058,17 @@
       </w:pPr>
       <w:r>
         <w:rPr>
+          <w:rFonts w:asciiTheme="minorHAnsi" w:hAnsiTheme="minorHAnsi"/>
           <w:b/>
           <w:bCs/>
           <w:sz w:val="40"/>
           <w:szCs w:val="40"/>
         </w:rPr>
-        <w:lastRenderedPageBreak/>
         <w:t xml:space="preserve">II. </w:t>
       </w:r>
       <w:r>
         <w:rPr>
+          <w:rFonts w:asciiTheme="minorHAnsi" w:hAnsiTheme="minorHAnsi"/>
           <w:b/>
           <w:bCs/>
           <w:sz w:val="40"/>
@@ -712,137 +2091,253 @@
     <w:p>
       <w:pPr>
         <w:pStyle w:val="NormalWeb"/>
-      </w:pPr>
-      <w:r>
+        <w:rPr>
+          <w:rFonts w:asciiTheme="minorHAnsi" w:hAnsiTheme="minorHAnsi"/>
+          <w:u w:val="single"/>
+        </w:rPr>
+      </w:pPr>
+      <w:r>
+        <w:rPr>
+          <w:rFonts w:asciiTheme="minorHAnsi" w:hAnsiTheme="minorHAnsi"/>
+          <w:u w:val="single"/>
+        </w:rPr>
         <w:t>2.1 Development Methodology</w:t>
       </w:r>
     </w:p>
     <w:p>
       <w:pPr>
         <w:pStyle w:val="NormalWeb"/>
-      </w:pPr>
-      <w:r>
+        <w:rPr>
+          <w:rFonts w:asciiTheme="minorHAnsi" w:hAnsiTheme="minorHAnsi"/>
+        </w:rPr>
+      </w:pPr>
+      <w:r>
+        <w:rPr>
+          <w:rFonts w:asciiTheme="minorHAnsi" w:hAnsiTheme="minorHAnsi"/>
+        </w:rPr>
         <w:t xml:space="preserve">The </w:t>
       </w:r>
       <w:r>
+        <w:rPr>
+          <w:rFonts w:asciiTheme="minorHAnsi" w:hAnsiTheme="minorHAnsi"/>
+        </w:rPr>
         <w:t>platform</w:t>
       </w:r>
       <w:r>
+        <w:rPr>
+          <w:rFonts w:asciiTheme="minorHAnsi" w:hAnsiTheme="minorHAnsi"/>
+        </w:rPr>
         <w:t xml:space="preserve"> is developed using an iterative product development approach focused on continuous improvement, user feedback, and incremental feature releases. Rather than attempting to build every feature at once, development is organized into version-based milestones that allow new functionality to be tested and refined over time.</w:t>
       </w:r>
     </w:p>
     <w:p>
       <w:pPr>
         <w:pStyle w:val="NormalWeb"/>
-      </w:pPr>
-      <w:r>
+        <w:rPr>
+          <w:rFonts w:asciiTheme="minorHAnsi" w:hAnsiTheme="minorHAnsi"/>
+        </w:rPr>
+      </w:pPr>
+      <w:r>
+        <w:rPr>
+          <w:rFonts w:asciiTheme="minorHAnsi" w:hAnsiTheme="minorHAnsi"/>
+        </w:rPr>
         <w:t xml:space="preserve">This approach enables rapid experimentation while maintaining </w:t>
       </w:r>
       <w:r>
+        <w:rPr>
+          <w:rFonts w:asciiTheme="minorHAnsi" w:hAnsiTheme="minorHAnsi"/>
+        </w:rPr>
         <w:t>an enjoyable</w:t>
       </w:r>
       <w:r>
+        <w:rPr>
+          <w:rFonts w:asciiTheme="minorHAnsi" w:hAnsiTheme="minorHAnsi"/>
+        </w:rPr>
         <w:t xml:space="preserve"> user experience. Features are prioritized based on their potential impact on user engagement, platform growth, and overall ecosystem value.</w:t>
       </w:r>
     </w:p>
     <w:p>
       <w:pPr>
         <w:pStyle w:val="NormalWeb"/>
-      </w:pPr>
-      <w:r>
+        <w:rPr>
+          <w:rFonts w:asciiTheme="minorHAnsi" w:hAnsiTheme="minorHAnsi"/>
+        </w:rPr>
+      </w:pPr>
+      <w:r>
+        <w:rPr>
+          <w:rFonts w:asciiTheme="minorHAnsi" w:hAnsiTheme="minorHAnsi"/>
+        </w:rPr>
         <w:t>Examples of major development milestones include:</w:t>
       </w:r>
     </w:p>
     <w:p>
       <w:pPr>
         <w:pStyle w:val="NormalWeb"/>
-      </w:pPr>
-      <w:r>
+        <w:rPr>
+          <w:rFonts w:asciiTheme="minorHAnsi" w:hAnsiTheme="minorHAnsi"/>
+        </w:rPr>
+      </w:pPr>
+      <w:r>
+        <w:rPr>
+          <w:rFonts w:asciiTheme="minorHAnsi" w:hAnsiTheme="minorHAnsi"/>
+        </w:rPr>
         <w:t>• Version 1 – Initial website launch and core platform structure</w:t>
       </w:r>
       <w:r>
+        <w:rPr>
+          <w:rFonts w:asciiTheme="minorHAnsi" w:hAnsiTheme="minorHAnsi"/>
+        </w:rPr>
         <w:br/>
         <w:t>• Version 2 – Newsletter integration, analytics implementation, chatbot improvements, and system expansion</w:t>
       </w:r>
       <w:r>
+        <w:rPr>
+          <w:rFonts w:asciiTheme="minorHAnsi" w:hAnsiTheme="minorHAnsi"/>
+        </w:rPr>
         <w:br/>
         <w:t>• Version 3 – Community functionality</w:t>
       </w:r>
       <w:r>
+        <w:rPr>
+          <w:rFonts w:asciiTheme="minorHAnsi" w:hAnsiTheme="minorHAnsi"/>
+        </w:rPr>
         <w:t>, further system expansion,</w:t>
       </w:r>
       <w:r>
+        <w:rPr>
+          <w:rFonts w:asciiTheme="minorHAnsi" w:hAnsiTheme="minorHAnsi"/>
+        </w:rPr>
         <w:t xml:space="preserve"> and additional engagement features</w:t>
       </w:r>
     </w:p>
     <w:p>
       <w:pPr>
         <w:pStyle w:val="NormalWeb"/>
-      </w:pPr>
-      <w:r>
+        <w:rPr>
+          <w:rFonts w:asciiTheme="minorHAnsi" w:hAnsiTheme="minorHAnsi"/>
+        </w:rPr>
+      </w:pPr>
+      <w:r>
+        <w:rPr>
+          <w:rFonts w:asciiTheme="minorHAnsi" w:hAnsiTheme="minorHAnsi"/>
+        </w:rPr>
         <w:t>This methodology allows the platform to</w:t>
       </w:r>
       <w:r>
+        <w:rPr>
+          <w:rFonts w:asciiTheme="minorHAnsi" w:hAnsiTheme="minorHAnsi"/>
+        </w:rPr>
         <w:t xml:space="preserve"> gradually</w:t>
       </w:r>
       <w:r>
+        <w:rPr>
+          <w:rFonts w:asciiTheme="minorHAnsi" w:hAnsiTheme="minorHAnsi"/>
+        </w:rPr>
         <w:t xml:space="preserve"> evolve based on observed user behavior, feedback, and future business objectives.</w:t>
       </w:r>
     </w:p>
     <w:p>
       <w:pPr>
         <w:pStyle w:val="NormalWeb"/>
+        <w:rPr>
+          <w:rFonts w:asciiTheme="minorHAnsi" w:hAnsiTheme="minorHAnsi"/>
+        </w:rPr>
       </w:pPr>
     </w:p>
     <w:p>
       <w:pPr>
         <w:pStyle w:val="NormalWeb"/>
-      </w:pPr>
-      <w:r>
+        <w:rPr>
+          <w:rFonts w:asciiTheme="minorHAnsi" w:hAnsiTheme="minorHAnsi"/>
+          <w:u w:val="single"/>
+        </w:rPr>
+      </w:pPr>
+      <w:r>
+        <w:rPr>
+          <w:rFonts w:asciiTheme="minorHAnsi" w:hAnsiTheme="minorHAnsi"/>
+          <w:u w:val="single"/>
+        </w:rPr>
         <w:t>2.2 Technical Stack and Development Environment</w:t>
       </w:r>
       <w:r>
+        <w:rPr>
+          <w:rFonts w:asciiTheme="minorHAnsi" w:hAnsiTheme="minorHAnsi"/>
+          <w:u w:val="single"/>
+        </w:rPr>
         <w:t xml:space="preserve"> </w:t>
       </w:r>
     </w:p>
     <w:p>
       <w:pPr>
         <w:pStyle w:val="NormalWeb"/>
-      </w:pPr>
-      <w:r>
+        <w:rPr>
+          <w:rFonts w:asciiTheme="minorHAnsi" w:hAnsiTheme="minorHAnsi"/>
+        </w:rPr>
+      </w:pPr>
+      <w:r>
+        <w:rPr>
+          <w:rFonts w:asciiTheme="minorHAnsi" w:hAnsiTheme="minorHAnsi"/>
+        </w:rPr>
         <w:t xml:space="preserve">The platform utilizes a modern full-stack web development architecture designed </w:t>
       </w:r>
       <w:r>
+        <w:rPr>
+          <w:rFonts w:asciiTheme="minorHAnsi" w:hAnsiTheme="minorHAnsi"/>
+        </w:rPr>
         <w:t>to target</w:t>
       </w:r>
       <w:r>
+        <w:rPr>
+          <w:rFonts w:asciiTheme="minorHAnsi" w:hAnsiTheme="minorHAnsi"/>
+        </w:rPr>
         <w:t xml:space="preserve"> scalability, maintainability, and rapid iteration.</w:t>
       </w:r>
     </w:p>
     <w:p>
       <w:pPr>
         <w:pStyle w:val="NormalWeb"/>
-      </w:pPr>
-      <w:r>
+        <w:rPr>
+          <w:rFonts w:asciiTheme="minorHAnsi" w:hAnsiTheme="minorHAnsi"/>
+        </w:rPr>
+      </w:pPr>
+      <w:r>
+        <w:rPr>
+          <w:rFonts w:asciiTheme="minorHAnsi" w:hAnsiTheme="minorHAnsi"/>
+        </w:rPr>
         <w:t>Frontend Technologies</w:t>
       </w:r>
     </w:p>
     <w:p>
       <w:pPr>
         <w:pStyle w:val="NormalWeb"/>
-      </w:pPr>
-      <w:r>
+        <w:rPr>
+          <w:rFonts w:asciiTheme="minorHAnsi" w:hAnsiTheme="minorHAnsi"/>
+        </w:rPr>
+      </w:pPr>
+      <w:r>
+        <w:rPr>
+          <w:rFonts w:asciiTheme="minorHAnsi" w:hAnsiTheme="minorHAnsi"/>
+        </w:rPr>
         <w:t>• React</w:t>
       </w:r>
       <w:r>
+        <w:rPr>
+          <w:rFonts w:asciiTheme="minorHAnsi" w:hAnsiTheme="minorHAnsi"/>
+        </w:rPr>
         <w:br/>
         <w:t>• Vite</w:t>
       </w:r>
       <w:r>
+        <w:rPr>
+          <w:rFonts w:asciiTheme="minorHAnsi" w:hAnsiTheme="minorHAnsi"/>
+        </w:rPr>
         <w:br/>
         <w:t>• JavaScript</w:t>
       </w:r>
       <w:r>
+        <w:rPr>
+          <w:rFonts w:asciiTheme="minorHAnsi" w:hAnsiTheme="minorHAnsi"/>
+        </w:rPr>
         <w:br/>
         <w:t>• CSS</w:t>
       </w:r>
@@ -850,34 +2345,61 @@
     <w:p>
       <w:pPr>
         <w:pStyle w:val="NormalWeb"/>
-      </w:pPr>
-      <w:r>
+        <w:rPr>
+          <w:rFonts w:asciiTheme="minorHAnsi" w:hAnsiTheme="minorHAnsi"/>
+        </w:rPr>
+      </w:pPr>
+      <w:r>
+        <w:rPr>
+          <w:rFonts w:asciiTheme="minorHAnsi" w:hAnsiTheme="minorHAnsi"/>
+        </w:rPr>
+        <w:lastRenderedPageBreak/>
         <w:t xml:space="preserve">The frontend is </w:t>
       </w:r>
       <w:r>
+        <w:rPr>
+          <w:rFonts w:asciiTheme="minorHAnsi" w:hAnsiTheme="minorHAnsi"/>
+        </w:rPr>
         <w:t xml:space="preserve">mainly </w:t>
       </w:r>
       <w:r>
+        <w:rPr>
+          <w:rFonts w:asciiTheme="minorHAnsi" w:hAnsiTheme="minorHAnsi"/>
+        </w:rPr>
         <w:t>responsible for user interface design, page navigation, responsive layouts, and system presentation.</w:t>
       </w:r>
     </w:p>
     <w:p>
       <w:pPr>
         <w:pStyle w:val="NormalWeb"/>
-      </w:pPr>
-      <w:r>
-        <w:lastRenderedPageBreak/>
+        <w:rPr>
+          <w:rFonts w:asciiTheme="minorHAnsi" w:hAnsiTheme="minorHAnsi"/>
+        </w:rPr>
+      </w:pPr>
+      <w:r>
+        <w:rPr>
+          <w:rFonts w:asciiTheme="minorHAnsi" w:hAnsiTheme="minorHAnsi"/>
+        </w:rPr>
         <w:t>Backend Technologies</w:t>
       </w:r>
     </w:p>
     <w:p>
       <w:pPr>
         <w:pStyle w:val="NormalWeb"/>
-      </w:pPr>
-      <w:r>
+        <w:rPr>
+          <w:rFonts w:asciiTheme="minorHAnsi" w:hAnsiTheme="minorHAnsi"/>
+        </w:rPr>
+      </w:pPr>
+      <w:r>
+        <w:rPr>
+          <w:rFonts w:asciiTheme="minorHAnsi" w:hAnsiTheme="minorHAnsi"/>
+        </w:rPr>
         <w:t>• Node.js</w:t>
       </w:r>
       <w:r>
+        <w:rPr>
+          <w:rFonts w:asciiTheme="minorHAnsi" w:hAnsiTheme="minorHAnsi"/>
+        </w:rPr>
         <w:br/>
         <w:t>• Express.js</w:t>
       </w:r>
@@ -885,51 +2407,90 @@
     <w:p>
       <w:pPr>
         <w:pStyle w:val="NormalWeb"/>
-      </w:pPr>
-      <w:r>
+        <w:rPr>
+          <w:rFonts w:asciiTheme="minorHAnsi" w:hAnsiTheme="minorHAnsi"/>
+        </w:rPr>
+      </w:pPr>
+      <w:r>
+        <w:rPr>
+          <w:rFonts w:asciiTheme="minorHAnsi" w:hAnsiTheme="minorHAnsi"/>
+        </w:rPr>
         <w:t>The backend manages API endpoints, chatbot requests, newsletter integrations, analytics collection, and future platform services.</w:t>
       </w:r>
     </w:p>
     <w:p>
       <w:pPr>
         <w:pStyle w:val="NormalWeb"/>
-      </w:pPr>
-      <w:r>
+        <w:rPr>
+          <w:rFonts w:asciiTheme="minorHAnsi" w:hAnsiTheme="minorHAnsi"/>
+        </w:rPr>
+      </w:pPr>
+      <w:r>
+        <w:rPr>
+          <w:rFonts w:asciiTheme="minorHAnsi" w:hAnsiTheme="minorHAnsi"/>
+        </w:rPr>
         <w:t>Artificial Intelligence Integration</w:t>
       </w:r>
     </w:p>
     <w:p>
       <w:pPr>
         <w:pStyle w:val="NormalWeb"/>
-      </w:pPr>
-      <w:r>
+        <w:rPr>
+          <w:rFonts w:asciiTheme="minorHAnsi" w:hAnsiTheme="minorHAnsi"/>
+        </w:rPr>
+      </w:pPr>
+      <w:r>
+        <w:rPr>
+          <w:rFonts w:asciiTheme="minorHAnsi" w:hAnsiTheme="minorHAnsi"/>
+        </w:rPr>
         <w:t>• OpenAI API</w:t>
       </w:r>
     </w:p>
     <w:p>
       <w:pPr>
         <w:pStyle w:val="NormalWeb"/>
-      </w:pPr>
-      <w:r>
+        <w:rPr>
+          <w:rFonts w:asciiTheme="minorHAnsi" w:hAnsiTheme="minorHAnsi"/>
+        </w:rPr>
+      </w:pPr>
+      <w:r>
+        <w:rPr>
+          <w:rFonts w:asciiTheme="minorHAnsi" w:hAnsiTheme="minorHAnsi"/>
+        </w:rPr>
         <w:t>The AI assistant is integrated into the platform to help visitors navigate the website, understand available systems, and learn more about the Improving JB ecosystem.</w:t>
       </w:r>
     </w:p>
     <w:p>
       <w:pPr>
         <w:pStyle w:val="NormalWeb"/>
-      </w:pPr>
-      <w:r>
+        <w:rPr>
+          <w:rFonts w:asciiTheme="minorHAnsi" w:hAnsiTheme="minorHAnsi"/>
+        </w:rPr>
+      </w:pPr>
+      <w:r>
+        <w:rPr>
+          <w:rFonts w:asciiTheme="minorHAnsi" w:hAnsiTheme="minorHAnsi"/>
+        </w:rPr>
         <w:t>Database and Data Management</w:t>
       </w:r>
     </w:p>
     <w:p>
       <w:pPr>
         <w:pStyle w:val="NormalWeb"/>
-      </w:pPr>
-      <w:r>
+        <w:rPr>
+          <w:rFonts w:asciiTheme="minorHAnsi" w:hAnsiTheme="minorHAnsi"/>
+        </w:rPr>
+      </w:pPr>
+      <w:r>
+        <w:rPr>
+          <w:rFonts w:asciiTheme="minorHAnsi" w:hAnsiTheme="minorHAnsi"/>
+        </w:rPr>
         <w:t>• Supabase</w:t>
       </w:r>
       <w:r>
+        <w:rPr>
+          <w:rFonts w:asciiTheme="minorHAnsi" w:hAnsiTheme="minorHAnsi"/>
+        </w:rPr>
         <w:br/>
         <w:t>• PostgreSQL</w:t>
       </w:r>
@@ -937,27 +2498,48 @@
     <w:p>
       <w:pPr>
         <w:pStyle w:val="NormalWeb"/>
-      </w:pPr>
-      <w:r>
+        <w:rPr>
+          <w:rFonts w:asciiTheme="minorHAnsi" w:hAnsiTheme="minorHAnsi"/>
+        </w:rPr>
+      </w:pPr>
+      <w:r>
+        <w:rPr>
+          <w:rFonts w:asciiTheme="minorHAnsi" w:hAnsiTheme="minorHAnsi"/>
+        </w:rPr>
         <w:t>Database functionality is used for newsletter subscriber management, analytics tracking, and future platform features.</w:t>
       </w:r>
     </w:p>
     <w:p>
       <w:pPr>
         <w:pStyle w:val="NormalWeb"/>
-      </w:pPr>
-      <w:r>
+        <w:rPr>
+          <w:rFonts w:asciiTheme="minorHAnsi" w:hAnsiTheme="minorHAnsi"/>
+        </w:rPr>
+      </w:pPr>
+      <w:r>
+        <w:rPr>
+          <w:rFonts w:asciiTheme="minorHAnsi" w:hAnsiTheme="minorHAnsi"/>
+        </w:rPr>
         <w:t>Deployment and Hosting</w:t>
       </w:r>
     </w:p>
     <w:p>
       <w:pPr>
         <w:pStyle w:val="NormalWeb"/>
-      </w:pPr>
-      <w:r>
+        <w:rPr>
+          <w:rFonts w:asciiTheme="minorHAnsi" w:hAnsiTheme="minorHAnsi"/>
+        </w:rPr>
+      </w:pPr>
+      <w:r>
+        <w:rPr>
+          <w:rFonts w:asciiTheme="minorHAnsi" w:hAnsiTheme="minorHAnsi"/>
+        </w:rPr>
         <w:t>• Vercel</w:t>
       </w:r>
       <w:r>
+        <w:rPr>
+          <w:rFonts w:asciiTheme="minorHAnsi" w:hAnsiTheme="minorHAnsi"/>
+        </w:rPr>
         <w:br/>
         <w:t>• Railway</w:t>
       </w:r>
@@ -965,41 +2547,74 @@
     <w:p>
       <w:pPr>
         <w:pStyle w:val="NormalWeb"/>
-      </w:pPr>
-      <w:r>
+        <w:rPr>
+          <w:rFonts w:asciiTheme="minorHAnsi" w:hAnsiTheme="minorHAnsi"/>
+        </w:rPr>
+      </w:pPr>
+      <w:r>
+        <w:rPr>
+          <w:rFonts w:asciiTheme="minorHAnsi" w:hAnsiTheme="minorHAnsi"/>
+        </w:rPr>
         <w:t xml:space="preserve">The frontend and backend are deployed </w:t>
       </w:r>
       <w:r>
+        <w:rPr>
+          <w:rFonts w:asciiTheme="minorHAnsi" w:hAnsiTheme="minorHAnsi"/>
+        </w:rPr>
         <w:t>each separately</w:t>
       </w:r>
       <w:r>
+        <w:rPr>
+          <w:rFonts w:asciiTheme="minorHAnsi" w:hAnsiTheme="minorHAnsi"/>
+        </w:rPr>
         <w:t xml:space="preserve"> to improve reliability and simplify future updates.</w:t>
       </w:r>
     </w:p>
     <w:p>
       <w:pPr>
         <w:pStyle w:val="NormalWeb"/>
-      </w:pPr>
-      <w:r>
+        <w:rPr>
+          <w:rFonts w:asciiTheme="minorHAnsi" w:hAnsiTheme="minorHAnsi"/>
+        </w:rPr>
+      </w:pPr>
+      <w:r>
+        <w:rPr>
+          <w:rFonts w:asciiTheme="minorHAnsi" w:hAnsiTheme="minorHAnsi"/>
+        </w:rPr>
         <w:t>Development Tools</w:t>
       </w:r>
     </w:p>
     <w:p>
       <w:pPr>
         <w:pStyle w:val="NormalWeb"/>
-      </w:pPr>
-      <w:r>
+        <w:rPr>
+          <w:rFonts w:asciiTheme="minorHAnsi" w:hAnsiTheme="minorHAnsi"/>
+        </w:rPr>
+      </w:pPr>
+      <w:r>
+        <w:rPr>
+          <w:rFonts w:asciiTheme="minorHAnsi" w:hAnsiTheme="minorHAnsi"/>
+        </w:rPr>
         <w:t>• GitHub</w:t>
       </w:r>
       <w:r>
+        <w:rPr>
+          <w:rFonts w:asciiTheme="minorHAnsi" w:hAnsiTheme="minorHAnsi"/>
+        </w:rPr>
         <w:br/>
         <w:t>• Visual Studio Code</w:t>
       </w:r>
       <w:r>
+        <w:rPr>
+          <w:rFonts w:asciiTheme="minorHAnsi" w:hAnsiTheme="minorHAnsi"/>
+        </w:rPr>
         <w:br/>
         <w:t>• Postman</w:t>
       </w:r>
       <w:r>
+        <w:rPr>
+          <w:rFonts w:asciiTheme="minorHAnsi" w:hAnsiTheme="minorHAnsi"/>
+        </w:rPr>
         <w:br/>
         <w:t>• Thunder Client</w:t>
       </w:r>
@@ -1007,8 +2622,14 @@
     <w:p>
       <w:pPr>
         <w:pStyle w:val="NormalWeb"/>
-      </w:pPr>
-      <w:r>
+        <w:rPr>
+          <w:rFonts w:asciiTheme="minorHAnsi" w:hAnsiTheme="minorHAnsi"/>
+        </w:rPr>
+      </w:pPr>
+      <w:r>
+        <w:rPr>
+          <w:rFonts w:asciiTheme="minorHAnsi" w:hAnsiTheme="minorHAnsi"/>
+        </w:rPr>
         <w:t>These tools are used for version control, testing, debugging, and ongoing platform maintenance.</w:t>
       </w:r>
     </w:p>
@@ -1020,19 +2641,16 @@
     <w:p>
       <w:pPr>
         <w:pStyle w:val="NormalWeb"/>
-      </w:pPr>
-    </w:p>
-    <w:p>
-      <w:pPr>
-        <w:pStyle w:val="NormalWeb"/>
-      </w:pPr>
-    </w:p>
-    <w:p>
-      <w:pPr>
-        <w:pStyle w:val="NormalWeb"/>
-      </w:pPr>
-      <w:r>
-        <w:lastRenderedPageBreak/>
+        <w:rPr>
+          <w:rFonts w:asciiTheme="minorHAnsi" w:hAnsiTheme="minorHAnsi"/>
+          <w:u w:val="single"/>
+        </w:rPr>
+      </w:pPr>
+      <w:r>
+        <w:rPr>
+          <w:rFonts w:asciiTheme="minorHAnsi" w:hAnsiTheme="minorHAnsi"/>
+          <w:u w:val="single"/>
+        </w:rPr>
         <w:t>2.3 Version Control and Development Practices</w:t>
       </w:r>
     </w:p>
@@ -1242,8 +2860,14 @@
         <w:tabs>
           <w:tab w:val="left" w:pos="6530"/>
         </w:tabs>
-      </w:pPr>
-      <w:r>
+        <w:rPr>
+          <w:u w:val="single"/>
+        </w:rPr>
+      </w:pPr>
+      <w:r>
+        <w:rPr>
+          <w:u w:val="single"/>
+        </w:rPr>
         <w:t>3.1 Architecture Overview</w:t>
       </w:r>
     </w:p>
@@ -1298,6 +2922,7 @@
         </w:tabs>
       </w:pPr>
       <w:r>
+        <w:lastRenderedPageBreak/>
         <w:t>Maintainability through</w:t>
       </w:r>
       <w:r>
@@ -1318,7 +2943,6 @@
         </w:tabs>
       </w:pPr>
       <w:r>
-        <w:lastRenderedPageBreak/>
         <w:t xml:space="preserve">Separation of concerns between </w:t>
       </w:r>
       <w:r>
@@ -1437,8 +3061,14 @@
         <w:tabs>
           <w:tab w:val="left" w:pos="6530"/>
         </w:tabs>
-      </w:pPr>
-      <w:r>
+        <w:rPr>
+          <w:u w:val="single"/>
+        </w:rPr>
+      </w:pPr>
+      <w:r>
+        <w:rPr>
+          <w:u w:val="single"/>
+        </w:rPr>
         <w:t>3.2 Frontend Architecture</w:t>
       </w:r>
     </w:p>
@@ -1449,7 +3079,13 @@
         </w:tabs>
       </w:pPr>
       <w:r>
-        <w:t>The frontend is responsible for presenting all user-facing functionality and serves as the primary interaction layer o</w:t>
+        <w:t xml:space="preserve">The </w:t>
+      </w:r>
+      <w:r>
+        <w:t>frontend</w:t>
+      </w:r>
+      <w:r>
+        <w:t xml:space="preserve"> is responsible for presenting all user-facing functionality and serves as the primary interaction layer o</w:t>
       </w:r>
       <w:r>
         <w:t>n</w:t>
@@ -1573,6 +3209,7 @@
         </w:tabs>
       </w:pPr>
       <w:r>
+        <w:lastRenderedPageBreak/>
         <w:t xml:space="preserve">Chatbot interface </w:t>
       </w:r>
     </w:p>
@@ -1587,7 +3224,6 @@
         </w:tabs>
       </w:pPr>
       <w:r>
-        <w:lastRenderedPageBreak/>
         <w:t xml:space="preserve">Newsletter signup </w:t>
       </w:r>
     </w:p>
@@ -1827,9 +3463,14 @@
         <w:tabs>
           <w:tab w:val="left" w:pos="6530"/>
         </w:tabs>
-      </w:pPr>
-      <w:r>
-        <w:lastRenderedPageBreak/>
+        <w:rPr>
+          <w:u w:val="single"/>
+        </w:rPr>
+      </w:pPr>
+      <w:r>
+        <w:rPr>
+          <w:u w:val="single"/>
+        </w:rPr>
         <w:t>3.3 Backend Architecture</w:t>
       </w:r>
     </w:p>
@@ -2011,8 +3652,14 @@
         <w:tabs>
           <w:tab w:val="left" w:pos="6530"/>
         </w:tabs>
-      </w:pPr>
-      <w:r>
+        <w:rPr>
+          <w:u w:val="single"/>
+        </w:rPr>
+      </w:pPr>
+      <w:r>
+        <w:rPr>
+          <w:u w:val="single"/>
+        </w:rPr>
         <w:t>3.4 Artificial Intelligence System</w:t>
       </w:r>
     </w:p>
@@ -2119,6 +3766,7 @@
         </w:tabs>
       </w:pPr>
       <w:r>
+        <w:lastRenderedPageBreak/>
         <w:t xml:space="preserve">Explain YouTube content </w:t>
       </w:r>
     </w:p>
@@ -2133,7 +3781,6 @@
         </w:tabs>
       </w:pPr>
       <w:r>
-        <w:lastRenderedPageBreak/>
         <w:t>Introducing</w:t>
       </w:r>
       <w:r>
@@ -2348,8 +3995,15 @@
         <w:tabs>
           <w:tab w:val="left" w:pos="6530"/>
         </w:tabs>
-      </w:pPr>
-      <w:r>
+        <w:rPr>
+          <w:u w:val="single"/>
+        </w:rPr>
+      </w:pPr>
+      <w:r>
+        <w:rPr>
+          <w:u w:val="single"/>
+        </w:rPr>
+        <w:lastRenderedPageBreak/>
         <w:t>3.5 Analytics Architecture</w:t>
       </w:r>
     </w:p>
@@ -2360,7 +4014,6 @@
         </w:tabs>
       </w:pPr>
       <w:r>
-        <w:lastRenderedPageBreak/>
         <w:t>The analytics system was implemented to better understand user behavior and measure the effectiveness of the platform.</w:t>
       </w:r>
     </w:p>
@@ -2455,8 +4108,14 @@
         <w:tabs>
           <w:tab w:val="left" w:pos="6530"/>
         </w:tabs>
-      </w:pPr>
-      <w:r>
+        <w:rPr>
+          <w:u w:val="single"/>
+        </w:rPr>
+      </w:pPr>
+      <w:r>
+        <w:rPr>
+          <w:u w:val="single"/>
+        </w:rPr>
         <w:t>3.6 Newsletter Infrastructure</w:t>
       </w:r>
     </w:p>
@@ -2682,8 +4341,14 @@
         <w:tabs>
           <w:tab w:val="left" w:pos="6530"/>
         </w:tabs>
-      </w:pPr>
-      <w:r>
+        <w:rPr>
+          <w:u w:val="single"/>
+        </w:rPr>
+      </w:pPr>
+      <w:r>
+        <w:rPr>
+          <w:u w:val="single"/>
+        </w:rPr>
         <w:t>3.7 Security &amp; Reliability</w:t>
       </w:r>
     </w:p>
@@ -2794,8 +4459,14 @@
         <w:tabs>
           <w:tab w:val="left" w:pos="6530"/>
         </w:tabs>
-      </w:pPr>
-      <w:r>
+        <w:rPr>
+          <w:u w:val="single"/>
+        </w:rPr>
+      </w:pPr>
+      <w:r>
+        <w:rPr>
+          <w:u w:val="single"/>
+        </w:rPr>
         <w:t>3.8 Future Architecture Expansion</w:t>
       </w:r>
     </w:p>
@@ -2897,13 +4568,6 @@
         <w:tabs>
           <w:tab w:val="left" w:pos="6530"/>
         </w:tabs>
-      </w:pPr>
-    </w:p>
-    <w:p>
-      <w:pPr>
-        <w:tabs>
-          <w:tab w:val="left" w:pos="6530"/>
-        </w:tabs>
         <w:rPr>
           <w:b/>
           <w:bCs/>
@@ -2942,8 +4606,14 @@
         <w:tabs>
           <w:tab w:val="left" w:pos="6530"/>
         </w:tabs>
-      </w:pPr>
-      <w:r>
+        <w:rPr>
+          <w:u w:val="single"/>
+        </w:rPr>
+      </w:pPr>
+      <w:r>
+        <w:rPr>
+          <w:u w:val="single"/>
+        </w:rPr>
         <w:t>4.1 Major Deliverables Completed</w:t>
       </w:r>
     </w:p>
@@ -2977,7 +4647,22 @@
           <w:tab w:val="left" w:pos="6530"/>
         </w:tabs>
       </w:pPr>
-      <w:r>
+    </w:p>
+    <w:p>
+      <w:pPr>
+        <w:tabs>
+          <w:tab w:val="left" w:pos="6530"/>
+        </w:tabs>
+      </w:pPr>
+    </w:p>
+    <w:p>
+      <w:pPr>
+        <w:tabs>
+          <w:tab w:val="left" w:pos="6530"/>
+        </w:tabs>
+      </w:pPr>
+      <w:r>
+        <w:lastRenderedPageBreak/>
         <w:t>Completed Deliverables:</w:t>
       </w:r>
     </w:p>
@@ -2987,8 +4672,14 @@
           <w:tab w:val="left" w:pos="6530"/>
         </w:tabs>
       </w:pPr>
-      <w:r>
-        <w:lastRenderedPageBreak/>
+    </w:p>
+    <w:p>
+      <w:pPr>
+        <w:tabs>
+          <w:tab w:val="left" w:pos="6530"/>
+        </w:tabs>
+      </w:pPr>
+      <w:r>
         <w:t>• Responsive multi-page website</w:t>
       </w:r>
       <w:r>
@@ -3074,17 +4765,16 @@
         <w:tabs>
           <w:tab w:val="left" w:pos="6530"/>
         </w:tabs>
-      </w:pPr>
-      <w:r>
+        <w:rPr>
+          <w:u w:val="single"/>
+        </w:rPr>
+      </w:pPr>
+      <w:r>
+        <w:rPr>
+          <w:u w:val="single"/>
+        </w:rPr>
         <w:t>4.2 Version 2 Development Timeline</w:t>
       </w:r>
-    </w:p>
-    <w:p>
-      <w:pPr>
-        <w:tabs>
-          <w:tab w:val="left" w:pos="6530"/>
-        </w:tabs>
-      </w:pPr>
     </w:p>
     <w:p>
       <w:pPr>
@@ -3326,6 +5016,9 @@
               <w:tabs>
                 <w:tab w:val="left" w:pos="6530"/>
               </w:tabs>
+              <w:rPr>
+                <w:u w:val="single"/>
+              </w:rPr>
             </w:pPr>
             <w:r>
               <w:t>6/9/2026</w:t>
@@ -3360,7 +5053,7 @@
               </w:tabs>
             </w:pPr>
             <w:r>
-              <w:t>?</w:t>
+              <w:t>6/17/2026</w:t>
             </w:r>
           </w:p>
         </w:tc>
@@ -3408,17 +5101,16 @@
         <w:tabs>
           <w:tab w:val="left" w:pos="6530"/>
         </w:tabs>
-      </w:pPr>
-      <w:r>
+        <w:rPr>
+          <w:u w:val="single"/>
+        </w:rPr>
+      </w:pPr>
+      <w:r>
+        <w:rPr>
+          <w:u w:val="single"/>
+        </w:rPr>
         <w:t>4.3 Future Roadmap &amp; Planned Enhancements</w:t>
       </w:r>
-    </w:p>
-    <w:p>
-      <w:pPr>
-        <w:tabs>
-          <w:tab w:val="left" w:pos="6530"/>
-        </w:tabs>
-      </w:pPr>
     </w:p>
     <w:p>
       <w:pPr>
@@ -3656,20 +5348,37 @@
         <w:tabs>
           <w:tab w:val="left" w:pos="6530"/>
         </w:tabs>
-      </w:pPr>
-    </w:p>
-    <w:p>
-      <w:pPr>
-        <w:pStyle w:val="ListParagraph"/>
-        <w:numPr>
-          <w:ilvl w:val="1"/>
-          <w:numId w:val="19"/>
-        </w:numPr>
-        <w:tabs>
-          <w:tab w:val="left" w:pos="6530"/>
-        </w:tabs>
-      </w:pPr>
-      <w:r>
+        <w:rPr>
+          <w:b/>
+          <w:bCs/>
+          <w:sz w:val="40"/>
+          <w:szCs w:val="40"/>
+        </w:rPr>
+      </w:pPr>
+    </w:p>
+    <w:p>
+      <w:pPr>
+        <w:tabs>
+          <w:tab w:val="left" w:pos="6530"/>
+        </w:tabs>
+        <w:rPr>
+          <w:b/>
+          <w:bCs/>
+          <w:sz w:val="40"/>
+          <w:szCs w:val="40"/>
+          <w:u w:val="single"/>
+        </w:rPr>
+      </w:pPr>
+      <w:r>
+        <w:rPr>
+          <w:u w:val="single"/>
+        </w:rPr>
+        <w:t xml:space="preserve">5.1 </w:t>
+      </w:r>
+      <w:r>
+        <w:rPr>
+          <w:u w:val="single"/>
+        </w:rPr>
         <w:t>Major Development Challenges</w:t>
       </w:r>
     </w:p>
@@ -3875,8 +5584,14 @@
         <w:tabs>
           <w:tab w:val="left" w:pos="6530"/>
         </w:tabs>
-      </w:pPr>
-      <w:r>
+        <w:rPr>
+          <w:u w:val="single"/>
+        </w:rPr>
+      </w:pPr>
+      <w:r>
+        <w:rPr>
+          <w:u w:val="single"/>
+        </w:rPr>
         <w:t>5.2 Solutions &amp; Key Decisions</w:t>
       </w:r>
     </w:p>
@@ -3962,7 +5677,13 @@
         </w:tabs>
       </w:pPr>
       <w:r>
-        <w:t>The platform was designed using a modular structure across both the frontend and backend. This approach improves maintainability and allows new systems, pages, and features to be added without requiring significant changes to existing functionality.</w:t>
+        <w:t xml:space="preserve">The platform was designed using a modular structure across both the frontend and backend. This approach improves maintainability and allows new systems, pages, and features to be added without </w:t>
+      </w:r>
+      <w:r>
+        <w:t>needing</w:t>
+      </w:r>
+      <w:r>
+        <w:t xml:space="preserve"> significant changes to existing functionality.</w:t>
       </w:r>
     </w:p>
     <w:p>
@@ -4118,69 +5839,498 @@
         <w:tabs>
           <w:tab w:val="left" w:pos="6530"/>
         </w:tabs>
-      </w:pPr>
-      <w:r>
-        <w:t>(left off here *pls reread 5.2*)</w:t>
-      </w:r>
-    </w:p>
-    <w:p>
-      <w:pPr>
-        <w:tabs>
-          <w:tab w:val="left" w:pos="6530"/>
-        </w:tabs>
-      </w:pPr>
-    </w:p>
-    <w:p>
-      <w:pPr>
-        <w:tabs>
-          <w:tab w:val="left" w:pos="6530"/>
-        </w:tabs>
-      </w:pPr>
-    </w:p>
-    <w:p>
-      <w:pPr>
-        <w:tabs>
-          <w:tab w:val="left" w:pos="6530"/>
-        </w:tabs>
-      </w:pPr>
-    </w:p>
-    <w:p>
-      <w:pPr>
-        <w:tabs>
-          <w:tab w:val="left" w:pos="6530"/>
-        </w:tabs>
-      </w:pPr>
-    </w:p>
-    <w:p>
-      <w:pPr>
-        <w:tabs>
-          <w:tab w:val="left" w:pos="6530"/>
-        </w:tabs>
-      </w:pPr>
-    </w:p>
-    <w:p>
-      <w:pPr>
-        <w:tabs>
-          <w:tab w:val="left" w:pos="6530"/>
-        </w:tabs>
-      </w:pPr>
-    </w:p>
-    <w:p>
-      <w:pPr>
-        <w:tabs>
-          <w:tab w:val="left" w:pos="6530"/>
-        </w:tabs>
-      </w:pPr>
-      <w:r>
-        <w:tab/>
-      </w:r>
-    </w:p>
-    <w:p>
-      <w:pPr>
-        <w:tabs>
-          <w:tab w:val="left" w:pos="6530"/>
-        </w:tabs>
-      </w:pPr>
+        <w:rPr>
+          <w:u w:val="single"/>
+        </w:rPr>
+      </w:pPr>
+      <w:r>
+        <w:rPr>
+          <w:u w:val="single"/>
+        </w:rPr>
+        <w:t>5.3 Lessons Learned</w:t>
+      </w:r>
+    </w:p>
+    <w:p>
+      <w:pPr>
+        <w:tabs>
+          <w:tab w:val="left" w:pos="6530"/>
+        </w:tabs>
+      </w:pPr>
+      <w:r>
+        <w:t>The development of Version 2 provided several valuable lessons regarding software development, product design, and long-term</w:t>
+      </w:r>
+      <w:r>
+        <w:t xml:space="preserve"> </w:t>
+      </w:r>
+      <w:r>
+        <w:t>growth.</w:t>
+      </w:r>
+    </w:p>
+    <w:p>
+      <w:pPr>
+        <w:tabs>
+          <w:tab w:val="left" w:pos="6530"/>
+        </w:tabs>
+      </w:pPr>
+    </w:p>
+    <w:p>
+      <w:pPr>
+        <w:tabs>
+          <w:tab w:val="left" w:pos="6530"/>
+        </w:tabs>
+      </w:pPr>
+      <w:r>
+        <w:t xml:space="preserve">- </w:t>
+      </w:r>
+      <w:r>
+        <w:t>Building for Users Rather Than Features</w:t>
+      </w:r>
+    </w:p>
+    <w:p>
+      <w:pPr>
+        <w:tabs>
+          <w:tab w:val="left" w:pos="6530"/>
+        </w:tabs>
+      </w:pPr>
+      <w:r>
+        <w:t xml:space="preserve">One of the most important lessons learned was that adding more features does not </w:t>
+      </w:r>
+      <w:r>
+        <w:t>make a product automatically better</w:t>
+      </w:r>
+      <w:r>
+        <w:t xml:space="preserve">. Features </w:t>
+      </w:r>
+      <w:r>
+        <w:t>become</w:t>
+      </w:r>
+      <w:r>
+        <w:t xml:space="preserve"> most effective when they solve a specific problem or improve the </w:t>
+      </w:r>
+      <w:r>
+        <w:t>user’s</w:t>
+      </w:r>
+      <w:r>
+        <w:t xml:space="preserve"> experience. This </w:t>
+      </w:r>
+      <w:r>
+        <w:t>heavily influenced many developmental changes during Version 2</w:t>
+      </w:r>
+    </w:p>
+    <w:p>
+      <w:pPr>
+        <w:tabs>
+          <w:tab w:val="left" w:pos="6530"/>
+        </w:tabs>
+      </w:pPr>
+    </w:p>
+    <w:p>
+      <w:pPr>
+        <w:tabs>
+          <w:tab w:val="left" w:pos="6530"/>
+        </w:tabs>
+      </w:pPr>
+      <w:r>
+        <w:t xml:space="preserve">- </w:t>
+      </w:r>
+      <w:r>
+        <w:t>The Importance of Iteration</w:t>
+      </w:r>
+    </w:p>
+    <w:p>
+      <w:pPr>
+        <w:tabs>
+          <w:tab w:val="left" w:pos="6530"/>
+        </w:tabs>
+      </w:pPr>
+      <w:r>
+        <w:t xml:space="preserve">Many of the platform's strongest features went through multiple revisions before reaching their final </w:t>
+      </w:r>
+      <w:r>
+        <w:t>implementation</w:t>
+      </w:r>
+      <w:r>
+        <w:t xml:space="preserve"> and</w:t>
+      </w:r>
+      <w:r>
+        <w:t xml:space="preserve"> are being planned for further iterations in future versions</w:t>
+      </w:r>
+      <w:r>
+        <w:t xml:space="preserve">. </w:t>
+      </w:r>
+      <w:r>
+        <w:lastRenderedPageBreak/>
+        <w:t>Continuous testing and refinement proved more valuable than attempting to create a perfect solution on the first attempt.</w:t>
+      </w:r>
+    </w:p>
+    <w:p>
+      <w:pPr>
+        <w:tabs>
+          <w:tab w:val="left" w:pos="6530"/>
+        </w:tabs>
+      </w:pPr>
+    </w:p>
+    <w:p>
+      <w:pPr>
+        <w:tabs>
+          <w:tab w:val="left" w:pos="6530"/>
+        </w:tabs>
+      </w:pPr>
+      <w:r>
+        <w:t xml:space="preserve">- </w:t>
+      </w:r>
+      <w:r>
+        <w:t>Planning for Future Growth</w:t>
+      </w:r>
+    </w:p>
+    <w:p>
+      <w:pPr>
+        <w:tabs>
+          <w:tab w:val="left" w:pos="6530"/>
+        </w:tabs>
+      </w:pPr>
+      <w:r>
+        <w:t xml:space="preserve">Developing Version 2 reinforced the importance of building scalable systems. Architectural decisions made early in development can significantly impact how easily future features can be added and </w:t>
+      </w:r>
+      <w:r>
+        <w:t>polished</w:t>
+      </w:r>
+      <w:r>
+        <w:t>.</w:t>
+      </w:r>
+    </w:p>
+    <w:p>
+      <w:pPr>
+        <w:tabs>
+          <w:tab w:val="left" w:pos="6530"/>
+        </w:tabs>
+      </w:pPr>
+    </w:p>
+    <w:p>
+      <w:pPr>
+        <w:tabs>
+          <w:tab w:val="left" w:pos="6530"/>
+        </w:tabs>
+      </w:pPr>
+      <w:r>
+        <w:t xml:space="preserve">- </w:t>
+      </w:r>
+      <w:r>
+        <w:t>Data-Driven Decision Making</w:t>
+      </w:r>
+    </w:p>
+    <w:p>
+      <w:pPr>
+        <w:tabs>
+          <w:tab w:val="left" w:pos="6530"/>
+        </w:tabs>
+      </w:pPr>
+      <w:r>
+        <w:t>The introduction of analytics highlighted the value of measuring user behavior rather than relying solely on assumptions. Understanding how users interact with the platform provides valuable insight for future content, systems, and platform improvements.</w:t>
+      </w:r>
+    </w:p>
+    <w:p>
+      <w:pPr>
+        <w:tabs>
+          <w:tab w:val="left" w:pos="6530"/>
+        </w:tabs>
+      </w:pPr>
+    </w:p>
+    <w:p>
+      <w:pPr>
+        <w:tabs>
+          <w:tab w:val="left" w:pos="6530"/>
+        </w:tabs>
+      </w:pPr>
+      <w:r>
+        <w:t xml:space="preserve">- </w:t>
+      </w:r>
+      <w:r>
+        <w:t>Balancing Content and Development</w:t>
+      </w:r>
+    </w:p>
+    <w:p>
+      <w:pPr>
+        <w:tabs>
+          <w:tab w:val="left" w:pos="6530"/>
+        </w:tabs>
+      </w:pPr>
+      <w:r>
+        <w:t xml:space="preserve">As both a content creator and developer, balancing software development with content production </w:t>
+      </w:r>
+      <w:r>
+        <w:t xml:space="preserve">creates </w:t>
+      </w:r>
+      <w:r>
+        <w:t>a unique challenge. This experience emphasized the importance of prioritization, time management, and focusing on high-impact improvements.</w:t>
+      </w:r>
+    </w:p>
+    <w:p>
+      <w:pPr>
+        <w:tabs>
+          <w:tab w:val="left" w:pos="6530"/>
+        </w:tabs>
+      </w:pPr>
+    </w:p>
+    <w:p>
+      <w:pPr>
+        <w:tabs>
+          <w:tab w:val="left" w:pos="6530"/>
+        </w:tabs>
+        <w:rPr>
+          <w:b/>
+          <w:bCs/>
+          <w:sz w:val="40"/>
+          <w:szCs w:val="40"/>
+        </w:rPr>
+      </w:pPr>
+      <w:r>
+        <w:rPr>
+          <w:b/>
+          <w:bCs/>
+          <w:sz w:val="40"/>
+          <w:szCs w:val="40"/>
+        </w:rPr>
+        <w:t>V</w:t>
+      </w:r>
+      <w:r>
+        <w:rPr>
+          <w:b/>
+          <w:bCs/>
+          <w:sz w:val="40"/>
+          <w:szCs w:val="40"/>
+        </w:rPr>
+        <w:t>I</w:t>
+      </w:r>
+      <w:r>
+        <w:rPr>
+          <w:b/>
+          <w:bCs/>
+          <w:sz w:val="40"/>
+          <w:szCs w:val="40"/>
+        </w:rPr>
+        <w:t xml:space="preserve">. </w:t>
+      </w:r>
+      <w:r>
+        <w:rPr>
+          <w:b/>
+          <w:bCs/>
+          <w:sz w:val="40"/>
+          <w:szCs w:val="40"/>
+        </w:rPr>
+        <w:t>Conclusion</w:t>
+      </w:r>
+    </w:p>
+    <w:p>
+      <w:pPr>
+        <w:tabs>
+          <w:tab w:val="left" w:pos="6530"/>
+        </w:tabs>
+      </w:pPr>
+    </w:p>
+    <w:p>
+      <w:pPr>
+        <w:tabs>
+          <w:tab w:val="left" w:pos="6530"/>
+        </w:tabs>
+        <w:rPr>
+          <w:u w:val="single"/>
+        </w:rPr>
+      </w:pPr>
+      <w:r>
+        <w:rPr>
+          <w:u w:val="single"/>
+        </w:rPr>
+        <w:t>6.1 Project Summary</w:t>
+      </w:r>
+    </w:p>
+    <w:p>
+      <w:pPr>
+        <w:tabs>
+          <w:tab w:val="left" w:pos="6530"/>
+        </w:tabs>
+      </w:pPr>
+      <w:r>
+        <w:t>The Improving JB platform was developed as a centralized ecosystem designed to connect educational content, self-improvement systems, audience engagement, and future community features. Version 2 introduced several major improvements including an AI-powered website assistant, analytics tracking, newsletter integration, expanded system delivery, and improvements to the overall user experience.</w:t>
+      </w:r>
+    </w:p>
+    <w:p>
+      <w:pPr>
+        <w:tabs>
+          <w:tab w:val="left" w:pos="6530"/>
+        </w:tabs>
+      </w:pPr>
+      <w:r>
+        <w:t>The platform</w:t>
+      </w:r>
+      <w:r>
+        <w:t xml:space="preserve"> represents</w:t>
+      </w:r>
+      <w:r>
+        <w:t xml:space="preserve"> the application of modern web development technologies including React, Node.js, Express.js, API integrations, analytics infrastructure, and AI-</w:t>
+      </w:r>
+      <w:r>
+        <w:lastRenderedPageBreak/>
+        <w:t>powered functionality. Through the development of Version 2, significant emphasis was placed on scalability, maintainability, and long-term platform growth.</w:t>
+      </w:r>
+    </w:p>
+    <w:p>
+      <w:pPr>
+        <w:tabs>
+          <w:tab w:val="left" w:pos="6530"/>
+        </w:tabs>
+      </w:pPr>
+      <w:r>
+        <w:t>The resulting product serves as both a functional platform for users and a demonstration of full-stack development, product design, and system architecture principles.</w:t>
+      </w:r>
+    </w:p>
+    <w:p>
+      <w:pPr>
+        <w:tabs>
+          <w:tab w:val="left" w:pos="6530"/>
+        </w:tabs>
+      </w:pPr>
+    </w:p>
+    <w:p>
+      <w:pPr>
+        <w:tabs>
+          <w:tab w:val="left" w:pos="6530"/>
+        </w:tabs>
+        <w:rPr>
+          <w:u w:val="single"/>
+        </w:rPr>
+      </w:pPr>
+      <w:r>
+        <w:rPr>
+          <w:u w:val="single"/>
+        </w:rPr>
+        <w:t>6.2 Future Outlook</w:t>
+      </w:r>
+    </w:p>
+    <w:p>
+      <w:pPr>
+        <w:tabs>
+          <w:tab w:val="left" w:pos="6530"/>
+        </w:tabs>
+      </w:pPr>
+      <w:r>
+        <w:t xml:space="preserve">Future development will focus on expanding the platform beyond its current role as a content hub and system distribution platform. Planned enhancements include community functionality, additional self-improvement systems, improvements to the 10 Week Build program, expanded analytics capabilities, and continued </w:t>
+      </w:r>
+      <w:r>
+        <w:t>improved tab navigation</w:t>
+      </w:r>
+      <w:r>
+        <w:t>.</w:t>
+      </w:r>
+    </w:p>
+    <w:p>
+      <w:pPr>
+        <w:tabs>
+          <w:tab w:val="left" w:pos="6530"/>
+        </w:tabs>
+      </w:pPr>
+      <w:r>
+        <w:t>The long-term vision for Improving JB is to create an ecosystem that connects educational content, practical systems, community engagement, and personal development resources within a single platform. Future versions will continue to be guided by user feedback, platform performance data, and the overall goal of providing accessible tools for self-improvement.</w:t>
+      </w:r>
+    </w:p>
+    <w:p>
+      <w:pPr>
+        <w:tabs>
+          <w:tab w:val="left" w:pos="6530"/>
+        </w:tabs>
+      </w:pPr>
+      <w:r>
+        <w:t xml:space="preserve">While Version 2 establishes the foundation of the platform, future iterations will focus </w:t>
+      </w:r>
+      <w:r>
+        <w:t xml:space="preserve">more </w:t>
+      </w:r>
+      <w:r>
+        <w:t>on increasing user engagement, expanding available resources, and creating a more connected experience throughout the</w:t>
+      </w:r>
+      <w:r>
+        <w:t xml:space="preserve"> Improving JB</w:t>
+      </w:r>
+      <w:r>
+        <w:t xml:space="preserve"> ecosystem.</w:t>
+      </w:r>
+    </w:p>
+    <w:p>
+      <w:pPr>
+        <w:tabs>
+          <w:tab w:val="left" w:pos="6530"/>
+        </w:tabs>
+      </w:pPr>
+    </w:p>
+    <w:p>
+      <w:pPr>
+        <w:tabs>
+          <w:tab w:val="left" w:pos="6530"/>
+        </w:tabs>
+      </w:pPr>
+    </w:p>
+    <w:p>
+      <w:pPr>
+        <w:tabs>
+          <w:tab w:val="left" w:pos="6530"/>
+        </w:tabs>
+        <w:rPr>
+          <w:sz w:val="40"/>
+          <w:szCs w:val="40"/>
+        </w:rPr>
+      </w:pPr>
+    </w:p>
+    <w:p>
+      <w:pPr>
+        <w:tabs>
+          <w:tab w:val="left" w:pos="6530"/>
+        </w:tabs>
+      </w:pPr>
+    </w:p>
+    <w:p>
+      <w:pPr>
+        <w:tabs>
+          <w:tab w:val="left" w:pos="6530"/>
+        </w:tabs>
+      </w:pPr>
+    </w:p>
+    <w:p>
+      <w:pPr>
+        <w:tabs>
+          <w:tab w:val="left" w:pos="6530"/>
+        </w:tabs>
+      </w:pPr>
+    </w:p>
+    <w:p>
+      <w:pPr>
+        <w:tabs>
+          <w:tab w:val="left" w:pos="6530"/>
+        </w:tabs>
+      </w:pPr>
+    </w:p>
+    <w:p>
+      <w:pPr>
+        <w:tabs>
+          <w:tab w:val="left" w:pos="6530"/>
+        </w:tabs>
+      </w:pPr>
+    </w:p>
+    <w:p>
+      <w:pPr>
+        <w:tabs>
+          <w:tab w:val="left" w:pos="6530"/>
+        </w:tabs>
+      </w:pPr>
+    </w:p>
+    <w:p>
+      <w:pPr>
+        <w:tabs>
+          <w:tab w:val="left" w:pos="6530"/>
+        </w:tabs>
+      </w:pPr>
+      <w:r>
+        <w:tab/>
+      </w:r>
     </w:p>
     <w:sectPr>
       <w:headerReference w:type="default" r:id="rId13"/>
@@ -5150,6 +7300,95 @@
     </w:lvl>
   </w:abstractNum>
   <w:abstractNum w:abstractNumId="6" w15:restartNumberingAfterBreak="0">
+    <w:nsid w:val="35012C5F"/>
+    <w:multiLevelType w:val="hybridMultilevel"/>
+    <w:tmpl w:val="7D6C3332"/>
+    <w:lvl w:ilvl="0" w:tplc="21448212">
+      <w:start w:val="1"/>
+      <w:numFmt w:val="upperRoman"/>
+      <w:lvlText w:val="%1."/>
+      <w:lvlJc w:val="left"/>
+      <w:pPr>
+        <w:ind w:left="1080" w:hanging="720"/>
+      </w:pPr>
+      <w:rPr>
+        <w:rFonts w:hint="default"/>
+      </w:rPr>
+    </w:lvl>
+    <w:lvl w:ilvl="1" w:tplc="04090019" w:tentative="1">
+      <w:start w:val="1"/>
+      <w:numFmt w:val="lowerLetter"/>
+      <w:lvlText w:val="%2."/>
+      <w:lvlJc w:val="left"/>
+      <w:pPr>
+        <w:ind w:left="1440" w:hanging="360"/>
+      </w:pPr>
+    </w:lvl>
+    <w:lvl w:ilvl="2" w:tplc="0409001B" w:tentative="1">
+      <w:start w:val="1"/>
+      <w:numFmt w:val="lowerRoman"/>
+      <w:lvlText w:val="%3."/>
+      <w:lvlJc w:val="right"/>
+      <w:pPr>
+        <w:ind w:left="2160" w:hanging="180"/>
+      </w:pPr>
+    </w:lvl>
+    <w:lvl w:ilvl="3" w:tplc="0409000F" w:tentative="1">
+      <w:start w:val="1"/>
+      <w:numFmt w:val="decimal"/>
+      <w:lvlText w:val="%4."/>
+      <w:lvlJc w:val="left"/>
+      <w:pPr>
+        <w:ind w:left="2880" w:hanging="360"/>
+      </w:pPr>
+    </w:lvl>
+    <w:lvl w:ilvl="4" w:tplc="04090019" w:tentative="1">
+      <w:start w:val="1"/>
+      <w:numFmt w:val="lowerLetter"/>
+      <w:lvlText w:val="%5."/>
+      <w:lvlJc w:val="left"/>
+      <w:pPr>
+        <w:ind w:left="3600" w:hanging="360"/>
+      </w:pPr>
+    </w:lvl>
+    <w:lvl w:ilvl="5" w:tplc="0409001B" w:tentative="1">
+      <w:start w:val="1"/>
+      <w:numFmt w:val="lowerRoman"/>
+      <w:lvlText w:val="%6."/>
+      <w:lvlJc w:val="right"/>
+      <w:pPr>
+        <w:ind w:left="4320" w:hanging="180"/>
+      </w:pPr>
+    </w:lvl>
+    <w:lvl w:ilvl="6" w:tplc="0409000F" w:tentative="1">
+      <w:start w:val="1"/>
+      <w:numFmt w:val="decimal"/>
+      <w:lvlText w:val="%7."/>
+      <w:lvlJc w:val="left"/>
+      <w:pPr>
+        <w:ind w:left="5040" w:hanging="360"/>
+      </w:pPr>
+    </w:lvl>
+    <w:lvl w:ilvl="7" w:tplc="04090019" w:tentative="1">
+      <w:start w:val="1"/>
+      <w:numFmt w:val="lowerLetter"/>
+      <w:lvlText w:val="%8."/>
+      <w:lvlJc w:val="left"/>
+      <w:pPr>
+        <w:ind w:left="5760" w:hanging="360"/>
+      </w:pPr>
+    </w:lvl>
+    <w:lvl w:ilvl="8" w:tplc="0409001B" w:tentative="1">
+      <w:start w:val="1"/>
+      <w:numFmt w:val="lowerRoman"/>
+      <w:lvlText w:val="%9."/>
+      <w:lvlJc w:val="right"/>
+      <w:pPr>
+        <w:ind w:left="6480" w:hanging="180"/>
+      </w:pPr>
+    </w:lvl>
+  </w:abstractNum>
+  <w:abstractNum w:abstractNumId="7" w15:restartNumberingAfterBreak="0">
     <w:nsid w:val="40232F43"/>
     <w:multiLevelType w:val="hybridMultilevel"/>
     <w:tmpl w:val="5E623CDC"/>
@@ -5238,7 +7477,7 @@
       </w:pPr>
     </w:lvl>
   </w:abstractNum>
-  <w:abstractNum w:abstractNumId="7" w15:restartNumberingAfterBreak="0">
+  <w:abstractNum w:abstractNumId="8" w15:restartNumberingAfterBreak="0">
     <w:nsid w:val="46D9437B"/>
     <w:multiLevelType w:val="hybridMultilevel"/>
     <w:tmpl w:val="09288DAA"/>
@@ -5327,7 +7566,7 @@
       </w:pPr>
     </w:lvl>
   </w:abstractNum>
-  <w:abstractNum w:abstractNumId="8" w15:restartNumberingAfterBreak="0">
+  <w:abstractNum w:abstractNumId="9" w15:restartNumberingAfterBreak="0">
     <w:nsid w:val="47890F39"/>
     <w:multiLevelType w:val="multilevel"/>
     <w:tmpl w:val="73B0C78A"/>
@@ -5476,7 +7715,7 @@
       </w:rPr>
     </w:lvl>
   </w:abstractNum>
-  <w:abstractNum w:abstractNumId="9" w15:restartNumberingAfterBreak="0">
+  <w:abstractNum w:abstractNumId="10" w15:restartNumberingAfterBreak="0">
     <w:nsid w:val="51DA5C20"/>
     <w:multiLevelType w:val="multilevel"/>
     <w:tmpl w:val="E9F02D90"/>
@@ -5589,7 +7828,7 @@
       </w:rPr>
     </w:lvl>
   </w:abstractNum>
-  <w:abstractNum w:abstractNumId="10" w15:restartNumberingAfterBreak="0">
+  <w:abstractNum w:abstractNumId="11" w15:restartNumberingAfterBreak="0">
     <w:nsid w:val="53B515E1"/>
     <w:multiLevelType w:val="multilevel"/>
     <w:tmpl w:val="2EF49A8E"/>
@@ -5738,7 +7977,7 @@
       </w:rPr>
     </w:lvl>
   </w:abstractNum>
-  <w:abstractNum w:abstractNumId="11" w15:restartNumberingAfterBreak="0">
+  <w:abstractNum w:abstractNumId="12" w15:restartNumberingAfterBreak="0">
     <w:nsid w:val="56136885"/>
     <w:multiLevelType w:val="multilevel"/>
     <w:tmpl w:val="1ACC4C1E"/>
@@ -5887,7 +8126,7 @@
       </w:rPr>
     </w:lvl>
   </w:abstractNum>
-  <w:abstractNum w:abstractNumId="12" w15:restartNumberingAfterBreak="0">
+  <w:abstractNum w:abstractNumId="13" w15:restartNumberingAfterBreak="0">
     <w:nsid w:val="56B65D32"/>
     <w:multiLevelType w:val="multilevel"/>
     <w:tmpl w:val="48BCC84C"/>
@@ -6036,7 +8275,7 @@
       </w:rPr>
     </w:lvl>
   </w:abstractNum>
-  <w:abstractNum w:abstractNumId="13" w15:restartNumberingAfterBreak="0">
+  <w:abstractNum w:abstractNumId="14" w15:restartNumberingAfterBreak="0">
     <w:nsid w:val="60B36B2E"/>
     <w:multiLevelType w:val="hybridMultilevel"/>
     <w:tmpl w:val="8E5E3328"/>
@@ -6125,7 +8364,7 @@
       </w:pPr>
     </w:lvl>
   </w:abstractNum>
-  <w:abstractNum w:abstractNumId="14" w15:restartNumberingAfterBreak="0">
+  <w:abstractNum w:abstractNumId="15" w15:restartNumberingAfterBreak="0">
     <w:nsid w:val="63CD7D00"/>
     <w:multiLevelType w:val="multilevel"/>
     <w:tmpl w:val="5C8E2ED8"/>
@@ -6274,7 +8513,7 @@
       </w:rPr>
     </w:lvl>
   </w:abstractNum>
-  <w:abstractNum w:abstractNumId="15" w15:restartNumberingAfterBreak="0">
+  <w:abstractNum w:abstractNumId="16" w15:restartNumberingAfterBreak="0">
     <w:nsid w:val="6AF74D27"/>
     <w:multiLevelType w:val="multilevel"/>
     <w:tmpl w:val="48125EF8"/>
@@ -6423,7 +8662,7 @@
       </w:rPr>
     </w:lvl>
   </w:abstractNum>
-  <w:abstractNum w:abstractNumId="16" w15:restartNumberingAfterBreak="0">
+  <w:abstractNum w:abstractNumId="17" w15:restartNumberingAfterBreak="0">
     <w:nsid w:val="6B77074E"/>
     <w:multiLevelType w:val="hybridMultilevel"/>
     <w:tmpl w:val="7A5C9772"/>
@@ -6512,7 +8751,7 @@
       </w:pPr>
     </w:lvl>
   </w:abstractNum>
-  <w:abstractNum w:abstractNumId="17" w15:restartNumberingAfterBreak="0">
+  <w:abstractNum w:abstractNumId="18" w15:restartNumberingAfterBreak="0">
     <w:nsid w:val="6FF72081"/>
     <w:multiLevelType w:val="multilevel"/>
     <w:tmpl w:val="5026297A"/>
@@ -6661,7 +8900,7 @@
       </w:rPr>
     </w:lvl>
   </w:abstractNum>
-  <w:abstractNum w:abstractNumId="18" w15:restartNumberingAfterBreak="0">
+  <w:abstractNum w:abstractNumId="19" w15:restartNumberingAfterBreak="0">
     <w:nsid w:val="7AA843DD"/>
     <w:multiLevelType w:val="hybridMultilevel"/>
     <w:tmpl w:val="5C12A5DA"/>
@@ -6751,28 +8990,28 @@
     </w:lvl>
   </w:abstractNum>
   <w:num w:numId="1" w16cid:durableId="664934734">
-    <w:abstractNumId w:val="9"/>
+    <w:abstractNumId w:val="10"/>
   </w:num>
   <w:num w:numId="2" w16cid:durableId="706758807">
+    <w:abstractNumId w:val="8"/>
+  </w:num>
+  <w:num w:numId="3" w16cid:durableId="1807972047">
+    <w:abstractNumId w:val="17"/>
+  </w:num>
+  <w:num w:numId="4" w16cid:durableId="1406730771">
     <w:abstractNumId w:val="7"/>
   </w:num>
-  <w:num w:numId="3" w16cid:durableId="1807972047">
-    <w:abstractNumId w:val="16"/>
-  </w:num>
-  <w:num w:numId="4" w16cid:durableId="1406730771">
-    <w:abstractNumId w:val="6"/>
-  </w:num>
   <w:num w:numId="5" w16cid:durableId="63725701">
-    <w:abstractNumId w:val="18"/>
+    <w:abstractNumId w:val="19"/>
   </w:num>
   <w:num w:numId="6" w16cid:durableId="1108500060">
-    <w:abstractNumId w:val="13"/>
+    <w:abstractNumId w:val="14"/>
   </w:num>
   <w:num w:numId="7" w16cid:durableId="1934432317">
     <w:abstractNumId w:val="0"/>
   </w:num>
   <w:num w:numId="8" w16cid:durableId="1380590915">
-    <w:abstractNumId w:val="14"/>
+    <w:abstractNumId w:val="15"/>
   </w:num>
   <w:num w:numId="9" w16cid:durableId="208955879">
     <w:abstractNumId w:val="5"/>
@@ -6781,31 +9020,34 @@
     <w:abstractNumId w:val="3"/>
   </w:num>
   <w:num w:numId="11" w16cid:durableId="994146575">
-    <w:abstractNumId w:val="11"/>
+    <w:abstractNumId w:val="12"/>
   </w:num>
   <w:num w:numId="12" w16cid:durableId="1835952565">
-    <w:abstractNumId w:val="15"/>
+    <w:abstractNumId w:val="16"/>
   </w:num>
   <w:num w:numId="13" w16cid:durableId="610599663">
     <w:abstractNumId w:val="1"/>
   </w:num>
   <w:num w:numId="14" w16cid:durableId="982931535">
-    <w:abstractNumId w:val="8"/>
+    <w:abstractNumId w:val="9"/>
   </w:num>
   <w:num w:numId="15" w16cid:durableId="15279351">
     <w:abstractNumId w:val="2"/>
   </w:num>
   <w:num w:numId="16" w16cid:durableId="1429425789">
-    <w:abstractNumId w:val="12"/>
+    <w:abstractNumId w:val="13"/>
   </w:num>
   <w:num w:numId="17" w16cid:durableId="1134297695">
-    <w:abstractNumId w:val="17"/>
+    <w:abstractNumId w:val="18"/>
   </w:num>
   <w:num w:numId="18" w16cid:durableId="1579747112">
-    <w:abstractNumId w:val="10"/>
+    <w:abstractNumId w:val="11"/>
   </w:num>
   <w:num w:numId="19" w16cid:durableId="1986857419">
     <w:abstractNumId w:val="4"/>
+  </w:num>
+  <w:num w:numId="20" w16cid:durableId="941491440">
+    <w:abstractNumId w:val="6"/>
   </w:num>
 </w:numbering>
 </file>
@@ -7210,6 +9452,7 @@
   <w:style w:type="paragraph" w:default="1" w:styleId="Normal">
     <w:name w:val="Normal"/>
     <w:qFormat/>
+    <w:rsid w:val="00462BA5"/>
   </w:style>
   <w:style w:type="paragraph" w:styleId="Heading1">
     <w:name w:val="heading 1"/>
@@ -7783,7 +10026,6 @@
     <w:name w:val="Normal (Web)"/>
     <w:basedOn w:val="Normal"/>
     <w:uiPriority w:val="99"/>
-    <w:semiHidden/>
     <w:unhideWhenUsed/>
     <w:rsid w:val="0043487B"/>
     <w:pPr>

</xml_diff>